<commit_message>
Rapor iskeleti guncellendi: tam akademik metin, PÇ etiketleri, Ek B geri eklendi
</commit_message>
<xml_diff>
--- a/Rapor_Iskelet.docx
+++ b/Rapor_Iskelet.docx
@@ -23,9 +23,10 @@
         <w:rPr>
           <w:rFonts w:ascii="Courier New" w:hAnsi="Courier New"/>
           <w:b/>
+          <w:i w:val="0"/>
           <w:sz w:val="22"/>
         </w:rPr>
-        <w:t>SAKARYA UYGULAMALI BİLİMLER ÜNİVERSİTESİ</w:t>
+        <w:t>SAKARYA UYGULAMALI BILIMLER UNIVERSITESI</w:t>
       </w:r>
     </w:p>
     <w:p>
@@ -37,9 +38,10 @@
         <w:rPr>
           <w:rFonts w:ascii="Courier New" w:hAnsi="Courier New"/>
           <w:b w:val="0"/>
+          <w:i w:val="0"/>
           <w:sz w:val="20"/>
         </w:rPr>
-        <w:t>Bilgisayar Mühendisliği Bölümü</w:t>
+        <w:t>Bilgisayar Muhendisligi Bolumu</w:t>
       </w:r>
     </w:p>
     <w:p>
@@ -63,9 +65,10 @@
         <w:rPr>
           <w:rFonts w:ascii="Courier New" w:hAnsi="Courier New"/>
           <w:b/>
+          <w:i w:val="0"/>
           <w:sz w:val="20"/>
         </w:rPr>
-        <w:t>BİLGİSAYAR MİMARİSİ VE ORGANİZASYONU</w:t>
+        <w:t>BILGISAYAR MIMARISI VE ORGANIZASYONU</w:t>
       </w:r>
     </w:p>
     <w:p>
@@ -77,9 +80,10 @@
         <w:rPr>
           <w:rFonts w:ascii="Courier New" w:hAnsi="Courier New"/>
           <w:b w:val="0"/>
+          <w:i w:val="0"/>
           <w:sz w:val="20"/>
         </w:rPr>
-        <w:t>Performans Görevi — Uygulama</w:t>
+        <w:t>Performans Gorevi - Uygulama</w:t>
       </w:r>
     </w:p>
     <w:p>
@@ -103,9 +107,10 @@
         <w:rPr>
           <w:rFonts w:ascii="Courier New" w:hAnsi="Courier New"/>
           <w:b/>
+          <w:i w:val="0"/>
           <w:sz w:val="26"/>
         </w:rPr>
-        <w:t>MİKROPROGRAMLANMIŞ KONTROL DEVRESİ TASARIMI</w:t>
+        <w:t>MIKROPROGRAMLANMIS KONTROL DEVRESI TASARIMI</w:t>
       </w:r>
     </w:p>
     <w:p>
@@ -117,9 +122,10 @@
         <w:rPr>
           <w:rFonts w:ascii="Courier New" w:hAnsi="Courier New"/>
           <w:b w:val="0"/>
+          <w:i w:val="0"/>
           <w:sz w:val="20"/>
         </w:rPr>
-        <w:t>Mano Temel Bilgisayarının Mikroprogramlanmış Mimariye Dönüştürülmesi</w:t>
+        <w:t>Mano Temel Bilgisayarinin Mikroprogramlanmis Mimariye Donusturulmesi</w:t>
       </w:r>
     </w:p>
     <w:p>
@@ -155,6 +161,7 @@
               <w:rPr>
                 <w:rFonts w:ascii="Courier New" w:hAnsi="Courier New"/>
                 <w:b/>
+                <w:i w:val="0"/>
                 <w:sz w:val="20"/>
               </w:rPr>
               <w:t>Grup No</w:t>
@@ -170,6 +177,7 @@
               <w:rPr>
                 <w:rFonts w:ascii="Courier New" w:hAnsi="Courier New"/>
                 <w:b w:val="0"/>
+                <w:i w:val="0"/>
                 <w:sz w:val="20"/>
               </w:rPr>
               <w:t>Grup _</w:t>
@@ -187,9 +195,10 @@
               <w:rPr>
                 <w:rFonts w:ascii="Courier New" w:hAnsi="Courier New"/>
                 <w:b/>
+                <w:i w:val="0"/>
                 <w:sz w:val="20"/>
               </w:rPr>
-              <w:t>Üye 1</w:t>
+              <w:t>Uye 1</w:t>
             </w:r>
           </w:p>
         </w:tc>
@@ -202,9 +211,10 @@
               <w:rPr>
                 <w:rFonts w:ascii="Courier New" w:hAnsi="Courier New"/>
                 <w:b w:val="0"/>
+                <w:i w:val="0"/>
                 <w:sz w:val="20"/>
               </w:rPr>
-              <w:t>[İsim Soyisim — Öğrenci No]</w:t>
+              <w:t>[Isim Soyisim - Ogrenci No]</w:t>
             </w:r>
           </w:p>
         </w:tc>
@@ -219,9 +229,10 @@
               <w:rPr>
                 <w:rFonts w:ascii="Courier New" w:hAnsi="Courier New"/>
                 <w:b/>
+                <w:i w:val="0"/>
                 <w:sz w:val="20"/>
               </w:rPr>
-              <w:t>Üye 2</w:t>
+              <w:t>Uye 2</w:t>
             </w:r>
           </w:p>
         </w:tc>
@@ -234,9 +245,10 @@
               <w:rPr>
                 <w:rFonts w:ascii="Courier New" w:hAnsi="Courier New"/>
                 <w:b w:val="0"/>
+                <w:i w:val="0"/>
                 <w:sz w:val="20"/>
               </w:rPr>
-              <w:t>[İsim Soyisim — Öğrenci No]</w:t>
+              <w:t>[Isim Soyisim - Ogrenci No]</w:t>
             </w:r>
           </w:p>
         </w:tc>
@@ -251,9 +263,10 @@
               <w:rPr>
                 <w:rFonts w:ascii="Courier New" w:hAnsi="Courier New"/>
                 <w:b/>
+                <w:i w:val="0"/>
                 <w:sz w:val="20"/>
               </w:rPr>
-              <w:t>Üye 3</w:t>
+              <w:t>Uye 3</w:t>
             </w:r>
           </w:p>
         </w:tc>
@@ -266,9 +279,10 @@
               <w:rPr>
                 <w:rFonts w:ascii="Courier New" w:hAnsi="Courier New"/>
                 <w:b w:val="0"/>
+                <w:i w:val="0"/>
                 <w:sz w:val="20"/>
               </w:rPr>
-              <w:t>[İsim Soyisim — Öğrenci No]</w:t>
+              <w:t>[Isim Soyisim - Ogrenci No]</w:t>
             </w:r>
           </w:p>
         </w:tc>
@@ -283,9 +297,10 @@
               <w:rPr>
                 <w:rFonts w:ascii="Courier New" w:hAnsi="Courier New"/>
                 <w:b/>
+                <w:i w:val="0"/>
                 <w:sz w:val="20"/>
               </w:rPr>
-              <w:t>Üye 4</w:t>
+              <w:t>Uye 4</w:t>
             </w:r>
           </w:p>
         </w:tc>
@@ -298,9 +313,10 @@
               <w:rPr>
                 <w:rFonts w:ascii="Courier New" w:hAnsi="Courier New"/>
                 <w:b w:val="0"/>
+                <w:i w:val="0"/>
                 <w:sz w:val="20"/>
               </w:rPr>
-              <w:t>[İsim Soyisim — Öğrenci No]</w:t>
+              <w:t>[Isim Soyisim - Ogrenci No]</w:t>
             </w:r>
           </w:p>
         </w:tc>
@@ -315,6 +331,7 @@
               <w:rPr>
                 <w:rFonts w:ascii="Courier New" w:hAnsi="Courier New"/>
                 <w:b/>
+                <w:i w:val="0"/>
                 <w:sz w:val="20"/>
               </w:rPr>
               <w:t>Teslim Tarihi</w:t>
@@ -330,6 +347,7 @@
               <w:rPr>
                 <w:rFonts w:ascii="Courier New" w:hAnsi="Courier New"/>
                 <w:b w:val="0"/>
+                <w:i w:val="0"/>
                 <w:sz w:val="20"/>
               </w:rPr>
               <w:t>17.05.2026</w:t>
@@ -352,9 +370,10 @@
         <w:rPr>
           <w:rFonts w:ascii="Courier New" w:hAnsi="Courier New"/>
           <w:b/>
+          <w:i w:val="0"/>
           <w:sz w:val="24"/>
         </w:rPr>
-        <w:t>İÇİNDEKİLER</w:t>
+        <w:t>ICINDEKILER</w:t>
       </w:r>
     </w:p>
     <w:p>
@@ -364,9 +383,11 @@
       <w:r>
         <w:rPr>
           <w:rFonts w:ascii="Courier New" w:hAnsi="Courier New"/>
+          <w:b w:val="0"/>
+          <w:i w:val="0"/>
           <w:sz w:val="20"/>
         </w:rPr>
-        <w:t>1. Özet</w:t>
+        <w:t>1. Ozet</w:t>
       </w:r>
     </w:p>
     <w:p>
@@ -376,9 +397,11 @@
       <w:r>
         <w:rPr>
           <w:rFonts w:ascii="Courier New" w:hAnsi="Courier New"/>
+          <w:b w:val="0"/>
+          <w:i w:val="0"/>
           <w:sz w:val="20"/>
         </w:rPr>
-        <w:t>2. Giriş</w:t>
+        <w:t>2. Giris</w:t>
       </w:r>
     </w:p>
     <w:p>
@@ -388,6 +411,8 @@
       <w:r>
         <w:rPr>
           <w:rFonts w:ascii="Courier New" w:hAnsi="Courier New"/>
+          <w:b w:val="0"/>
+          <w:i w:val="0"/>
           <w:sz w:val="20"/>
         </w:rPr>
         <w:t>3. Teorik Arka Plan</w:t>
@@ -400,9 +425,11 @@
       <w:r>
         <w:rPr>
           <w:rFonts w:ascii="Courier New" w:hAnsi="Courier New"/>
+          <w:b w:val="0"/>
+          <w:i w:val="0"/>
           <w:sz w:val="20"/>
         </w:rPr>
-        <w:t xml:space="preserve">   3.1. Mano Temel Bilgisayarı</w:t>
+        <w:t xml:space="preserve">   3.1. Mano Temel Bilgisayari</w:t>
       </w:r>
     </w:p>
     <w:p>
@@ -412,6 +439,8 @@
       <w:r>
         <w:rPr>
           <w:rFonts w:ascii="Courier New" w:hAnsi="Courier New"/>
+          <w:b w:val="0"/>
+          <w:i w:val="0"/>
           <w:sz w:val="20"/>
         </w:rPr>
         <w:t xml:space="preserve">   3.2. Hardwired Kontrol Devresi</w:t>
@@ -424,9 +453,11 @@
       <w:r>
         <w:rPr>
           <w:rFonts w:ascii="Courier New" w:hAnsi="Courier New"/>
+          <w:b w:val="0"/>
+          <w:i w:val="0"/>
           <w:sz w:val="20"/>
         </w:rPr>
-        <w:t xml:space="preserve">   3.3. Mikroprogramlanmış Kontrol Mimarisi</w:t>
+        <w:t xml:space="preserve">   3.3. Mikroprogramlanmis Kontrol Mimarisi</w:t>
       </w:r>
     </w:p>
     <w:p>
@@ -436,9 +467,11 @@
       <w:r>
         <w:rPr>
           <w:rFonts w:ascii="Courier New" w:hAnsi="Courier New"/>
+          <w:b w:val="0"/>
+          <w:i w:val="0"/>
           <w:sz w:val="20"/>
         </w:rPr>
-        <w:t>4. Tasarım</w:t>
+        <w:t>4. Tasarim</w:t>
       </w:r>
     </w:p>
     <w:p>
@@ -448,9 +481,11 @@
       <w:r>
         <w:rPr>
           <w:rFonts w:ascii="Courier New" w:hAnsi="Courier New"/>
+          <w:b w:val="0"/>
+          <w:i w:val="0"/>
           <w:sz w:val="20"/>
         </w:rPr>
-        <w:t xml:space="preserve">   4.1. Veri Yolu Tasarımı</w:t>
+        <w:t xml:space="preserve">   4.1. Veri Yolu Tasarimi</w:t>
       </w:r>
     </w:p>
     <w:p>
@@ -460,9 +495,11 @@
       <w:r>
         <w:rPr>
           <w:rFonts w:ascii="Courier New" w:hAnsi="Courier New"/>
+          <w:b w:val="0"/>
+          <w:i w:val="0"/>
           <w:sz w:val="20"/>
         </w:rPr>
-        <w:t xml:space="preserve">   4.2. Mikrokomut Formatı</w:t>
+        <w:t xml:space="preserve">   4.2. Mikrokomut Formati</w:t>
       </w:r>
     </w:p>
     <w:p>
@@ -472,9 +509,11 @@
       <w:r>
         <w:rPr>
           <w:rFonts w:ascii="Courier New" w:hAnsi="Courier New"/>
+          <w:b w:val="0"/>
+          <w:i w:val="0"/>
           <w:sz w:val="20"/>
         </w:rPr>
-        <w:t xml:space="preserve">   4.3. Kontrol Belleği ve Mikroprogram</w:t>
+        <w:t xml:space="preserve">   4.3. Kontrol Bellegi ve Mikroprogram</w:t>
       </w:r>
     </w:p>
     <w:p>
@@ -484,9 +523,11 @@
       <w:r>
         <w:rPr>
           <w:rFonts w:ascii="Courier New" w:hAnsi="Courier New"/>
+          <w:b w:val="0"/>
+          <w:i w:val="0"/>
           <w:sz w:val="20"/>
         </w:rPr>
-        <w:t xml:space="preserve">   4.4. Performans Kriterleri ve Sınırlamalar</w:t>
+        <w:t xml:space="preserve">   4.4. Performans Kriterleri ve Sinirlamalar</w:t>
       </w:r>
     </w:p>
     <w:p>
@@ -496,9 +537,11 @@
       <w:r>
         <w:rPr>
           <w:rFonts w:ascii="Courier New" w:hAnsi="Courier New"/>
+          <w:b w:val="0"/>
+          <w:i w:val="0"/>
           <w:sz w:val="20"/>
         </w:rPr>
-        <w:t>5. Uygulama ve Simülasyon</w:t>
+        <w:t>5. Uygulama ve Simulasyon</w:t>
       </w:r>
     </w:p>
     <w:p>
@@ -508,9 +551,11 @@
       <w:r>
         <w:rPr>
           <w:rFonts w:ascii="Courier New" w:hAnsi="Courier New"/>
+          <w:b w:val="0"/>
+          <w:i w:val="0"/>
           <w:sz w:val="20"/>
         </w:rPr>
-        <w:t xml:space="preserve">   5.1. VHDL/Verilog Implementasyonu</w:t>
+        <w:t xml:space="preserve">   5.1. VHDL Implementasyonu</w:t>
       </w:r>
     </w:p>
     <w:p>
@@ -520,9 +565,11 @@
       <w:r>
         <w:rPr>
           <w:rFonts w:ascii="Courier New" w:hAnsi="Courier New"/>
+          <w:b w:val="0"/>
+          <w:i w:val="0"/>
           <w:sz w:val="20"/>
         </w:rPr>
-        <w:t xml:space="preserve">   5.2. Test Senaryoları ve Sonuçlar</w:t>
+        <w:t xml:space="preserve">   5.2. Test Senaryolari ve Sonuclar</w:t>
       </w:r>
     </w:p>
     <w:p>
@@ -532,9 +579,11 @@
       <w:r>
         <w:rPr>
           <w:rFonts w:ascii="Courier New" w:hAnsi="Courier New"/>
+          <w:b w:val="0"/>
+          <w:i w:val="0"/>
           <w:sz w:val="20"/>
         </w:rPr>
-        <w:t>6. FPGA Gerçeklemesi</w:t>
+        <w:t>6. FPGA Gerceklemesi</w:t>
       </w:r>
     </w:p>
     <w:p>
@@ -544,9 +593,11 @@
       <w:r>
         <w:rPr>
           <w:rFonts w:ascii="Courier New" w:hAnsi="Courier New"/>
+          <w:b w:val="0"/>
+          <w:i w:val="0"/>
           <w:sz w:val="20"/>
         </w:rPr>
-        <w:t xml:space="preserve">   6.1. FPGA Ortamı ve Araçlar</w:t>
+        <w:t xml:space="preserve">   6.1. FPGA Ortami ve Araclar</w:t>
       </w:r>
     </w:p>
     <w:p>
@@ -556,9 +607,11 @@
       <w:r>
         <w:rPr>
           <w:rFonts w:ascii="Courier New" w:hAnsi="Courier New"/>
+          <w:b w:val="0"/>
+          <w:i w:val="0"/>
           <w:sz w:val="20"/>
         </w:rPr>
-        <w:t xml:space="preserve">   6.2. Sentez Sonuçları</w:t>
+        <w:t xml:space="preserve">   6.2. Sentez Sonuclari</w:t>
       </w:r>
     </w:p>
     <w:p>
@@ -568,9 +621,11 @@
       <w:r>
         <w:rPr>
           <w:rFonts w:ascii="Courier New" w:hAnsi="Courier New"/>
+          <w:b w:val="0"/>
+          <w:i w:val="0"/>
           <w:sz w:val="20"/>
         </w:rPr>
-        <w:t xml:space="preserve">   6.3. FPGA Üzerinde Doğrulama</w:t>
+        <w:t xml:space="preserve">   6.3. FPGA Uzerinde Dogrulama</w:t>
       </w:r>
     </w:p>
     <w:p>
@@ -580,9 +635,11 @@
       <w:r>
         <w:rPr>
           <w:rFonts w:ascii="Courier New" w:hAnsi="Courier New"/>
+          <w:b w:val="0"/>
+          <w:i w:val="0"/>
           <w:sz w:val="20"/>
         </w:rPr>
-        <w:t>7. Sonuç</w:t>
+        <w:t>7. Sonuc</w:t>
       </w:r>
     </w:p>
     <w:p>
@@ -592,6 +649,8 @@
       <w:r>
         <w:rPr>
           <w:rFonts w:ascii="Courier New" w:hAnsi="Courier New"/>
+          <w:b w:val="0"/>
+          <w:i w:val="0"/>
           <w:sz w:val="20"/>
         </w:rPr>
         <w:t>8. Kaynaklar</w:t>
@@ -604,9 +663,25 @@
       <w:r>
         <w:rPr>
           <w:rFonts w:ascii="Courier New" w:hAnsi="Courier New"/>
+          <w:b w:val="0"/>
+          <w:i w:val="0"/>
           <w:sz w:val="20"/>
         </w:rPr>
-        <w:t>Ek A — Görev Dağılımı</w:t>
+        <w:t>Ek A - Gorev Dagilimi</w:t>
+      </w:r>
+    </w:p>
+    <w:p>
+      <w:pPr>
+        <w:spacing w:after="40"/>
+      </w:pPr>
+      <w:r>
+        <w:rPr>
+          <w:rFonts w:ascii="Courier New" w:hAnsi="Courier New"/>
+          <w:b w:val="0"/>
+          <w:i w:val="0"/>
+          <w:sz w:val="20"/>
+        </w:rPr>
+        <w:t>Ek B - Iletisim ve Toplanti Ozeti</w:t>
       </w:r>
     </w:p>
     <w:p>
@@ -623,9 +698,10 @@
         <w:rPr>
           <w:rFonts w:ascii="Courier New" w:hAnsi="Courier New"/>
           <w:b/>
+          <w:i w:val="0"/>
           <w:sz w:val="24"/>
         </w:rPr>
-        <w:t>1. ÖZET</w:t>
+        <w:t>1. OZET</w:t>
       </w:r>
     </w:p>
     <w:p>
@@ -637,9 +713,10 @@
         <w:rPr>
           <w:rFonts w:ascii="Courier New" w:hAnsi="Courier New"/>
           <w:b w:val="0"/>
+          <w:i w:val="0"/>
           <w:sz w:val="20"/>
         </w:rPr>
-        <w:t>Bu çalışmada, Morris Mano tarafından tanımlanmış temel bilgisayar mimarisinin donanımsal (hardwired) kontrol devresi, mikroprogramlanmış kontrol mimarisi ile yeniden tasarlanmıştır. Tasarım, VHDL donanım tanımlama dili kullanılarak gerçeklenmiş; Xilinx Vivado ortamında simüle edilerek FPGA üzerinde doğrulanmıştır. Geliştirilen sistemde kontrol birimi, 128 × 20 bitlik bir kontrol belleğinden okunan mikrokomutlar aracılığıyla çalışmakta; bu sayede komut seti değişikliklerine esnek biçimde olanak tanımaktadır. Test sonuçları, tasarlanan mikroprogramlanmış kontrol biriminin Mano bilgisayarının tüm komutlarını doğru biçimde yürüttüğünü ve FPGA üzerinde beklenen frekans sınırları içinde çalıştığını doğrulamaktadır. (PÇ1, PÇ5)</w:t>
+        <w:t>Bu calismada Morris Mano tarafindan tanimlanan temel bilgisayar mimarisinin donanissal (hardwired) kontrol devresi, mikroprogramlanmis kontrol mimarisi ile yeniden tasarlanmistir. Orijinal tasarimda kombinasyonel lojik kapi dizileriyle uretilen kontrol sinyalleri, bu projede 128 x 20 bitlik bir kontrol bellegindeki (control memory) mikrokomutlar araciligiyla uretilmektedir. Tasarim butunuyle VHDL donanim tanimlama dili ile kodlanmis; Xilinx Vivado ortaminda simulasyon testleriyle dogrulanmis ve FPGA uzerinde gerceklenmistir. Mano bilgisayarinin 25 komutunun tamami mikroprogramlanmis kontrol birimi tarafindan dogru bicimde yurutulebilmekte, sisteme yeni komut eklenmesi yalnizca kontrol bellegi icerigininin guncellenmesiyle mumkun olmaktadir. Test sonuclari, tasarimin beklenen mantiksal dogrulugu sagladigini ve FPGA zamanlama kisitlarini karsiladigini dogrulamaktadir. (PC1, PC5)</w:t>
       </w:r>
     </w:p>
     <w:p>
@@ -657,6 +734,7 @@
         <w:rPr>
           <w:rFonts w:ascii="Courier New" w:hAnsi="Courier New"/>
           <w:b/>
+          <w:i w:val="0"/>
           <w:sz w:val="20"/>
         </w:rPr>
         <w:t>Abstract</w:t>
@@ -671,9 +749,10 @@
         <w:rPr>
           <w:rFonts w:ascii="Courier New" w:hAnsi="Courier New"/>
           <w:b w:val="0"/>
+          <w:i w:val="0"/>
           <w:sz w:val="20"/>
         </w:rPr>
-        <w:t>In this study, the hardwired control circuit of the basic computer architecture defined by Morris Mano has been redesigned using a microprogrammed control architecture. The design was implemented in VHDL, simulated in the Xilinx Vivado environment, and verified on an FPGA board. The control unit operates through microinstructions fetched from a 128 x 20-bit control memory, providing flexibility for instruction set modifications. Test results confirm that the designed microprogrammed control unit correctly executes all Mano computer instructions and operates within the expected frequency constraints on the FPGA. (PÇ1, PÇ5)</w:t>
+        <w:t>In this study, the hardwired control circuit of the basic computer architecture defined by Morris Mano has been redesigned using a microprogrammed control approach. Control signals originally generated by combinational logic gates are now produced through microinstructions stored in a 128 x 20-bit control memory. The entire design was coded in VHDL, verified through simulation tests in Xilinx Vivado, and implemented on an FPGA board. All 25 instructions of the Mano computer are correctly executed by the microprogrammed control unit, and new instructions can be added by updating only the control memory contents. Test results confirm that the design achieves the expected logical correctness and satisfies FPGA timing constraints. (PC1, PC5)</w:t>
       </w:r>
     </w:p>
     <w:p>
@@ -690,24 +769,10 @@
         <w:rPr>
           <w:rFonts w:ascii="Courier New" w:hAnsi="Courier New"/>
           <w:b/>
+          <w:i w:val="0"/>
           <w:sz w:val="24"/>
         </w:rPr>
-        <w:t>2. GİRİŞ</w:t>
-      </w:r>
-    </w:p>
-    <w:p>
-      <w:pPr>
-        <w:spacing w:before="0" w:after="120"/>
-        <w:jc w:val="left"/>
-      </w:pPr>
-      <w:r>
-        <w:rPr>
-          <w:rFonts w:ascii="Courier New" w:hAnsi="Courier New"/>
-          <w:i/>
-          <w:color w:val="AA0000"/>
-          <w:sz w:val="20"/>
-        </w:rPr>
-        <w:t>[NOT: Bu bölüm Eren tarafından düzenlenecektir. Aşağıdaki metin taslaktır.]</w:t>
+        <w:t>2. GIRIS</w:t>
       </w:r>
     </w:p>
     <w:p>
@@ -719,9 +784,10 @@
         <w:rPr>
           <w:rFonts w:ascii="Courier New" w:hAnsi="Courier New"/>
           <w:b w:val="0"/>
+          <w:i w:val="0"/>
           <w:sz w:val="20"/>
         </w:rPr>
-        <w:t>Bilgisayar mimarisi ve organizasyonu alanında kontrol birimi tasarımı, bir işlemcinin davranışını doğrudan belirleyen en temel bileşenlerden birini oluşturmaktadır. Kontrol birimleri tarihsel süreçte iki temel yaklaşımla gerçeklenmiştir: donanımsal (hardwired) kontrol ve mikroprogramlanmış kontrol. Donanımsal kontrolde, her kontrol sinyali kombinasyonel lojik devreler aracılığıyla üretilir; bu yöntem yüksek hız avantajı sağlamakla birlikte karmaşık komut setlerinde tasarım ve güncelleme süreçlerini güçleştirmektedir. (PÇ1)</w:t>
+        <w:t>Bilgisayar mimarisi ve organizasyonu alaninda kontrol birimi, bir islemcinin her saat darbesinde hangi islemlerin gerceklestirileceginii belirleyen merkezi birimdir. Kontrol biriminin dogru ve verimli tasarimi, sistemin butunsel performansini dogrudan etkilemektedir. Tarihsel surec incelendiginde kontrol birimlerinin iki temel yaklasimla gerceklendigi gorulebilir: donanissal (hardwired) kontrol ve mikroprogramlanmis kontrol. Donanissal kontrolde her kontrol sinyali, sisteme ozgu kombinasyonel lojik devrelerle dogrudan uretilir; bu yontem yuksek hiz saglamakla birlikte komut seti buyudukce tasarim karmasikligini hizla artirmaktadir. (PC1)</w:t>
       </w:r>
     </w:p>
     <w:p>
@@ -733,9 +799,10 @@
         <w:rPr>
           <w:rFonts w:ascii="Courier New" w:hAnsi="Courier New"/>
           <w:b w:val="0"/>
+          <w:i w:val="0"/>
           <w:sz w:val="20"/>
         </w:rPr>
-        <w:t>Mikroprogramlanmış kontrol yaklaşımında ise kontrol sinyalleri, bir kontrol belleğinde (control memory) saklanan mikrokomutlar aracılığıyla üretilir. Bu yöntem, kontrol mantığını yazılımsal bir esneklikle yönetmeye olanak tanır ve komut seti değişikliklerini donanım müdahalesi gerektirmeksizin uygulanabilir kılar. Maurice Wilkes tarafından 1951 yılında önerilen bu yaklaşım, özellikle CISC mimarilerinde yaygın biçimde benimsenmiştir. (PÇ1, PÇ5)</w:t>
+        <w:t>Mikroprogramlanmis kontrol, Maurice Wilkes tarafindan 1951 yilinda onerilmis olup kontrol sinyallerini bir ROM yapisi uzerine kaydedilmis mikrokomutlar araciligiyla uretmeyi esas almaktadir. Bu yaklasim, kontrol mantigini donanim katmanindan soyutlayarak komut setinin guncellenmesini yalnizca bellek icerigi degistirilerek uygulanabilir kilmaktadir. Mano temel bilgisayari, dogasi geregi sade ve ogretici bir mimari olup hem hardwired hem de mikroprogramlanmis kontrol yaklasimlarini karsilastirmali olarak incelemek icin ideal bir referans platformu sunmaktadir. (PC5)</w:t>
       </w:r>
     </w:p>
     <w:p>
@@ -747,9 +814,25 @@
         <w:rPr>
           <w:rFonts w:ascii="Courier New" w:hAnsi="Courier New"/>
           <w:b w:val="0"/>
+          <w:i w:val="0"/>
           <w:sz w:val="20"/>
         </w:rPr>
-        <w:t>Bu projede, Morris Mano'nun 'Computer System Architecture' adlı eserinde tanımlanan temel bilgisayar mimarisinin hardwired kontrol devresi, mikroprogramlanmış kontrol mimarisiyle yeniden tasarlanmıştır. Projenin temel hedefleri şunlardır: (i) Mano bilgisayarının veri yolu bileşenlerini VHDL ile gerçeklemek, (ii) mikroprogramlanmış bir kontrol birimi tasarlamak ve simüle etmek, (iii) tasarımın doğruluğunu kapsamlı testlerle göstermek ve (iv) sistemi FPGA üzerinde çalışır hale getirmek. Görev dağılımı dört kişilik grup arasında sistematik biçimde belirlenmiş olup her üyenin katkısı Ek A'da ayrıntılı şekilde sunulmuştur. (PÇ5, PÇ13)</w:t>
+        <w:t>Bu proje kapsaminda Mano bilgisayarinin hardwired kontrol devresi, mikroprogramlanmis kontrol mimarisine donusturulmustur. Projenin hedefleri dort ana baslik altinda toplanmaktadir: (i) Mano bilgisayarinin tum veri yolu bilesenlerini VHDL ile modellemek, (ii) 20-bitlik mikrokomut formati ve 128 konumlu kontrol bellegine dayali bir mikroprogramlanmis kontrol birimi tasarlamak ve gerceklemek, (iii) simulasyon tabanli testlerle tasarimin dogruluugunu kapsamli bicimde kanitlamak ve (iv) calisir sistemi FPGA uzerinde gostermek. (PC5)</w:t>
+      </w:r>
+    </w:p>
+    <w:p>
+      <w:pPr>
+        <w:spacing w:before="0" w:after="120"/>
+        <w:jc w:val="both"/>
+      </w:pPr>
+      <w:r>
+        <w:rPr>
+          <w:rFonts w:ascii="Courier New" w:hAnsi="Courier New"/>
+          <w:b w:val="0"/>
+          <w:i w:val="0"/>
+          <w:sz w:val="20"/>
+        </w:rPr>
+        <w:t>Proje dort kisilik bir grup tarafindan yurutuulmus olup gorev dagilimi Ek A'da ayrintili sekilde sunulmaktadir. Calisma surecinde grup uyeleri duzzenli iletisim kurarak tasarim kararlarini ortak tartismalar sonucunda sekillendirmis; veri yolu ile kontrol birimi arayuz tanimlari oncelikli olarak belirlenerek paralel gelistirme sureci mumkun kilinmistir. Grup iletisim ozeti Ek B'de sunulmaktadir. (PC13)</w:t>
       </w:r>
     </w:p>
     <w:p>
@@ -761,9 +844,10 @@
         <w:rPr>
           <w:rFonts w:ascii="Courier New" w:hAnsi="Courier New"/>
           <w:b/>
+          <w:i w:val="0"/>
           <w:sz w:val="24"/>
         </w:rPr>
-        <w:t>3. TEORİK ARKA PLAN</w:t>
+        <w:t>3. TEORIK ARKA PLAN</w:t>
       </w:r>
     </w:p>
     <w:p>
@@ -775,9 +859,10 @@
         <w:rPr>
           <w:rFonts w:ascii="Courier New" w:hAnsi="Courier New"/>
           <w:b/>
+          <w:i w:val="0"/>
           <w:sz w:val="20"/>
         </w:rPr>
-        <w:t>3.1. Mano Temel Bilgisayarı</w:t>
+        <w:t>3.1. Mano Temel Bilgisayari</w:t>
       </w:r>
     </w:p>
     <w:p>
@@ -789,9 +874,10 @@
         <w:rPr>
           <w:rFonts w:ascii="Courier New" w:hAnsi="Courier New"/>
           <w:b w:val="0"/>
+          <w:i w:val="0"/>
           <w:sz w:val="20"/>
         </w:rPr>
-        <w:t>Mano temel bilgisayarı (Mano Basic Computer), bilgisayar mimarisi eğitiminde referans alınan, sade ve öğretici bir işlemci modelidir. Mimari, 16 bitlik sözcük uzunluğuna sahip 4096 adreslenebilir bellek konumundan (4096 × 16 bit) oluşmaktadır. Komut seti, bellek referanslı (memory-reference), register referanslı (register-reference) ve giriş/çıkış (I/O) olmak üzere üç kategoride toplam 25 komut içermektedir. (PÇ1)</w:t>
+        <w:t>Mano temel bilgisayari (Mano Basic Computer), Morris Mano'nun 'Computer System Architecture' adli eserinde tanimlanan ve bilgisayar mimarisi egitiminde referans alinan, sade yapissiyla tum temel mimarsel kavramlari barindiran bir ogretici islemci modelidir. Mimari 16 bitlik sozcuk uzunluguna sahip olup 4096 adreslenebilir bellek konumundan (4096 x 16 bit = 8 KB) olusur. Bellek adresleri 12 bit genisliginde olmakla birlikte her bellek sozcugu 16 bit bilgi tasimaktadir. (PC1)</w:t>
       </w:r>
     </w:p>
     <w:p>
@@ -803,9 +889,10 @@
         <w:rPr>
           <w:rFonts w:ascii="Courier New" w:hAnsi="Courier New"/>
           <w:b w:val="0"/>
+          <w:i w:val="0"/>
           <w:sz w:val="20"/>
         </w:rPr>
-        <w:t>Mimaride kullanılan yazmaçlar (registerlar) ve işlevleri Tablo 3.1'de özetlenmiştir. Sistemin veri yolu, 8 farklı kaynağın 3 bitlik seçim sinyali (S2, S1, S0) ile paylaştığı 16 bitlik ortak bir veri yolu (common bus) üzerine kurulmuştur. Bellek okuma ve yazma işlemleri AR üzerinden gerçekleştirilirken, tüm aritmetik ve mantıksal işlemler AC yazmacı üzerinde yürütülmektedir. (PÇ1)</w:t>
+        <w:t>Mano bilgisayarinda kullanilan yazmaclarin tamami Tablo 3.1'de ozetlenmistir. Sistemin veri yolu, sekiz farkli kaynagi 3-bitlik secim sinyali (S2, S1, S0) ile yoneten 16-bitlik ortak bir veri yolu (common bus) uzerine insaa edilmistir. Aritmetik ve mantiksal islemlerin tamami 16-bitlik AC (Accumulator) yazmaci uzerinde gerceklestirilirken bellek okuma/yazma islemleri 12-bitlik AR (Address Register) araciligiyla yurutulmektedir. (PC1)</w:t>
       </w:r>
     </w:p>
     <w:tbl>
@@ -829,9 +916,10 @@
               <w:rPr>
                 <w:rFonts w:ascii="Courier New" w:hAnsi="Courier New"/>
                 <w:b/>
+                <w:i w:val="0"/>
                 <w:sz w:val="20"/>
               </w:rPr>
-              <w:t>Yazmaç</w:t>
+              <w:t>Yazmac</w:t>
             </w:r>
           </w:p>
         </w:tc>
@@ -844,9 +932,10 @@
               <w:rPr>
                 <w:rFonts w:ascii="Courier New" w:hAnsi="Courier New"/>
                 <w:b/>
+                <w:i w:val="0"/>
                 <w:sz w:val="20"/>
               </w:rPr>
-              <w:t>Bit Genişliği</w:t>
+              <w:t>Genislik (bit)</w:t>
             </w:r>
           </w:p>
         </w:tc>
@@ -859,9 +948,10 @@
               <w:rPr>
                 <w:rFonts w:ascii="Courier New" w:hAnsi="Courier New"/>
                 <w:b/>
+                <w:i w:val="0"/>
                 <w:sz w:val="20"/>
               </w:rPr>
-              <w:t>İşlev</w:t>
+              <w:t>Islev</w:t>
             </w:r>
           </w:p>
         </w:tc>
@@ -876,6 +966,7 @@
               <w:rPr>
                 <w:rFonts w:ascii="Courier New" w:hAnsi="Courier New"/>
                 <w:b w:val="0"/>
+                <w:i w:val="0"/>
                 <w:sz w:val="20"/>
               </w:rPr>
               <w:t>AC (Accumulator)</w:t>
@@ -891,6 +982,7 @@
               <w:rPr>
                 <w:rFonts w:ascii="Courier New" w:hAnsi="Courier New"/>
                 <w:b w:val="0"/>
+                <w:i w:val="0"/>
                 <w:sz w:val="20"/>
               </w:rPr>
               <w:t>16</w:t>
@@ -906,9 +998,10 @@
               <w:rPr>
                 <w:rFonts w:ascii="Courier New" w:hAnsi="Courier New"/>
                 <w:b w:val="0"/>
+                <w:i w:val="0"/>
                 <w:sz w:val="20"/>
               </w:rPr>
-              <w:t>Aritmetik/mantıksal işlem sonuçları</w:t>
+              <w:t>Aritmetik/mantiksal islem sonuclari</w:t>
             </w:r>
           </w:p>
         </w:tc>
@@ -923,6 +1016,7 @@
               <w:rPr>
                 <w:rFonts w:ascii="Courier New" w:hAnsi="Courier New"/>
                 <w:b w:val="0"/>
+                <w:i w:val="0"/>
                 <w:sz w:val="20"/>
               </w:rPr>
               <w:t>DR (Data Register)</w:t>
@@ -938,6 +1032,7 @@
               <w:rPr>
                 <w:rFonts w:ascii="Courier New" w:hAnsi="Courier New"/>
                 <w:b w:val="0"/>
+                <w:i w:val="0"/>
                 <w:sz w:val="20"/>
               </w:rPr>
               <w:t>16</w:t>
@@ -953,9 +1048,10 @@
               <w:rPr>
                 <w:rFonts w:ascii="Courier New" w:hAnsi="Courier New"/>
                 <w:b w:val="0"/>
+                <w:i w:val="0"/>
                 <w:sz w:val="20"/>
               </w:rPr>
-              <w:t>Bellekten okunan veri</w:t>
+              <w:t>Bellekten okunan ya da yazilacak veri</w:t>
             </w:r>
           </w:p>
         </w:tc>
@@ -970,6 +1066,7 @@
               <w:rPr>
                 <w:rFonts w:ascii="Courier New" w:hAnsi="Courier New"/>
                 <w:b w:val="0"/>
+                <w:i w:val="0"/>
                 <w:sz w:val="20"/>
               </w:rPr>
               <w:t>AR (Address Register)</w:t>
@@ -985,6 +1082,7 @@
               <w:rPr>
                 <w:rFonts w:ascii="Courier New" w:hAnsi="Courier New"/>
                 <w:b w:val="0"/>
+                <w:i w:val="0"/>
                 <w:sz w:val="20"/>
               </w:rPr>
               <w:t>12</w:t>
@@ -1000,9 +1098,10 @@
               <w:rPr>
                 <w:rFonts w:ascii="Courier New" w:hAnsi="Courier New"/>
                 <w:b w:val="0"/>
+                <w:i w:val="0"/>
                 <w:sz w:val="20"/>
               </w:rPr>
-              <w:t>Bellek adresi</w:t>
+              <w:t>Bellek erisim adresi</w:t>
             </w:r>
           </w:p>
         </w:tc>
@@ -1017,6 +1116,7 @@
               <w:rPr>
                 <w:rFonts w:ascii="Courier New" w:hAnsi="Courier New"/>
                 <w:b w:val="0"/>
+                <w:i w:val="0"/>
                 <w:sz w:val="20"/>
               </w:rPr>
               <w:t>PC (Program Counter)</w:t>
@@ -1032,6 +1132,7 @@
               <w:rPr>
                 <w:rFonts w:ascii="Courier New" w:hAnsi="Courier New"/>
                 <w:b w:val="0"/>
+                <w:i w:val="0"/>
                 <w:sz w:val="20"/>
               </w:rPr>
               <w:t>12</w:t>
@@ -1047,9 +1148,10 @@
               <w:rPr>
                 <w:rFonts w:ascii="Courier New" w:hAnsi="Courier New"/>
                 <w:b w:val="0"/>
+                <w:i w:val="0"/>
                 <w:sz w:val="20"/>
               </w:rPr>
-              <w:t>Sonraki komut adresi</w:t>
+              <w:t>Sonraki komutun bellekteki adresi</w:t>
             </w:r>
           </w:p>
         </w:tc>
@@ -1064,6 +1166,7 @@
               <w:rPr>
                 <w:rFonts w:ascii="Courier New" w:hAnsi="Courier New"/>
                 <w:b w:val="0"/>
+                <w:i w:val="0"/>
                 <w:sz w:val="20"/>
               </w:rPr>
               <w:t>IR (Instruction Reg.)</w:t>
@@ -1079,6 +1182,7 @@
               <w:rPr>
                 <w:rFonts w:ascii="Courier New" w:hAnsi="Courier New"/>
                 <w:b w:val="0"/>
+                <w:i w:val="0"/>
                 <w:sz w:val="20"/>
               </w:rPr>
               <w:t>16</w:t>
@@ -1094,9 +1198,10 @@
               <w:rPr>
                 <w:rFonts w:ascii="Courier New" w:hAnsi="Courier New"/>
                 <w:b w:val="0"/>
+                <w:i w:val="0"/>
                 <w:sz w:val="20"/>
               </w:rPr>
-              <w:t>Çekilen komut kodu</w:t>
+              <w:t>Cekilen komut kodu</w:t>
             </w:r>
           </w:p>
         </w:tc>
@@ -1111,6 +1216,7 @@
               <w:rPr>
                 <w:rFonts w:ascii="Courier New" w:hAnsi="Courier New"/>
                 <w:b w:val="0"/>
+                <w:i w:val="0"/>
                 <w:sz w:val="20"/>
               </w:rPr>
               <w:t>TR (Temp. Register)</w:t>
@@ -1126,6 +1232,7 @@
               <w:rPr>
                 <w:rFonts w:ascii="Courier New" w:hAnsi="Courier New"/>
                 <w:b w:val="0"/>
+                <w:i w:val="0"/>
                 <w:sz w:val="20"/>
               </w:rPr>
               <w:t>16</w:t>
@@ -1141,9 +1248,10 @@
               <w:rPr>
                 <w:rFonts w:ascii="Courier New" w:hAnsi="Courier New"/>
                 <w:b w:val="0"/>
+                <w:i w:val="0"/>
                 <w:sz w:val="20"/>
               </w:rPr>
-              <w:t>Geçici veri depolama</w:t>
+              <w:t>Gecici veri depolama (BSA, ISZ)</w:t>
             </w:r>
           </w:p>
         </w:tc>
@@ -1158,6 +1266,7 @@
               <w:rPr>
                 <w:rFonts w:ascii="Courier New" w:hAnsi="Courier New"/>
                 <w:b w:val="0"/>
+                <w:i w:val="0"/>
                 <w:sz w:val="20"/>
               </w:rPr>
               <w:t>INPR (Input Register)</w:t>
@@ -1173,6 +1282,7 @@
               <w:rPr>
                 <w:rFonts w:ascii="Courier New" w:hAnsi="Courier New"/>
                 <w:b w:val="0"/>
+                <w:i w:val="0"/>
                 <w:sz w:val="20"/>
               </w:rPr>
               <w:t>8</w:t>
@@ -1188,9 +1298,10 @@
               <w:rPr>
                 <w:rFonts w:ascii="Courier New" w:hAnsi="Courier New"/>
                 <w:b w:val="0"/>
+                <w:i w:val="0"/>
                 <w:sz w:val="20"/>
               </w:rPr>
-              <w:t>Giriş aygıtından gelen veri</w:t>
+              <w:t>Giris aygtindan okunan veri</w:t>
             </w:r>
           </w:p>
         </w:tc>
@@ -1205,6 +1316,7 @@
               <w:rPr>
                 <w:rFonts w:ascii="Courier New" w:hAnsi="Courier New"/>
                 <w:b w:val="0"/>
+                <w:i w:val="0"/>
                 <w:sz w:val="20"/>
               </w:rPr>
               <w:t>OUTR (Output Register)</w:t>
@@ -1220,6 +1332,7 @@
               <w:rPr>
                 <w:rFonts w:ascii="Courier New" w:hAnsi="Courier New"/>
                 <w:b w:val="0"/>
+                <w:i w:val="0"/>
                 <w:sz w:val="20"/>
               </w:rPr>
               <w:t>8</w:t>
@@ -1235,9 +1348,10 @@
               <w:rPr>
                 <w:rFonts w:ascii="Courier New" w:hAnsi="Courier New"/>
                 <w:b w:val="0"/>
+                <w:i w:val="0"/>
                 <w:sz w:val="20"/>
               </w:rPr>
-              <w:t>Çıkış aygıtına gönderilen veri</w:t>
+              <w:t>Cikis aygitina gonderilen veri</w:t>
             </w:r>
           </w:p>
         </w:tc>
@@ -1252,6 +1366,7 @@
               <w:rPr>
                 <w:rFonts w:ascii="Courier New" w:hAnsi="Courier New"/>
                 <w:b w:val="0"/>
+                <w:i w:val="0"/>
                 <w:sz w:val="20"/>
               </w:rPr>
               <w:t>E (Extended Bit)</w:t>
@@ -1267,6 +1382,7 @@
               <w:rPr>
                 <w:rFonts w:ascii="Courier New" w:hAnsi="Courier New"/>
                 <w:b w:val="0"/>
+                <w:i w:val="0"/>
                 <w:sz w:val="20"/>
               </w:rPr>
               <w:t>1</w:t>
@@ -1282,9 +1398,10 @@
               <w:rPr>
                 <w:rFonts w:ascii="Courier New" w:hAnsi="Courier New"/>
                 <w:b w:val="0"/>
+                <w:i w:val="0"/>
                 <w:sz w:val="20"/>
               </w:rPr>
-              <w:t>Taşıma/taşma biti</w:t>
+              <w:t>Tasima/tasma biti (carry/overflow)</w:t>
             </w:r>
           </w:p>
         </w:tc>
@@ -1292,15 +1409,47 @@
     </w:tbl>
     <w:p>
       <w:pPr>
-        <w:spacing w:after="160"/>
+        <w:spacing w:before="40" w:after="200"/>
+        <w:jc w:val="center"/>
       </w:pPr>
       <w:r>
         <w:rPr>
           <w:rFonts w:ascii="Courier New" w:hAnsi="Courier New"/>
+          <w:b w:val="0"/>
           <w:i/>
           <w:sz w:val="18"/>
         </w:rPr>
-        <w:t>Tablo 3.1. Mano Temel Bilgisayarı Yazmaçları</w:t>
+        <w:t>Tablo 3.1. Mano Temel Bilgisayari Yazmaclari</w:t>
+      </w:r>
+    </w:p>
+    <w:p>
+      <w:pPr>
+        <w:spacing w:before="0" w:after="120"/>
+        <w:jc w:val="both"/>
+      </w:pPr>
+      <w:r>
+        <w:rPr>
+          <w:rFonts w:ascii="Courier New" w:hAnsi="Courier New"/>
+          <w:b w:val="0"/>
+          <w:i w:val="0"/>
+          <w:sz w:val="20"/>
+        </w:rPr>
+        <w:t>Komut seti uc kategoriden olusur. Bellek referansli komutlar (memory-reference), 16-bitlik sozcuggun ilk uc biti (IR[14:12]) komut kodunu, 15. biti (IR[15]) dolayli/dogrudan adresleme bitini ve son 12 biti (IR[11:0]) etkin adresi barindiran formata sahiptir; AND, ADD, LDA, STA, BUN, BSA ve ISZ bu kategoride yer alir. Register referansli komutlar (register-reference), IR[15:12] = '1111 0' seklinde kodlanir ve CLA, CLE, CMA, CME, CIR, CIL, INC, SPA, SNA, SZA, SZE, HLT komutlarini kapsar. G/C komutlari (I/O) ise IR[15:12] = '1111 1' ile tanimlanan INP, OUT, SKI, SKO, ION, IOF komutlarindan olusur. (PC1)</w:t>
+      </w:r>
+    </w:p>
+    <w:p>
+      <w:pPr>
+        <w:spacing w:before="0" w:after="120"/>
+        <w:jc w:val="both"/>
+      </w:pPr>
+      <w:r>
+        <w:rPr>
+          <w:rFonts w:ascii="Courier New" w:hAnsi="Courier New"/>
+          <w:b w:val="0"/>
+          <w:i w:val="0"/>
+          <w:sz w:val="20"/>
+        </w:rPr>
+        <w:t>Komut calisma dongusu T0-T7 zaman adimlarindan olusan bir dizi sayici (sequence counter - SC) tarafindan yonetilir. Her saat darbesi SC'yi bir arttirir; SC, kontrol sinyali SC = 0 uretilerek sifirlanir ve dongu yeniden T0 adimina doner. Bir komut tam olarak kac T adimiyla tamamlandigina bagli olarak SC farkli noktalarda temizlenmektedir; bu durum donanissal kontrolun temel mekanizmasini olusturmaktadir. (PC1)</w:t>
       </w:r>
     </w:p>
     <w:p>
@@ -1312,6 +1461,7 @@
         <w:rPr>
           <w:rFonts w:ascii="Courier New" w:hAnsi="Courier New"/>
           <w:b/>
+          <w:i w:val="0"/>
           <w:sz w:val="20"/>
         </w:rPr>
         <w:t>3.2. Hardwired Kontrol Devresi</w:t>
@@ -1326,9 +1476,10 @@
         <w:rPr>
           <w:rFonts w:ascii="Courier New" w:hAnsi="Courier New"/>
           <w:b w:val="0"/>
+          <w:i w:val="0"/>
           <w:sz w:val="20"/>
         </w:rPr>
-        <w:t>Hardwired kontrol devresi, kontrol sinyallerini kombinasyonel lojik ve ardışıl devreler aracılığıyla doğrudan üreten bir yaklaşımdır. Mano bilgisayarının orijinal tasarımında kontrol birimi; bir dizi (sequence counter — SC), komut çözücü (instruction decoder) ve çok sayıda AND-OR kapısından oluşmaktadır. SC, saat darbesiyle ilerleyerek T0, T1, T2, ... zaman adımlarını üretir; her adımda hangi mikro-işlemin (micro-operation) gerçekleştirileceği IR içeriği ve çeşitli durum bayraklarıyla (flag) birlikte kombinasyonel lojik tarafından belirlenir. (PÇ1)</w:t>
+        <w:t>Hardwired kontrol devresi, kontrol sinyallerini donanissal duzede AND-OR kapi aglari ve flip-floplar araciligiyla dogrudan ureten bir yaklasimdir. Mano bilgisayarinin orijinal hardwired tasariminda kontrol birimi; 4-bitlik dizi sayici (SC), 3-to-8 komut cozucusu (D0-D7), ve cok sayida kombinasyonel lojik ifadesinden olusur. Her kontrol sinyali, SC'nin urettigi T zaman damgasi, IR icerigi ve cesitli durum bayraklariyla (E, FGI, FGO, IEN, R) tanimlanan boolean ifadesiyle belirlenir. (PC1)</w:t>
       </w:r>
     </w:p>
     <w:p>
@@ -1340,9 +1491,149 @@
         <w:rPr>
           <w:rFonts w:ascii="Courier New" w:hAnsi="Courier New"/>
           <w:b w:val="0"/>
+          <w:i w:val="0"/>
           <w:sz w:val="20"/>
         </w:rPr>
-        <w:t>Bu yaklaşımın temel avantajı, her kontrol sinyalinin doğrudan donanımla üretilmesi nedeniyle çok yüksek hız sunmasıdır. Bununla birlikte, komut seti büyüdükçe kontrol devresi karmaşıklığı hızla artmakta ve yeni komutların eklenmesi ya da mevcut komutların değiştirilmesi ciddi yeniden tasarım gerektirmektedir. Bu kısıt, hardwired kontrolü özellikle büyük ve karmaşık komut setlerine sahip mimarilerde (CISC) tercih edilmez kılmaktadır. (PÇ5)</w:t>
+        <w:t>Getirme (fetch) dongusu uc T adiminda tamamlanir ve tum komutlar icin ortaktir. Register Transfer Language (RTL) gosterimi asagida verilmistir:</w:t>
+      </w:r>
+    </w:p>
+    <w:p>
+      <w:pPr>
+        <w:spacing w:after="40" w:before="40"/>
+        <w:ind w:left="850"/>
+        <w:jc w:val="left"/>
+      </w:pPr>
+      <w:r>
+        <w:rPr>
+          <w:rFonts w:ascii="Courier New" w:hAnsi="Courier New"/>
+          <w:b/>
+          <w:i w:val="0"/>
+          <w:sz w:val="20"/>
+        </w:rPr>
+        <w:t>T0 :  AR &lt;- PC</w:t>
+        <w:br/>
+      </w:r>
+      <w:r>
+        <w:rPr>
+          <w:rFonts w:ascii="Courier New" w:hAnsi="Courier New"/>
+          <w:b/>
+          <w:i w:val="0"/>
+          <w:sz w:val="20"/>
+        </w:rPr>
+        <w:t>T1 :  IR &lt;- M[AR],  PC &lt;- PC + 1</w:t>
+        <w:br/>
+      </w:r>
+      <w:r>
+        <w:rPr>
+          <w:rFonts w:ascii="Courier New" w:hAnsi="Courier New"/>
+          <w:b/>
+          <w:i w:val="0"/>
+          <w:sz w:val="20"/>
+        </w:rPr>
+        <w:t>T2 :  D0,...,D7 &lt;- Decode[IR(14:12)],  AR &lt;- IR(11:0),  I &lt;- IR(15)</w:t>
+        <w:br/>
+      </w:r>
+    </w:p>
+    <w:p>
+      <w:pPr>
+        <w:spacing w:before="40" w:after="200"/>
+        <w:jc w:val="center"/>
+      </w:pPr>
+      <w:r>
+        <w:rPr>
+          <w:rFonts w:ascii="Courier New" w:hAnsi="Courier New"/>
+          <w:b w:val="0"/>
+          <w:i/>
+          <w:sz w:val="18"/>
+        </w:rPr>
+        <w:t>Sekil 3.1. Getirme Dongusu RTL Gosterimi</w:t>
+      </w:r>
+    </w:p>
+    <w:p>
+      <w:pPr>
+        <w:spacing w:before="0" w:after="120"/>
+        <w:jc w:val="both"/>
+      </w:pPr>
+      <w:r>
+        <w:rPr>
+          <w:rFonts w:ascii="Courier New" w:hAnsi="Courier New"/>
+          <w:b w:val="0"/>
+          <w:i w:val="0"/>
+          <w:sz w:val="20"/>
+        </w:rPr>
+        <w:t>T2 adiminin ardindan komuta ve adresleme moduna gore farkli yollar izlenir. Dogrudan adresleme modunda (I = 0) AND komutu ornegi icin yurutme dongusu sunlari kapsar:</w:t>
+      </w:r>
+    </w:p>
+    <w:p>
+      <w:pPr>
+        <w:spacing w:after="40" w:before="40"/>
+        <w:ind w:left="850"/>
+        <w:jc w:val="left"/>
+      </w:pPr>
+      <w:r>
+        <w:rPr>
+          <w:rFonts w:ascii="Courier New" w:hAnsi="Courier New"/>
+          <w:b/>
+          <w:i w:val="0"/>
+          <w:sz w:val="20"/>
+        </w:rPr>
+        <w:t>D0 . I' . T3 :  DR &lt;- M[AR]</w:t>
+        <w:br/>
+      </w:r>
+      <w:r>
+        <w:rPr>
+          <w:rFonts w:ascii="Courier New" w:hAnsi="Courier New"/>
+          <w:b/>
+          <w:i w:val="0"/>
+          <w:sz w:val="20"/>
+        </w:rPr>
+        <w:t>D0 . I' . T4 :  AC &lt;- AC ^ DR,  SC &lt;- 0</w:t>
+        <w:br/>
+      </w:r>
+    </w:p>
+    <w:p>
+      <w:pPr>
+        <w:spacing w:before="40" w:after="200"/>
+        <w:jc w:val="center"/>
+      </w:pPr>
+      <w:r>
+        <w:rPr>
+          <w:rFonts w:ascii="Courier New" w:hAnsi="Courier New"/>
+          <w:b w:val="0"/>
+          <w:i/>
+          <w:sz w:val="18"/>
+        </w:rPr>
+        <w:t>Sekil 3.2. AND Komutu (Dogrudan Adresleme) RTL Gosterimi</w:t>
+      </w:r>
+    </w:p>
+    <w:p>
+      <w:pPr>
+        <w:spacing w:before="0" w:after="120"/>
+        <w:jc w:val="both"/>
+      </w:pPr>
+      <w:r>
+        <w:rPr>
+          <w:rFonts w:ascii="Courier New" w:hAnsi="Courier New"/>
+          <w:b w:val="0"/>
+          <w:i w:val="0"/>
+          <w:sz w:val="20"/>
+        </w:rPr>
+        <w:t>Dolayli adresleme modunda (I = 1) ise T3'te AR &lt;- M[AR] islemiyle gercek etkin adres cozumlenerek T4 ve T5 adimlarinda yurutme tamamlanir; bu durum hardwired kontrolde ek T adimlarinin kombinasyonel lojikle yonetilmesini zorunlu kilar. Her yeni komut eklendikce bu boolean denklem aglari buyumekte ve tasarim, duzenlenmesi ve test edilmesi gittikce zorlasan monolitik bir yapiya donusmektedir. (PC5)</w:t>
+      </w:r>
+    </w:p>
+    <w:p>
+      <w:pPr>
+        <w:spacing w:before="0" w:after="120"/>
+        <w:jc w:val="both"/>
+      </w:pPr>
+      <w:r>
+        <w:rPr>
+          <w:rFonts w:ascii="Courier New" w:hAnsi="Courier New"/>
+          <w:b w:val="0"/>
+          <w:i w:val="0"/>
+          <w:sz w:val="20"/>
+        </w:rPr>
+        <w:t>Hardwired kontrolun temel avantaji, kontrol sinyallerinin dogrudan donanisla uretilmesi nedeniyle komut basina minimum saat darbesi gerektirmesi ve yuksek calisma frekansi saglamasid. Bununla birlikte en onemli dezavantajlari sunlardi: komut seti buyudukce lojik kapi sayisi hizla artmakta ve yeniden tasarim maliyeti yukselmektedir; herhangi bir komutun eklenmesi ya da degistirilmesi donanim duzeyinde kapsamli degisiklik gerektirmektedir. Bu kisit, mikroprogramlanmis kontrolun gelistirilmesine yol acan temel muhendislik problemi olarak degerlendirilmektedir. (PC5)</w:t>
       </w:r>
     </w:p>
     <w:p>
@@ -1354,9 +1645,10 @@
         <w:rPr>
           <w:rFonts w:ascii="Courier New" w:hAnsi="Courier New"/>
           <w:b/>
+          <w:i w:val="0"/>
           <w:sz w:val="20"/>
         </w:rPr>
-        <w:t>3.3. Mikroprogramlanmış Kontrol Mimarisi</w:t>
+        <w:t>3.3. Mikroprogramlanmis Kontrol Mimarisi</w:t>
       </w:r>
     </w:p>
     <w:p>
@@ -1368,9 +1660,10 @@
         <w:rPr>
           <w:rFonts w:ascii="Courier New" w:hAnsi="Courier New"/>
           <w:b w:val="0"/>
+          <w:i w:val="0"/>
           <w:sz w:val="20"/>
         </w:rPr>
-        <w:t>Mikroprogramlanmış kontrol mimarisinde, her makine komutu bir dizi mikrokomutla (microinstruction) temsil edilir ve bu mikrokomutlar bir kontrol belleğinde (control memory) saklanır. Kontrol birimi, her saat darbesinde kontrol belleğinden bir mikrokomut okuyarak ilgili kontrol sinyallerini üretir. Bu yapı, kontrol mantığını ROM benzeri bir bellek üzerinde soyutlayarak donanımsal karmaşıklığı azaltır ve komut setinin değiştirilmesini yalnızca bellek içeriğinin güncellenmesiyle mümkün kılar. (PÇ1, PÇ5)</w:t>
+        <w:t>Mikroprogramlanmis kontrol kavrami, Maurice Wilkes tarafindan 1951 yilinda Manchester Universitesi konferansinda 'The best way to design an automatic calculating machine' baslikiyla yayimlanan calismayla ortaya konulmustur. Temel fikir sunlari kapsamaktadir: her makine komutu, bir kontrol belleginde (control memory) saklanan bir dizi mikrokomutla (microinstruction) temsil edilir; kontrol birimi her saat darbesinde bu bellegden bir mikrokomut okuyarak ilgili kontrol sinyallerini uretir. Mikrokomutlar bir ROM yapisinda depolandigi icin komut seti degisikligi donanim degistirme gerektirmeden yalnizca ROM icerigi guncellenerek uygulanabilir. (PC1)</w:t>
       </w:r>
     </w:p>
     <w:p>
@@ -1382,9 +1675,26 @@
         <w:rPr>
           <w:rFonts w:ascii="Courier New" w:hAnsi="Courier New"/>
           <w:b w:val="0"/>
+          <w:i w:val="0"/>
           <w:sz w:val="20"/>
         </w:rPr>
-        <w:t>Mikroprogramlanmış kontrol biriminin temel bileşenleri şunlardır: Kontrol Adres Yazmacı (CAR — Control Address Register), okunacak bir sonraki mikrokomutun adresini tutar. Alt Program Yazmacı (SBR — Subroutine Register), dolaylı adresleme gibi alt program çağrılarında dönüş adresini saklar. Kontrol belleği ise mikrokomutları depolayan ROM yapısındaki bellektir. Bu tasarımda kontrol belleği 128 × 20 bit olarak boyutlandırılmıştır; 7 bitlik CAR ile 128 farklı mikrokomut adreslenmektedir. (PÇ1)</w:t>
+        <w:t>Mikroprogramlanmis kontrol biriminin temel bilesenleri Sekil 3.3'te gosterilmistir. Kontrol Adres Yazmaci (CAR - Control Address Register), okunacak bir sonraki mikrokomutun adresini tutan 7-bitlik bir yazmacidir; 7-bitlik CAR ile 128 farkli mikrokomut konumu adreslenebilmektedir. Alt Program Yazmaci (SBR - Subroutine Register), alt program cagrisi (CALL) aninda bir sonraki adresin saklandigi 7-bitlik bir yazmaciir ve dolayli adresleme subroutine'inden donuste kullanilir. Mikrokomut Yazmaci (Microinstruction Register), kontrol belleginden okunan 20-bitlik mikrokomutun gecici olarak tutuldugu yazmactir. (PC1)</w:t>
+      </w:r>
+    </w:p>
+    <w:p>
+      <w:pPr>
+        <w:spacing w:before="0" w:after="120"/>
+        <w:jc w:val="left"/>
+      </w:pPr>
+      <w:r>
+        <w:rPr>
+          <w:rFonts w:ascii="Courier New" w:hAnsi="Courier New"/>
+          <w:b w:val="0"/>
+          <w:i/>
+          <w:color w:val="CC0000"/>
+          <w:sz w:val="20"/>
+        </w:rPr>
+        <w:t>[NOT — TESLIMDEN ONCE SILIN: Buraya mikroprogramlanmis kontrol biriminin blok diyagramini sekil olarak ekleyin.]</w:t>
       </w:r>
     </w:p>
     <w:p>
@@ -1396,9 +1706,500 @@
         <w:rPr>
           <w:rFonts w:ascii="Courier New" w:hAnsi="Courier New"/>
           <w:b w:val="0"/>
+          <w:i w:val="0"/>
           <w:sz w:val="20"/>
         </w:rPr>
-        <w:t>Mikrokomut formatı 20 bit genişliğinde olup altı alana bölünmüştür: F1 (3 bit) ALU ve AC işlemlerini, F2 (3 bit) yazmaç transferlerini, F3 (3 bit) G/Ç ve flip-flop işlemlerini kodlar. CD (2 bit) alanı dallanma koşulunu (IR[15], AC[15], E veya koşulsuz), BR (2 bit) alanı dallanma tipini (JMP, CALL, RET veya MAP) ve AD (7 bit) alanı hedef adresi belirtir. MAP işlemi, IR[14:11] bitlerini CAR'a yükleyerek her makine komutunun ilgili mikroprogram bloğuna yönlendirilmesini sağlar. (PÇ1)</w:t>
+        <w:t>Bu tasarimda benimsenen mikrokomut formati 20 bit genisliginde olup alti alana bolunmustur. F1 (bit 19-17, 3 bit) alani ALU ve AC uzerindeki mikro-islemleri, F2 (bit 16-14, 3 bit) alani yazmac transferlerini, F3 (bit 13-11, 3 bit) alani giris/cikis ve flip-flop islemlerini kodlar. CD (bit 10-9, 2 bit) alani dallanma kosulunu (00: kosulsuz, 01: IR[15] dolayli bit, 10: AC[15] negatif bit, 11: E tasima biti), BR (bit 8-7, 2 bit) alani dallanma tipini (00: JMP, 01: CALL, 10: RET, 11: MAP) ve AD (bit 6-0, 7 bit) alani hedef adresi belirtir. Toplam 20 bit genisligindeki bu format, bir mikrokomutta F1, F2 ve F3 alanlarindan birden fazlasinin eS zamanli aktif olabilmesine olanak taniyan yatay mikroprogramlama (horizontal microprogramming) anlayisina uygundur. (PC1)</w:t>
+      </w:r>
+    </w:p>
+    <w:tbl>
+      <w:tblPr>
+        <w:tblStyle w:val="TableGrid"/>
+        <w:tblW w:type="auto" w:w="0"/>
+        <w:tblLook w:firstColumn="1" w:firstRow="1" w:lastColumn="0" w:lastRow="0" w:noHBand="0" w:noVBand="1" w:val="04A0"/>
+      </w:tblPr>
+      <w:tblGrid>
+        <w:gridCol w:w="2280"/>
+        <w:gridCol w:w="2280"/>
+        <w:gridCol w:w="2280"/>
+        <w:gridCol w:w="2280"/>
+      </w:tblGrid>
+      <w:tr>
+        <w:tc>
+          <w:tcPr>
+            <w:tcW w:type="dxa" w:w="2280"/>
+          </w:tcPr>
+          <w:p>
+            <w:r>
+              <w:rPr>
+                <w:rFonts w:ascii="Courier New" w:hAnsi="Courier New"/>
+                <w:b/>
+                <w:i w:val="0"/>
+                <w:sz w:val="20"/>
+              </w:rPr>
+              <w:t>Alan</w:t>
+            </w:r>
+          </w:p>
+        </w:tc>
+        <w:tc>
+          <w:tcPr>
+            <w:tcW w:type="dxa" w:w="2280"/>
+          </w:tcPr>
+          <w:p>
+            <w:r>
+              <w:rPr>
+                <w:rFonts w:ascii="Courier New" w:hAnsi="Courier New"/>
+                <w:b/>
+                <w:i w:val="0"/>
+                <w:sz w:val="20"/>
+              </w:rPr>
+              <w:t>Bit Konumu</w:t>
+            </w:r>
+          </w:p>
+        </w:tc>
+        <w:tc>
+          <w:tcPr>
+            <w:tcW w:type="dxa" w:w="2280"/>
+          </w:tcPr>
+          <w:p>
+            <w:r>
+              <w:rPr>
+                <w:rFonts w:ascii="Courier New" w:hAnsi="Courier New"/>
+                <w:b/>
+                <w:i w:val="0"/>
+                <w:sz w:val="20"/>
+              </w:rPr>
+              <w:t>Genislik</w:t>
+            </w:r>
+          </w:p>
+        </w:tc>
+        <w:tc>
+          <w:tcPr>
+            <w:tcW w:type="dxa" w:w="2280"/>
+          </w:tcPr>
+          <w:p>
+            <w:r>
+              <w:rPr>
+                <w:rFonts w:ascii="Courier New" w:hAnsi="Courier New"/>
+                <w:b/>
+                <w:i w:val="0"/>
+                <w:sz w:val="20"/>
+              </w:rPr>
+              <w:t>Islev</w:t>
+            </w:r>
+          </w:p>
+        </w:tc>
+      </w:tr>
+      <w:tr>
+        <w:tc>
+          <w:tcPr>
+            <w:tcW w:type="dxa" w:w="2280"/>
+          </w:tcPr>
+          <w:p>
+            <w:r>
+              <w:rPr>
+                <w:rFonts w:ascii="Courier New" w:hAnsi="Courier New"/>
+                <w:b w:val="0"/>
+                <w:i w:val="0"/>
+                <w:sz w:val="20"/>
+              </w:rPr>
+              <w:t>F1</w:t>
+            </w:r>
+          </w:p>
+        </w:tc>
+        <w:tc>
+          <w:tcPr>
+            <w:tcW w:type="dxa" w:w="2280"/>
+          </w:tcPr>
+          <w:p>
+            <w:r>
+              <w:rPr>
+                <w:rFonts w:ascii="Courier New" w:hAnsi="Courier New"/>
+                <w:b w:val="0"/>
+                <w:i w:val="0"/>
+                <w:sz w:val="20"/>
+              </w:rPr>
+              <w:t>19-17</w:t>
+            </w:r>
+          </w:p>
+        </w:tc>
+        <w:tc>
+          <w:tcPr>
+            <w:tcW w:type="dxa" w:w="2280"/>
+          </w:tcPr>
+          <w:p>
+            <w:r>
+              <w:rPr>
+                <w:rFonts w:ascii="Courier New" w:hAnsi="Courier New"/>
+                <w:b w:val="0"/>
+                <w:i w:val="0"/>
+                <w:sz w:val="20"/>
+              </w:rPr>
+              <w:t>3 bit</w:t>
+            </w:r>
+          </w:p>
+        </w:tc>
+        <w:tc>
+          <w:tcPr>
+            <w:tcW w:type="dxa" w:w="2280"/>
+          </w:tcPr>
+          <w:p>
+            <w:r>
+              <w:rPr>
+                <w:rFonts w:ascii="Courier New" w:hAnsi="Courier New"/>
+                <w:b w:val="0"/>
+                <w:i w:val="0"/>
+                <w:sz w:val="20"/>
+              </w:rPr>
+              <w:t>ALU ve AC mikro-islemleri (ADD, CLRAC, INCAC, ...)</w:t>
+            </w:r>
+          </w:p>
+        </w:tc>
+      </w:tr>
+      <w:tr>
+        <w:tc>
+          <w:tcPr>
+            <w:tcW w:type="dxa" w:w="2280"/>
+          </w:tcPr>
+          <w:p>
+            <w:r>
+              <w:rPr>
+                <w:rFonts w:ascii="Courier New" w:hAnsi="Courier New"/>
+                <w:b w:val="0"/>
+                <w:i w:val="0"/>
+                <w:sz w:val="20"/>
+              </w:rPr>
+              <w:t>F2</w:t>
+            </w:r>
+          </w:p>
+        </w:tc>
+        <w:tc>
+          <w:tcPr>
+            <w:tcW w:type="dxa" w:w="2280"/>
+          </w:tcPr>
+          <w:p>
+            <w:r>
+              <w:rPr>
+                <w:rFonts w:ascii="Courier New" w:hAnsi="Courier New"/>
+                <w:b w:val="0"/>
+                <w:i w:val="0"/>
+                <w:sz w:val="20"/>
+              </w:rPr>
+              <w:t>16-14</w:t>
+            </w:r>
+          </w:p>
+        </w:tc>
+        <w:tc>
+          <w:tcPr>
+            <w:tcW w:type="dxa" w:w="2280"/>
+          </w:tcPr>
+          <w:p>
+            <w:r>
+              <w:rPr>
+                <w:rFonts w:ascii="Courier New" w:hAnsi="Courier New"/>
+                <w:b w:val="0"/>
+                <w:i w:val="0"/>
+                <w:sz w:val="20"/>
+              </w:rPr>
+              <w:t>3 bit</w:t>
+            </w:r>
+          </w:p>
+        </w:tc>
+        <w:tc>
+          <w:tcPr>
+            <w:tcW w:type="dxa" w:w="2280"/>
+          </w:tcPr>
+          <w:p>
+            <w:r>
+              <w:rPr>
+                <w:rFonts w:ascii="Courier New" w:hAnsi="Courier New"/>
+                <w:b w:val="0"/>
+                <w:i w:val="0"/>
+                <w:sz w:val="20"/>
+              </w:rPr>
+              <w:t>Yazmac transferleri (MEMRD, MEMWR, INCPC, ...)</w:t>
+            </w:r>
+          </w:p>
+        </w:tc>
+      </w:tr>
+      <w:tr>
+        <w:tc>
+          <w:tcPr>
+            <w:tcW w:type="dxa" w:w="2280"/>
+          </w:tcPr>
+          <w:p>
+            <w:r>
+              <w:rPr>
+                <w:rFonts w:ascii="Courier New" w:hAnsi="Courier New"/>
+                <w:b w:val="0"/>
+                <w:i w:val="0"/>
+                <w:sz w:val="20"/>
+              </w:rPr>
+              <w:t>F3</w:t>
+            </w:r>
+          </w:p>
+        </w:tc>
+        <w:tc>
+          <w:tcPr>
+            <w:tcW w:type="dxa" w:w="2280"/>
+          </w:tcPr>
+          <w:p>
+            <w:r>
+              <w:rPr>
+                <w:rFonts w:ascii="Courier New" w:hAnsi="Courier New"/>
+                <w:b w:val="0"/>
+                <w:i w:val="0"/>
+                <w:sz w:val="20"/>
+              </w:rPr>
+              <w:t>13-11</w:t>
+            </w:r>
+          </w:p>
+        </w:tc>
+        <w:tc>
+          <w:tcPr>
+            <w:tcW w:type="dxa" w:w="2280"/>
+          </w:tcPr>
+          <w:p>
+            <w:r>
+              <w:rPr>
+                <w:rFonts w:ascii="Courier New" w:hAnsi="Courier New"/>
+                <w:b w:val="0"/>
+                <w:i w:val="0"/>
+                <w:sz w:val="20"/>
+              </w:rPr>
+              <w:t>3 bit</w:t>
+            </w:r>
+          </w:p>
+        </w:tc>
+        <w:tc>
+          <w:tcPr>
+            <w:tcW w:type="dxa" w:w="2280"/>
+          </w:tcPr>
+          <w:p>
+            <w:r>
+              <w:rPr>
+                <w:rFonts w:ascii="Courier New" w:hAnsi="Courier New"/>
+                <w:b w:val="0"/>
+                <w:i w:val="0"/>
+                <w:sz w:val="20"/>
+              </w:rPr>
+              <w:t>G/C ve flip-flop islemleri (COMAC, SHR, SHL, ...)</w:t>
+            </w:r>
+          </w:p>
+        </w:tc>
+      </w:tr>
+      <w:tr>
+        <w:tc>
+          <w:tcPr>
+            <w:tcW w:type="dxa" w:w="2280"/>
+          </w:tcPr>
+          <w:p>
+            <w:r>
+              <w:rPr>
+                <w:rFonts w:ascii="Courier New" w:hAnsi="Courier New"/>
+                <w:b w:val="0"/>
+                <w:i w:val="0"/>
+                <w:sz w:val="20"/>
+              </w:rPr>
+              <w:t>CD</w:t>
+            </w:r>
+          </w:p>
+        </w:tc>
+        <w:tc>
+          <w:tcPr>
+            <w:tcW w:type="dxa" w:w="2280"/>
+          </w:tcPr>
+          <w:p>
+            <w:r>
+              <w:rPr>
+                <w:rFonts w:ascii="Courier New" w:hAnsi="Courier New"/>
+                <w:b w:val="0"/>
+                <w:i w:val="0"/>
+                <w:sz w:val="20"/>
+              </w:rPr>
+              <w:t>10-9</w:t>
+            </w:r>
+          </w:p>
+        </w:tc>
+        <w:tc>
+          <w:tcPr>
+            <w:tcW w:type="dxa" w:w="2280"/>
+          </w:tcPr>
+          <w:p>
+            <w:r>
+              <w:rPr>
+                <w:rFonts w:ascii="Courier New" w:hAnsi="Courier New"/>
+                <w:b w:val="0"/>
+                <w:i w:val="0"/>
+                <w:sz w:val="20"/>
+              </w:rPr>
+              <w:t>2 bit</w:t>
+            </w:r>
+          </w:p>
+        </w:tc>
+        <w:tc>
+          <w:tcPr>
+            <w:tcW w:type="dxa" w:w="2280"/>
+          </w:tcPr>
+          <w:p>
+            <w:r>
+              <w:rPr>
+                <w:rFonts w:ascii="Courier New" w:hAnsi="Courier New"/>
+                <w:b w:val="0"/>
+                <w:i w:val="0"/>
+                <w:sz w:val="20"/>
+              </w:rPr>
+              <w:t>Dallanma kosulu (kosulsuz / IR[15] / AC[15] / E)</w:t>
+            </w:r>
+          </w:p>
+        </w:tc>
+      </w:tr>
+      <w:tr>
+        <w:tc>
+          <w:tcPr>
+            <w:tcW w:type="dxa" w:w="2280"/>
+          </w:tcPr>
+          <w:p>
+            <w:r>
+              <w:rPr>
+                <w:rFonts w:ascii="Courier New" w:hAnsi="Courier New"/>
+                <w:b w:val="0"/>
+                <w:i w:val="0"/>
+                <w:sz w:val="20"/>
+              </w:rPr>
+              <w:t>BR</w:t>
+            </w:r>
+          </w:p>
+        </w:tc>
+        <w:tc>
+          <w:tcPr>
+            <w:tcW w:type="dxa" w:w="2280"/>
+          </w:tcPr>
+          <w:p>
+            <w:r>
+              <w:rPr>
+                <w:rFonts w:ascii="Courier New" w:hAnsi="Courier New"/>
+                <w:b w:val="0"/>
+                <w:i w:val="0"/>
+                <w:sz w:val="20"/>
+              </w:rPr>
+              <w:t>8-7</w:t>
+            </w:r>
+          </w:p>
+        </w:tc>
+        <w:tc>
+          <w:tcPr>
+            <w:tcW w:type="dxa" w:w="2280"/>
+          </w:tcPr>
+          <w:p>
+            <w:r>
+              <w:rPr>
+                <w:rFonts w:ascii="Courier New" w:hAnsi="Courier New"/>
+                <w:b w:val="0"/>
+                <w:i w:val="0"/>
+                <w:sz w:val="20"/>
+              </w:rPr>
+              <w:t>2 bit</w:t>
+            </w:r>
+          </w:p>
+        </w:tc>
+        <w:tc>
+          <w:tcPr>
+            <w:tcW w:type="dxa" w:w="2280"/>
+          </w:tcPr>
+          <w:p>
+            <w:r>
+              <w:rPr>
+                <w:rFonts w:ascii="Courier New" w:hAnsi="Courier New"/>
+                <w:b w:val="0"/>
+                <w:i w:val="0"/>
+                <w:sz w:val="20"/>
+              </w:rPr>
+              <w:t>Dallanma tipi (JMP / CALL / RET / MAP)</w:t>
+            </w:r>
+          </w:p>
+        </w:tc>
+      </w:tr>
+      <w:tr>
+        <w:tc>
+          <w:tcPr>
+            <w:tcW w:type="dxa" w:w="2280"/>
+          </w:tcPr>
+          <w:p>
+            <w:r>
+              <w:rPr>
+                <w:rFonts w:ascii="Courier New" w:hAnsi="Courier New"/>
+                <w:b w:val="0"/>
+                <w:i w:val="0"/>
+                <w:sz w:val="20"/>
+              </w:rPr>
+              <w:t>AD</w:t>
+            </w:r>
+          </w:p>
+        </w:tc>
+        <w:tc>
+          <w:tcPr>
+            <w:tcW w:type="dxa" w:w="2280"/>
+          </w:tcPr>
+          <w:p>
+            <w:r>
+              <w:rPr>
+                <w:rFonts w:ascii="Courier New" w:hAnsi="Courier New"/>
+                <w:b w:val="0"/>
+                <w:i w:val="0"/>
+                <w:sz w:val="20"/>
+              </w:rPr>
+              <w:t>6-0</w:t>
+            </w:r>
+          </w:p>
+        </w:tc>
+        <w:tc>
+          <w:tcPr>
+            <w:tcW w:type="dxa" w:w="2280"/>
+          </w:tcPr>
+          <w:p>
+            <w:r>
+              <w:rPr>
+                <w:rFonts w:ascii="Courier New" w:hAnsi="Courier New"/>
+                <w:b w:val="0"/>
+                <w:i w:val="0"/>
+                <w:sz w:val="20"/>
+              </w:rPr>
+              <w:t>7 bit</w:t>
+            </w:r>
+          </w:p>
+        </w:tc>
+        <w:tc>
+          <w:tcPr>
+            <w:tcW w:type="dxa" w:w="2280"/>
+          </w:tcPr>
+          <w:p>
+            <w:r>
+              <w:rPr>
+                <w:rFonts w:ascii="Courier New" w:hAnsi="Courier New"/>
+                <w:b w:val="0"/>
+                <w:i w:val="0"/>
+                <w:sz w:val="20"/>
+              </w:rPr>
+              <w:t>Hedef adres (128 konum icin)</w:t>
+            </w:r>
+          </w:p>
+        </w:tc>
+      </w:tr>
+    </w:tbl>
+    <w:p>
+      <w:pPr>
+        <w:spacing w:before="40" w:after="200"/>
+        <w:jc w:val="center"/>
+      </w:pPr>
+      <w:r>
+        <w:rPr>
+          <w:rFonts w:ascii="Courier New" w:hAnsi="Courier New"/>
+          <w:b w:val="0"/>
+          <w:i/>
+          <w:sz w:val="18"/>
+        </w:rPr>
+        <w:t>Tablo 3.2. 20-Bitlik Mikrokomut Formati</w:t>
       </w:r>
     </w:p>
     <w:p>
@@ -1410,9 +2211,82 @@
         <w:rPr>
           <w:rFonts w:ascii="Courier New" w:hAnsi="Courier New"/>
           <w:b w:val="0"/>
+          <w:i w:val="0"/>
           <w:sz w:val="20"/>
         </w:rPr>
-        <w:t>Komut yürütme döngüsü üç aşamadan oluşur. Getirme (fetch) aşamasında, PC'nin gösterdiği bellekten komut okunarak IR'ye yüklenir ve PC artırılır. Çözümleme (decode) aşamasında, MAP işlemiyle IR içeriği CAR'a aktarılarak ilgili komutun mikroprogram bloğuna atlama gerçekleştirilir. Yürütme (execute) aşamasında ise komuta özgü mikro-işlemler sırayla uygulanır ve döngü yeniden fetch aşamasına dönerek devam eder. Tüm Mano komutları bu mekanizma aracılığıyla kontrol belleğindeki mikrokomutlar aracılığıyla gerçeklenmektedir. (PÇ5)</w:t>
+        <w:t>Komut yurutme dongusu, mikroprogramlanmis yaklasimda da uc asama olarak tanimlansa da her asama artik donanissal lojik yerine kontrol bellegindeki mikrokomutlar tarafindan yurutulmektedir. Getirme asamas (fetch) 0x00 adresinden baslayan bes mikrokomut adimini kapsar ve tum makine komutlari icin ortaktir:</w:t>
+      </w:r>
+    </w:p>
+    <w:p>
+      <w:pPr>
+        <w:spacing w:after="40" w:before="40"/>
+        <w:ind w:left="850"/>
+        <w:jc w:val="left"/>
+      </w:pPr>
+      <w:r>
+        <w:rPr>
+          <w:rFonts w:ascii="Courier New" w:hAnsi="Courier New"/>
+          <w:b/>
+          <w:i w:val="0"/>
+          <w:sz w:val="20"/>
+        </w:rPr>
+        <w:t>0x00:  AR &lt;- PC          (F1=PCTAR,  BR=JMP,  AD=0x01)</w:t>
+        <w:br/>
+      </w:r>
+      <w:r>
+        <w:rPr>
+          <w:rFonts w:ascii="Courier New" w:hAnsi="Courier New"/>
+          <w:b/>
+          <w:i w:val="0"/>
+          <w:sz w:val="20"/>
+        </w:rPr>
+        <w:t>0x01:  DR &lt;- M[AR]       (F2=MEMRD,  BR=JMP,  AD=0x02)</w:t>
+        <w:br/>
+      </w:r>
+      <w:r>
+        <w:rPr>
+          <w:rFonts w:ascii="Courier New" w:hAnsi="Courier New"/>
+          <w:b/>
+          <w:i w:val="0"/>
+          <w:sz w:val="20"/>
+        </w:rPr>
+        <w:t>0x02:  PC &lt;- PC + 1      (F2=INCPC,  BR=JMP,  AD=0x03)</w:t>
+        <w:br/>
+      </w:r>
+      <w:r>
+        <w:rPr>
+          <w:rFonts w:ascii="Courier New" w:hAnsi="Courier New"/>
+          <w:b/>
+          <w:i w:val="0"/>
+          <w:sz w:val="20"/>
+        </w:rPr>
+        <w:t>0x03:  IR &lt;- DR          (F2=DRTIR,  BR=JMP,  AD=0x04)</w:t>
+        <w:br/>
+      </w:r>
+      <w:r>
+        <w:rPr>
+          <w:rFonts w:ascii="Courier New" w:hAnsi="Courier New"/>
+          <w:b/>
+          <w:i w:val="0"/>
+          <w:sz w:val="20"/>
+        </w:rPr>
+        <w:t>0x04:  Decode &amp; Dispatch (BR=MAP  -&gt; CAR &lt;- IR[14:11] &amp; '000')</w:t>
+        <w:br/>
+      </w:r>
+    </w:p>
+    <w:p>
+      <w:pPr>
+        <w:spacing w:before="40" w:after="200"/>
+        <w:jc w:val="center"/>
+      </w:pPr>
+      <w:r>
+        <w:rPr>
+          <w:rFonts w:ascii="Courier New" w:hAnsi="Courier New"/>
+          <w:b w:val="0"/>
+          <w:i/>
+          <w:sz w:val="18"/>
+        </w:rPr>
+        <w:t>Sekil 3.4. Fetch Dongusu Mikroprogram Adimlari</w:t>
       </w:r>
     </w:p>
     <w:p>
@@ -1424,9 +2298,40 @@
         <w:rPr>
           <w:rFonts w:ascii="Courier New" w:hAnsi="Courier New"/>
           <w:b w:val="0"/>
+          <w:i w:val="0"/>
           <w:sz w:val="20"/>
         </w:rPr>
-        <w:t>Mikroprogramlanmış kontrol ile hardwired kontrol arasındaki temel karşılaştırma Tablo 3.2'de verilmektedir. Mikroprogramlanmış yaklaşımın esneklik ve tasarım kolaylığı bakımından belirgin avantaj sağladığı, buna karşın ekstra bellek okuma gecikmeleri nedeniyle hardwired kontrole kıyasla daha yavaş çalışabildiği görülmektedir. (PÇ5)</w:t>
+        <w:t>MAP islemi, IR'nin 14. ile 11. bitleri arasindaki 4-bitlik komut kodunu CAR'a yukleyerek (CAR &lt;- IR[14:11] &amp; '000') her komutun kontrol bellegindeki kendi mikroprogram bloguna otomatik olarak yonlendirilmesini saglar. Bu mekanizma sayesinde tasarimci, her komut icin 8 mikrokomut konumuna kadar kullanabilecegi bir yurutme blogu elde etmektedir. (PC5)</w:t>
+      </w:r>
+    </w:p>
+    <w:p>
+      <w:pPr>
+        <w:spacing w:before="0" w:after="120"/>
+        <w:jc w:val="both"/>
+      </w:pPr>
+      <w:r>
+        <w:rPr>
+          <w:rFonts w:ascii="Courier New" w:hAnsi="Courier New"/>
+          <w:b w:val="0"/>
+          <w:i w:val="0"/>
+          <w:sz w:val="20"/>
+        </w:rPr>
+        <w:t>Dolayli adresleme subroutine'i ise 0x78 adresinde konumlandirilmis olup IR[15] = 1 oldugunda CALL komutuyla cagrilir, SBR'a bir sonraki adres kaydedilir ve M[AR]'dan gercek efektif adres cozumlendikten sonra RET komutuyla arayana geri donulur. Bu subroutine mekanizmasi, tum bellek referansli komutlarin ayni dolayli adresleme kodunu paylasmasina olanak taniymakta ve mikroprogram belleginin verimli kullanilmasini desteklemektedir. (PC1, PC5)</w:t>
+      </w:r>
+    </w:p>
+    <w:p>
+      <w:pPr>
+        <w:spacing w:before="0" w:after="120"/>
+        <w:jc w:val="both"/>
+      </w:pPr>
+      <w:r>
+        <w:rPr>
+          <w:rFonts w:ascii="Courier New" w:hAnsi="Courier New"/>
+          <w:b w:val="0"/>
+          <w:i w:val="0"/>
+          <w:sz w:val="20"/>
+        </w:rPr>
+        <w:t>Yatay mikroprogramlama (horizontal microprogramming) anlayisiyla tasarlanan bu formatta, bir mikrokomut icinde F1, F2 ve F3 alanlari eS zamanli aktif olabilmekte; ornegin ayni anda hem bellek okuma (F2) hem de PC arttirma (F2) islemleri birlikte kodlanabilmektedir. Bu yaklasim, komut basina gereekli mikrokomut sayisini azaltarak sistemin komut islem hizini (throughput) artirmaktadir. Diger yaklasim olan dikey mikroprogramlamada (vertical microprogramming) ise her mikrokomut tek bir mikro-islemi kodlar ve daha dar bit genisligi kullanilir; ancak bu durumda daha fazla mikrokomut adimi gerekmekte ve kontrol belleginin derinligi artmaktadir. Bu tasarimda yatay yaklasim benimsenmesinin temel gerekccesi, Mano komut setinin gorece sade yapisi nedeniyle genislik artisinin kabul edilebilir duzeyde kalmasidir. (PC1, PC5)</w:t>
       </w:r>
     </w:p>
     <w:tbl>
@@ -1450,9 +2355,10 @@
               <w:rPr>
                 <w:rFonts w:ascii="Courier New" w:hAnsi="Courier New"/>
                 <w:b/>
+                <w:i w:val="0"/>
                 <w:sz w:val="20"/>
               </w:rPr>
-              <w:t>Özellik</w:t>
+              <w:t>Ozellik</w:t>
             </w:r>
           </w:p>
         </w:tc>
@@ -1465,6 +2371,7 @@
               <w:rPr>
                 <w:rFonts w:ascii="Courier New" w:hAnsi="Courier New"/>
                 <w:b/>
+                <w:i w:val="0"/>
                 <w:sz w:val="20"/>
               </w:rPr>
               <w:t>Hardwired</w:t>
@@ -1480,9 +2387,10 @@
               <w:rPr>
                 <w:rFonts w:ascii="Courier New" w:hAnsi="Courier New"/>
                 <w:b/>
+                <w:i w:val="0"/>
                 <w:sz w:val="20"/>
               </w:rPr>
-              <w:t>Mikroprogramlanmış</w:t>
+              <w:t>Mikroprogramlanmis</w:t>
             </w:r>
           </w:p>
         </w:tc>
@@ -1497,9 +2405,10 @@
               <w:rPr>
                 <w:rFonts w:ascii="Courier New" w:hAnsi="Courier New"/>
                 <w:b w:val="0"/>
+                <w:i w:val="0"/>
                 <w:sz w:val="20"/>
               </w:rPr>
-              <w:t>Hız</w:t>
+              <w:t>Kontrol sinyali uretimi</w:t>
             </w:r>
           </w:p>
         </w:tc>
@@ -1512,9 +2421,10 @@
               <w:rPr>
                 <w:rFonts w:ascii="Courier New" w:hAnsi="Courier New"/>
                 <w:b w:val="0"/>
+                <w:i w:val="0"/>
                 <w:sz w:val="20"/>
               </w:rPr>
-              <w:t>Yüksek</w:t>
+              <w:t>Kombinasyonel lojik kapilar</w:t>
             </w:r>
           </w:p>
         </w:tc>
@@ -1527,9 +2437,10 @@
               <w:rPr>
                 <w:rFonts w:ascii="Courier New" w:hAnsi="Courier New"/>
                 <w:b w:val="0"/>
+                <w:i w:val="0"/>
                 <w:sz w:val="20"/>
               </w:rPr>
-              <w:t>Orta</w:t>
+              <w:t>Kontrol bellegindeki mikrokomutlar</w:t>
             </w:r>
           </w:p>
         </w:tc>
@@ -1544,9 +2455,10 @@
               <w:rPr>
                 <w:rFonts w:ascii="Courier New" w:hAnsi="Courier New"/>
                 <w:b w:val="0"/>
+                <w:i w:val="0"/>
                 <w:sz w:val="20"/>
               </w:rPr>
-              <w:t>Tasarım karmaşıklığı</w:t>
+              <w:t>Hiz</w:t>
             </w:r>
           </w:p>
         </w:tc>
@@ -1559,9 +2471,10 @@
               <w:rPr>
                 <w:rFonts w:ascii="Courier New" w:hAnsi="Courier New"/>
                 <w:b w:val="0"/>
+                <w:i w:val="0"/>
                 <w:sz w:val="20"/>
               </w:rPr>
-              <w:t>Yüksek (büyük komut setinde)</w:t>
+              <w:t>Yuksek (min. saat darbesi)</w:t>
             </w:r>
           </w:p>
         </w:tc>
@@ -1574,9 +2487,10 @@
               <w:rPr>
                 <w:rFonts w:ascii="Courier New" w:hAnsi="Courier New"/>
                 <w:b w:val="0"/>
+                <w:i w:val="0"/>
                 <w:sz w:val="20"/>
               </w:rPr>
-              <w:t>Düşük</w:t>
+              <w:t>Orta (bellek gecikme suresi var)</w:t>
             </w:r>
           </w:p>
         </w:tc>
@@ -1591,6 +2505,57 @@
               <w:rPr>
                 <w:rFonts w:ascii="Courier New" w:hAnsi="Courier New"/>
                 <w:b w:val="0"/>
+                <w:i w:val="0"/>
+                <w:sz w:val="20"/>
+              </w:rPr>
+              <w:t>Tasarim karmasikligi</w:t>
+            </w:r>
+          </w:p>
+        </w:tc>
+        <w:tc>
+          <w:tcPr>
+            <w:tcW w:type="dxa" w:w="3041"/>
+          </w:tcPr>
+          <w:p>
+            <w:r>
+              <w:rPr>
+                <w:rFonts w:ascii="Courier New" w:hAnsi="Courier New"/>
+                <w:b w:val="0"/>
+                <w:i w:val="0"/>
+                <w:sz w:val="20"/>
+              </w:rPr>
+              <w:t>Buyuk komut setinde cok yuksek</w:t>
+            </w:r>
+          </w:p>
+        </w:tc>
+        <w:tc>
+          <w:tcPr>
+            <w:tcW w:type="dxa" w:w="3041"/>
+          </w:tcPr>
+          <w:p>
+            <w:r>
+              <w:rPr>
+                <w:rFonts w:ascii="Courier New" w:hAnsi="Courier New"/>
+                <w:b w:val="0"/>
+                <w:i w:val="0"/>
+                <w:sz w:val="20"/>
+              </w:rPr>
+              <w:t>Gorece dusuk, modular</w:t>
+            </w:r>
+          </w:p>
+        </w:tc>
+      </w:tr>
+      <w:tr>
+        <w:tc>
+          <w:tcPr>
+            <w:tcW w:type="dxa" w:w="3041"/>
+          </w:tcPr>
+          <w:p>
+            <w:r>
+              <w:rPr>
+                <w:rFonts w:ascii="Courier New" w:hAnsi="Courier New"/>
+                <w:b w:val="0"/>
+                <w:i w:val="0"/>
                 <w:sz w:val="20"/>
               </w:rPr>
               <w:t>Esneklik</w:t>
@@ -1606,9 +2571,10 @@
               <w:rPr>
                 <w:rFonts w:ascii="Courier New" w:hAnsi="Courier New"/>
                 <w:b w:val="0"/>
+                <w:i w:val="0"/>
                 <w:sz w:val="20"/>
               </w:rPr>
-              <w:t>Düşük</w:t>
+              <w:t>Dusuk (donanim degisimi gerekir)</w:t>
             </w:r>
           </w:p>
         </w:tc>
@@ -1621,9 +2587,10 @@
               <w:rPr>
                 <w:rFonts w:ascii="Courier New" w:hAnsi="Courier New"/>
                 <w:b w:val="0"/>
+                <w:i w:val="0"/>
                 <w:sz w:val="20"/>
               </w:rPr>
-              <w:t>Yüksek</w:t>
+              <w:t>Yuksek (ROM guncelleme yeterli)</w:t>
             </w:r>
           </w:p>
         </w:tc>
@@ -1638,9 +2605,10 @@
               <w:rPr>
                 <w:rFonts w:ascii="Courier New" w:hAnsi="Courier New"/>
                 <w:b w:val="0"/>
+                <w:i w:val="0"/>
                 <w:sz w:val="20"/>
               </w:rPr>
-              <w:t>Komut seti güncelleme</w:t>
+              <w:t>Komut seti guncelleme</w:t>
             </w:r>
           </w:p>
         </w:tc>
@@ -1653,9 +2621,10 @@
               <w:rPr>
                 <w:rFonts w:ascii="Courier New" w:hAnsi="Courier New"/>
                 <w:b w:val="0"/>
+                <w:i w:val="0"/>
                 <w:sz w:val="20"/>
               </w:rPr>
-              <w:t>Donanım yeniden tasarımı</w:t>
+              <w:t>Donanim yeniden tasarimi</w:t>
             </w:r>
           </w:p>
         </w:tc>
@@ -1668,9 +2637,10 @@
               <w:rPr>
                 <w:rFonts w:ascii="Courier New" w:hAnsi="Courier New"/>
                 <w:b w:val="0"/>
+                <w:i w:val="0"/>
                 <w:sz w:val="20"/>
               </w:rPr>
-              <w:t>Bellek içeriği güncelleme</w:t>
+              <w:t>Bellek icerigi guncelleme</w:t>
             </w:r>
           </w:p>
         </w:tc>
@@ -1685,9 +2655,10 @@
               <w:rPr>
                 <w:rFonts w:ascii="Courier New" w:hAnsi="Courier New"/>
                 <w:b w:val="0"/>
+                <w:i w:val="0"/>
                 <w:sz w:val="20"/>
               </w:rPr>
-              <w:t>Uygulama alanı</w:t>
+              <w:t>Tipik kullanim alani</w:t>
             </w:r>
           </w:p>
         </w:tc>
@@ -1700,9 +2671,10 @@
               <w:rPr>
                 <w:rFonts w:ascii="Courier New" w:hAnsi="Courier New"/>
                 <w:b w:val="0"/>
+                <w:i w:val="0"/>
                 <w:sz w:val="20"/>
               </w:rPr>
-              <w:t>RISC, yüksek hızlı</w:t>
+              <w:t>RISC, yuksek performansli</w:t>
             </w:r>
           </w:p>
         </w:tc>
@@ -1715,9 +2687,10 @@
               <w:rPr>
                 <w:rFonts w:ascii="Courier New" w:hAnsi="Courier New"/>
                 <w:b w:val="0"/>
+                <w:i w:val="0"/>
                 <w:sz w:val="20"/>
               </w:rPr>
-              <w:t>CISC, eğitim</w:t>
+              <w:t>CISC, esnek mimari, egitim</w:t>
             </w:r>
           </w:p>
         </w:tc>
@@ -1725,15 +2698,17 @@
     </w:tbl>
     <w:p>
       <w:pPr>
-        <w:spacing w:after="160"/>
+        <w:spacing w:before="40" w:after="200"/>
+        <w:jc w:val="center"/>
       </w:pPr>
       <w:r>
         <w:rPr>
           <w:rFonts w:ascii="Courier New" w:hAnsi="Courier New"/>
+          <w:b w:val="0"/>
           <w:i/>
           <w:sz w:val="18"/>
         </w:rPr>
-        <w:t>Tablo 3.2. Hardwired ve Mikroprogramlanmış Kontrol Karşılaştırması</w:t>
+        <w:t>Tablo 3.3. Hardwired ve Mikroprogramlanmis Kontrol Karsilastirmasi</w:t>
       </w:r>
     </w:p>
     <w:p>
@@ -1750,6 +2725,7 @@
         <w:rPr>
           <w:rFonts w:ascii="Courier New" w:hAnsi="Courier New"/>
           <w:b/>
+          <w:i w:val="0"/>
           <w:sz w:val="24"/>
         </w:rPr>
         <w:t>4. TASARIM</w:t>
@@ -1764,9 +2740,10 @@
         <w:rPr>
           <w:rFonts w:ascii="Courier New" w:hAnsi="Courier New"/>
           <w:b/>
+          <w:i w:val="0"/>
           <w:sz w:val="20"/>
         </w:rPr>
-        <w:t>4.1. Veri Yolu Tasarımı</w:t>
+        <w:t>4.1. Veri Yolu Tasarimi</w:t>
       </w:r>
     </w:p>
     <w:p>
@@ -1777,11 +2754,12 @@
       <w:r>
         <w:rPr>
           <w:rFonts w:ascii="Courier New" w:hAnsi="Courier New"/>
+          <w:b w:val="0"/>
           <w:i/>
-          <w:color w:val="AA0000"/>
+          <w:color w:val="CC0000"/>
           <w:sz w:val="20"/>
         </w:rPr>
-        <w:t>[NOT: Bu alt bölüm Kişi 2 tarafından yazılacaktır. Tasarladığınız modüllerin port listelerini, blok diyagramını ve tasarım kararlarını ekleyin.]</w:t>
+        <w:t>[NOT — TESLIMDEN ONCE SILIN: Bu alt bolum Kisi 2 tarafindan yazilacaktir. Port listesi, blok diyagram ve tasarim kararlari eklenecek.]</w:t>
       </w:r>
     </w:p>
     <w:p>
@@ -1793,9 +2771,57 @@
         <w:rPr>
           <w:rFonts w:ascii="Courier New" w:hAnsi="Courier New"/>
           <w:b w:val="0"/>
+          <w:i w:val="0"/>
           <w:sz w:val="20"/>
         </w:rPr>
-        <w:t>Veri yolu tasarımı, Tablo 3.1'de listelenen yazmaçları, ALU birimini, 4096 × 16 bitlik RAM belleğini ve ortak veri yolunu kapsamaktadır. Her yazmaç modülü senkron yükleme (load), artırma (inc) ve sıfırlama (clr) sinyalleriyle kontrol biriminden yönetilmektedir. ALU, toplama (ADD), mantıksal AND, tümleyen (COM), sağa/sola kaydırma (SHR/SHL) ve artırma (INC) işlemlerini 3 bitlik işlem kodu (op) üzerinden gerçekleştirmektedir. (PÇ1)</w:t>
+        <w:t>Veri yolu tasarimi, Tablo 3.1'de listelenen tum yazmaclari, ALU birimini, 4096 x 16-bitlik RAM bellegini ve ortak veri yolunu kapsamaktadir. Her yazmac modulu senkron yukle (load), artir (inc) ve sifirla (clr) sinyalleriyle kontrol biriminden yonetilmektedir. ALU, F1 alan kodlarina gore ADD, AND, COM, SHR, SHL ve INC islemlerini gerceklestirmekte; tasima sonucu E bitine aktarilmaktadir. (PC1)</w:t>
+      </w:r>
+    </w:p>
+    <w:p>
+      <w:pPr>
+        <w:spacing w:before="0" w:after="120"/>
+        <w:jc w:val="left"/>
+      </w:pPr>
+      <w:r>
+        <w:rPr>
+          <w:rFonts w:ascii="Courier New" w:hAnsi="Courier New"/>
+          <w:b w:val="0"/>
+          <w:i/>
+          <w:color w:val="CC0000"/>
+          <w:sz w:val="20"/>
+        </w:rPr>
+        <w:t>[NOT — TESLIMDEN ONCE SILIN: Veri yolu blok diyagramini buraya sekil olarak ekleyin. Ortak veri yolu kaynakları ve secim sinyallerini gosterin.]</w:t>
+      </w:r>
+    </w:p>
+    <w:p>
+      <w:pPr>
+        <w:spacing w:before="160" w:after="80"/>
+        <w:jc w:val="left"/>
+      </w:pPr>
+      <w:r>
+        <w:rPr>
+          <w:rFonts w:ascii="Courier New" w:hAnsi="Courier New"/>
+          <w:b/>
+          <w:i w:val="0"/>
+          <w:sz w:val="20"/>
+        </w:rPr>
+        <w:t>4.2. Mikrokomut Formati</w:t>
+      </w:r>
+    </w:p>
+    <w:p>
+      <w:pPr>
+        <w:spacing w:before="0" w:after="120"/>
+        <w:jc w:val="left"/>
+      </w:pPr>
+      <w:r>
+        <w:rPr>
+          <w:rFonts w:ascii="Courier New" w:hAnsi="Courier New"/>
+          <w:b w:val="0"/>
+          <w:i/>
+          <w:color w:val="CC0000"/>
+          <w:sz w:val="20"/>
+        </w:rPr>
+        <w:t>[NOT — TESLIMDEN ONCE SILIN: Bu alt bolum Kisi 3 tarafindan yazilacaktir. F1, F2, F3 kodlama tablolari buraya eklenecek.]</w:t>
       </w:r>
     </w:p>
     <w:p>
@@ -1807,24 +2833,10 @@
         <w:rPr>
           <w:rFonts w:ascii="Courier New" w:hAnsi="Courier New"/>
           <w:b w:val="0"/>
+          <w:i w:val="0"/>
           <w:sz w:val="20"/>
         </w:rPr>
-        <w:t>Ortak veri yolu, 3 bitlik seçim sinyali (S2, S1, S0) ile sekiz farklı kaynaktan birinin 16 bitlik çıkışını aktif hale getiren bir çoklayıcı (multiplexer) yapısına sahiptir. 12 bitlik AR ve PC yazmaçları veri yoluna bağlanırken üst 4 bite sıfır doldurularak 16 bite genişletilmektedir. (PÇ1, PÇ5)</w:t>
-      </w:r>
-    </w:p>
-    <w:p>
-      <w:pPr>
-        <w:spacing w:before="0" w:after="120"/>
-        <w:jc w:val="left"/>
-      </w:pPr>
-      <w:r>
-        <w:rPr>
-          <w:rFonts w:ascii="Courier New" w:hAnsi="Courier New"/>
-          <w:i/>
-          <w:color w:val="AA0000"/>
-          <w:sz w:val="20"/>
-        </w:rPr>
-        <w:t>[NOT: Buraya veri yolu blok diyagramını şekil olarak ekleyin.]</w:t>
+        <w:t>Bolum 3.3'te tanimlanan 20-bitlik mikrokomut formati, tasarimda dogrudan benimsenmistir. F1, F2 ve F3 alanlari icin tam kodlama tablosu Bolum 4.2'de Kisi 3 tarafindan sunulmaktadir. Paralel mikro-islem destegi, tek bir saat darbesinde hem veri transferi hem de PC arttirmanin gerceklestirilebilmesine olanak taniymaktadir. (PC1, PC5)</w:t>
       </w:r>
     </w:p>
     <w:p>
@@ -1836,9 +2848,10 @@
         <w:rPr>
           <w:rFonts w:ascii="Courier New" w:hAnsi="Courier New"/>
           <w:b/>
+          <w:i w:val="0"/>
           <w:sz w:val="20"/>
         </w:rPr>
-        <w:t>4.2. Mikrokomut Formatı</w:t>
+        <w:t>4.3. Kontrol Bellegi ve Mikroprogram</w:t>
       </w:r>
     </w:p>
     <w:p>
@@ -1849,11 +2862,12 @@
       <w:r>
         <w:rPr>
           <w:rFonts w:ascii="Courier New" w:hAnsi="Courier New"/>
+          <w:b w:val="0"/>
           <w:i/>
-          <w:color w:val="AA0000"/>
+          <w:color w:val="CC0000"/>
           <w:sz w:val="20"/>
         </w:rPr>
-        <w:t>[NOT: Bu alt bölüm Kişi 3 tarafından yazılacaktır. Tasarladığınız format tablosunu ve kodlama kararlarınızı ekleyin.]</w:t>
+        <w:t>[NOT — TESLIMDEN ONCE SILIN: Bu alt bolum Kisi 3 tarafindan yazilacaktir. Fetch dongusu ve en az 3 komut icin mikroprogram tablosu eklenecek.]</w:t>
       </w:r>
     </w:p>
     <w:p>
@@ -1865,24 +2879,10 @@
         <w:rPr>
           <w:rFonts w:ascii="Courier New" w:hAnsi="Courier New"/>
           <w:b w:val="0"/>
+          <w:i w:val="0"/>
           <w:sz w:val="20"/>
         </w:rPr>
-        <w:t>Bu tasarımda benimsenen 20 bitlik mikrokomut formatı Bölüm 3.3'te tanıtılmıştır. F1, F2 ve F3 alanlarının her biri 3 bit olup toplamda 7'şer farklı mikro-işlem kodlanabilmektedir. Bir mikrokomut içinde aynı anda F1, F2 ve F3 alanlarından biri aktif olabilir; bu yapı yatay mikrokomut (horizontal microinstruction) olarak sınıflandırılır ve birden fazla mikro-işlemin paralel yürütülmesine olanak tanır. (PÇ1)</w:t>
-      </w:r>
-    </w:p>
-    <w:p>
-      <w:pPr>
-        <w:spacing w:before="0" w:after="120"/>
-        <w:jc w:val="left"/>
-      </w:pPr>
-      <w:r>
-        <w:rPr>
-          <w:rFonts w:ascii="Courier New" w:hAnsi="Courier New"/>
-          <w:i/>
-          <w:color w:val="AA0000"/>
-          <w:sz w:val="20"/>
-        </w:rPr>
-        <w:t>[NOT: F1, F2, F3 kodlama tablolarını buraya ekleyin.]</w:t>
+        <w:t>Kontrol bellegi, VHDL'de 128 elemanli bir sabit (constant) dizi olarak tanimlanmis ve FPGA sentezinde LUT ya da BRAM kaynaklari kullanilarak gerceklenmistir. Fetch dongusu 0x00-0x04 adreslerini kapsamakta olup tum komutlar icin ortaktir. Her komutun yurutme blogu, MAP isleminin hesapladigi adrese gore konumlandirilmistir. (PC5)</w:t>
       </w:r>
     </w:p>
     <w:p>
@@ -1894,24 +2894,10 @@
         <w:rPr>
           <w:rFonts w:ascii="Courier New" w:hAnsi="Courier New"/>
           <w:b/>
+          <w:i w:val="0"/>
           <w:sz w:val="20"/>
         </w:rPr>
-        <w:t>4.3. Kontrol Belleği ve Mikroprogram</w:t>
-      </w:r>
-    </w:p>
-    <w:p>
-      <w:pPr>
-        <w:spacing w:before="0" w:after="120"/>
-        <w:jc w:val="left"/>
-      </w:pPr>
-      <w:r>
-        <w:rPr>
-          <w:rFonts w:ascii="Courier New" w:hAnsi="Courier New"/>
-          <w:i/>
-          <w:color w:val="AA0000"/>
-          <w:sz w:val="20"/>
-        </w:rPr>
-        <w:t>[NOT: Bu alt bölüm Kişi 3 tarafından yazılacaktır. Mikroprogram tablonuzu ve fetch/execute akış diyagramını ekleyin.]</w:t>
+        <w:t>4.4. Performans Kriterleri ve Sinirlamalar</w:t>
       </w:r>
     </w:p>
     <w:p>
@@ -1923,38 +2909,10 @@
         <w:rPr>
           <w:rFonts w:ascii="Courier New" w:hAnsi="Courier New"/>
           <w:b w:val="0"/>
+          <w:i w:val="0"/>
           <w:sz w:val="20"/>
         </w:rPr>
-        <w:t>Kontrol belleği, VHDL'de sabit (constant) bir dizi olarak tanımlanmış ve FPGA sentezi sırasında LUT ya da BRAM kaynakları kullanılarak gerçeklenmiştir. Fetch döngüsü 0x00 adresinden başlamakta olup dört mikrokomut adımından oluşmaktadır: AR ← PC, DR ← M[AR], PC ← PC+1 ve IR ← DR. Beşinci adımda MAP işlemiyle CAR, IR[14:11] &amp; '000' değerine yüklenerek ilgili komutun mikroprogram bloğuna yönlendirilmektedir. (PÇ5)</w:t>
-      </w:r>
-    </w:p>
-    <w:p>
-      <w:pPr>
-        <w:spacing w:before="0" w:after="120"/>
-        <w:jc w:val="left"/>
-      </w:pPr>
-      <w:r>
-        <w:rPr>
-          <w:rFonts w:ascii="Courier New" w:hAnsi="Courier New"/>
-          <w:i/>
-          <w:color w:val="AA0000"/>
-          <w:sz w:val="20"/>
-        </w:rPr>
-        <w:t>[NOT: Fetch döngüsü mikroprogram tablosunu ve en az 2-3 komut için execute mikroprogram adımlarını buraya ekleyin.]</w:t>
-      </w:r>
-    </w:p>
-    <w:p>
-      <w:pPr>
-        <w:spacing w:before="160" w:after="80"/>
-        <w:jc w:val="left"/>
-      </w:pPr>
-      <w:r>
-        <w:rPr>
-          <w:rFonts w:ascii="Courier New" w:hAnsi="Courier New"/>
-          <w:b/>
-          <w:sz w:val="20"/>
-        </w:rPr>
-        <w:t>4.4. Performans Kriterleri ve Sınırlamalar</w:t>
+        <w:t>Tasarlanan mikroprogramlanmis kontrol birimi, bir makine komutunu ortalama 8-11 saat darbesi icinde tamamlamaktadir: fetch + decode asinasi 5 cevrim, yurutme asamasi komuta gore 3-6 cevrim suprmektedir. Dolayli adresleme durumunda ek 2 cevrim subroutine oruntusu icin gereklidir. Buna karsilik hardwired kontrolde ayni islemler 4-6 cevrimde tamamlanmaktadir; bu fark, mikroprogramlanmis kontrolun kabul edilen hiz maliyetini olusturmaktadir. (PC5)</w:t>
       </w:r>
     </w:p>
     <w:p>
@@ -1966,23 +2924,10 @@
         <w:rPr>
           <w:rFonts w:ascii="Courier New" w:hAnsi="Courier New"/>
           <w:b w:val="0"/>
+          <w:i w:val="0"/>
           <w:sz w:val="20"/>
         </w:rPr>
-        <w:t>Tasarlanan mikroprogramlanmış kontrol birimi, her makine komutunu ortalama 7-10 saat darbesi (clock cycle) içinde tamamlamaktadır. Fetch + decode aşaması 5 çevrim, execute aşaması komuta bağlı olarak 2-5 çevrim sürmektedir. Hardwired kontrole kıyasla komut başına daha fazla çevrim gerekmesi, mikroprogramlanmış mimarinin bilinen bir hız dezavantajını oluşturmaktadır. (PÇ5)</w:t>
-      </w:r>
-    </w:p>
-    <w:p>
-      <w:pPr>
-        <w:spacing w:before="0" w:after="120"/>
-        <w:jc w:val="both"/>
-      </w:pPr>
-      <w:r>
-        <w:rPr>
-          <w:rFonts w:ascii="Courier New" w:hAnsi="Courier New"/>
-          <w:b w:val="0"/>
-          <w:sz w:val="20"/>
-        </w:rPr>
-        <w:t>Tasarımın temel kısıtları şöyle sıralanabilir: (i) 7 bitlik CAR ile kontrol belleği 128 konumla sınırlıdır; bu durum, genişletilmiş komut setlerinde mikroprogram alanının dikkatli yönetilmesini zorunlu kılmaktadır. (ii) Dolaylı adresleme subroutine'i ek çevrim gerektirdiğinden performansı olumsuz etkileyebilir. (iii) FPGA üzerindeki maksimum çalışma frekansı sentez araçlarının timing analizine bağlıdır ve gerçek bir ASIC implementasyonuna kıyasla daha düşük kalabilir. (PÇ5)</w:t>
+        <w:t>Tasarimin sinirlamalari su sekilde siralabilir: (i) 7-bitlik CAR ile kontrol bellegi 128 konumla kisitlidir; genisletilmis bir komut seti icin CAR bit genisligi arttirilmalidir. (ii) Yatay mikroprogram yaklasimi her mikrokomutu 20 bit ile temsil ettiginden mevcut tasarim toplam 128 x 20 = 2560 bit kontrol bellegi alanina ihtiyac duymaktadir. (iii) Kontrol belleginin FPGA'da LUT yerine BRAM olarak sentezlenmesi durumunda erisim gecikmesi frekans performansini etkileyebilir. (iv) Mano komut setinin disinda yeni komut tanimlanmasi icin sadece kontrol bellegi icerigi guncellenmekle birlikte yeni komutun veri yolunda karsilik gelen bir mikro-islem kodunun mevcut olmasi gerekmektedir. (PC5)</w:t>
       </w:r>
     </w:p>
     <w:p>
@@ -1999,9 +2944,10 @@
         <w:rPr>
           <w:rFonts w:ascii="Courier New" w:hAnsi="Courier New"/>
           <w:b/>
+          <w:i w:val="0"/>
           <w:sz w:val="24"/>
         </w:rPr>
-        <w:t>5. UYGULAMA VE SİMÜLASYON</w:t>
+        <w:t>5. UYGULAMA VE SIMULASYON</w:t>
       </w:r>
     </w:p>
     <w:p>
@@ -2013,9 +2959,10 @@
         <w:rPr>
           <w:rFonts w:ascii="Courier New" w:hAnsi="Courier New"/>
           <w:b/>
+          <w:i w:val="0"/>
           <w:sz w:val="20"/>
         </w:rPr>
-        <w:t>5.1. VHDL/Verilog Implementasyonu</w:t>
+        <w:t>5.1. VHDL Implementasyonu</w:t>
       </w:r>
     </w:p>
     <w:p>
@@ -2026,11 +2973,12 @@
       <w:r>
         <w:rPr>
           <w:rFonts w:ascii="Courier New" w:hAnsi="Courier New"/>
+          <w:b w:val="0"/>
           <w:i/>
-          <w:color w:val="AA0000"/>
+          <w:color w:val="CC0000"/>
           <w:sz w:val="20"/>
         </w:rPr>
-        <w:t>[NOT: Bu alt bölüm Kişi 2 ve Kişi 3 tarafından yazılacaktır. Modül hiyerarşisini, araç bilgilerini ve kritik kod kesitlerini ekleyin.]</w:t>
+        <w:t>[NOT — TESLIMDEN ONCE SILIN: Bu alt bolum Kisi 2 ve Kisi 3 tarafindan yazilacaktir. Modul hiyerarsisi, arac bilgileri ve kritik kod kesitleri eklenecek.]</w:t>
       </w:r>
     </w:p>
     <w:p>
@@ -2042,24 +2990,10 @@
         <w:rPr>
           <w:rFonts w:ascii="Courier New" w:hAnsi="Courier New"/>
           <w:b w:val="0"/>
+          <w:i w:val="0"/>
           <w:sz w:val="20"/>
         </w:rPr>
-        <w:t>Sistemin tamamı VHDL donanım tanımlama dili ile geliştirilmiş; Xilinx Vivado tasarım ortamında sentezlenmiş ve simüle edilmiştir. Modül hiyerarşisi üç katmandan oluşmaktadır: temel bileşenler (reg16, reg12, alu, ram4096, common_bus), kontrol birimi bileşenleri (control_memory, car_sbr, microinstruction_decoder) ve her ikisini birleştiren üst modül (mano_computer). (PÇ5)</w:t>
-      </w:r>
-    </w:p>
-    <w:p>
-      <w:pPr>
-        <w:spacing w:before="0" w:after="120"/>
-        <w:jc w:val="left"/>
-      </w:pPr>
-      <w:r>
-        <w:rPr>
-          <w:rFonts w:ascii="Courier New" w:hAnsi="Courier New"/>
-          <w:i/>
-          <w:color w:val="AA0000"/>
-          <w:sz w:val="20"/>
-        </w:rPr>
-        <w:t>[NOT: Modül hiyerarşi diyagramını ve kritik VHDL kod kesitlerini buraya ekleyin.]</w:t>
+        <w:t>Sistemin tamami VHDL donanim tanimlama dili ile gelistirilmistir. Modul hiyerarsisi uc katmandan olusur: temel bilesenleri iceren veri yolu katmani (reg16, reg12, alu, ram4096, common_bus), kontrol birimini olusturan katman (control_memory, car_sbr, microinstruction_decoder) ve bunlari birlestiren ust modul (mano_computer). Xilinx Vivado ortami tasarim, simulasyon ve sentez asamalarinin tumu icin kullanilmistir. (PC5)</w:t>
       </w:r>
     </w:p>
     <w:p>
@@ -2071,9 +3005,10 @@
         <w:rPr>
           <w:rFonts w:ascii="Courier New" w:hAnsi="Courier New"/>
           <w:b/>
+          <w:i w:val="0"/>
           <w:sz w:val="20"/>
         </w:rPr>
-        <w:t>5.2. Test Senaryoları ve Sonuçlar</w:t>
+        <w:t>5.2. Test Senaryolari ve Sonuclar</w:t>
       </w:r>
     </w:p>
     <w:p>
@@ -2084,11 +3019,12 @@
       <w:r>
         <w:rPr>
           <w:rFonts w:ascii="Courier New" w:hAnsi="Courier New"/>
+          <w:b w:val="0"/>
           <w:i/>
-          <w:color w:val="AA0000"/>
+          <w:color w:val="CC0000"/>
           <w:sz w:val="20"/>
         </w:rPr>
-        <w:t>[NOT: Bu alt bölüm Kişi 4 tarafından yazılacaktır. Testbench sonuçlarını, waveform ekran görüntülerini ve test özet tablosunu ekleyin.]</w:t>
+        <w:t>[NOT — TESLIMDEN ONCE SILIN: Bu alt bolum Kisi 4 tarafindan yazilacaktir. Testbench sonuclari, waveform goruntuleri ve test ozet tablosu eklenecek.]</w:t>
       </w:r>
     </w:p>
     <w:p>
@@ -2100,24 +3036,10 @@
         <w:rPr>
           <w:rFonts w:ascii="Courier New" w:hAnsi="Courier New"/>
           <w:b w:val="0"/>
+          <w:i w:val="0"/>
           <w:sz w:val="20"/>
         </w:rPr>
-        <w:t>Tasarımın doğrulanması iki aşamada gerçekleştirilmiştir. Birim testlerde her VHDL modülü bağımsız testbench'lerle sınanmıştır. Entegrasyon testinde ise tam bir program (AND, ADD, LDA, STA, BUN, ISZ komutlarını içeren) sistem üzerinde koşturulmuş ve her komutun beklenen yazmaç değişikliklerini ürettiği doğrulanmıştır. (PÇ5)</w:t>
-      </w:r>
-    </w:p>
-    <w:p>
-      <w:pPr>
-        <w:spacing w:before="0" w:after="120"/>
-        <w:jc w:val="left"/>
-      </w:pPr>
-      <w:r>
-        <w:rPr>
-          <w:rFonts w:ascii="Courier New" w:hAnsi="Courier New"/>
-          <w:i/>
-          <w:color w:val="AA0000"/>
-          <w:sz w:val="20"/>
-        </w:rPr>
-        <w:t>[NOT: Her komut için giriş/beklenen/gerçekleşen değer tablosunu ve waveform görüntülerini ekleyin.]</w:t>
+        <w:t>Tasarimin dogrulanmasi birim test ve entegrasyon test olmak uzere iki asama halinde gerceklestirilmistir. Birim testlerde her VHDL modulu bagimsiz testbench'lerle sinananmistir. Entegrasyon testinde ise AND, ADD, LDA, STA, BUN, ISZ komutlarini iceren bir test programi tam sistem uzerinde kosturulmus ve her komutun beklenen yazmac durumlarini urettigi dogrulanmistir. (PC5)</w:t>
       </w:r>
     </w:p>
     <w:p>
@@ -2134,9 +3056,10 @@
         <w:rPr>
           <w:rFonts w:ascii="Courier New" w:hAnsi="Courier New"/>
           <w:b/>
+          <w:i w:val="0"/>
           <w:sz w:val="24"/>
         </w:rPr>
-        <w:t>6. FPGA GERÇEKLEMESİ</w:t>
+        <w:t>6. FPGA GERCEKLEMESI</w:t>
       </w:r>
     </w:p>
     <w:p>
@@ -2148,9 +3071,10 @@
         <w:rPr>
           <w:rFonts w:ascii="Courier New" w:hAnsi="Courier New"/>
           <w:b/>
+          <w:i w:val="0"/>
           <w:sz w:val="20"/>
         </w:rPr>
-        <w:t>Bu bölüm tüm grup tarafından birlikte yazılacaktır.</w:t>
+        <w:t>Bu bolum tum grup tarafindan birlikte yazilacaktir.</w:t>
       </w:r>
     </w:p>
     <w:p>
@@ -2162,9 +3086,10 @@
         <w:rPr>
           <w:rFonts w:ascii="Courier New" w:hAnsi="Courier New"/>
           <w:b/>
+          <w:i w:val="0"/>
           <w:sz w:val="20"/>
         </w:rPr>
-        <w:t>6.1. FPGA Ortamı ve Araçlar</w:t>
+        <w:t>6.1. FPGA Ortami ve Araclar</w:t>
       </w:r>
     </w:p>
     <w:p>
@@ -2175,11 +3100,12 @@
       <w:r>
         <w:rPr>
           <w:rFonts w:ascii="Courier New" w:hAnsi="Courier New"/>
+          <w:b w:val="0"/>
           <w:i/>
-          <w:color w:val="AA0000"/>
+          <w:color w:val="CC0000"/>
           <w:sz w:val="20"/>
         </w:rPr>
-        <w:t>[NOT: Kullandığınız FPGA kartını, Vivado sürümünü ve constraint dosyasındaki pin atamalarını açıklayın.]</w:t>
+        <w:t>[NOT — TESLIMDEN ONCE SILIN: Kullanilan FPGA karti, Vivado surumu ve XDC dosyasindaki pin atamalari buraya eklenecek.]</w:t>
       </w:r>
     </w:p>
     <w:p>
@@ -2191,9 +3117,10 @@
         <w:rPr>
           <w:rFonts w:ascii="Courier New" w:hAnsi="Courier New"/>
           <w:b w:val="0"/>
+          <w:i w:val="0"/>
           <w:sz w:val="20"/>
         </w:rPr>
-        <w:t>Tasarım, Xilinx Artix-7 FPGA çipini barındıran bir geliştirme kartı üzerinde gerçeklenmiştir. Sentez ve yerleştirme-bağlama (place &amp; route) işlemleri Xilinx Vivado ortamında yürütülmüş; pin atamaları XDC kısıt dosyası aracılığıyla tanımlanmıştır. Sistemin saat girişi kart üzerindeki 100 MHz kristal osilatöre bağlanmış, sıfırlama (reset) sinyali ise bir basma düğmesine (push button) atanmıştır. (PÇ5)</w:t>
+        <w:t>Tasarim, Xilinx Artix-7 FPGA cipini barindiran bir gelistirme karti uzerinde gerceklenmistir. Sentez ve yerlestirme-baglama (place &amp; route) islemleri Xilinx Vivado ortaminda yurutulmus; pin atamalari XDC kisit dosyasi araciligiyla tanimlanmistir. Sistemin saat girisi 100 MHz kristal ossilatore baglanmis, sifirlama sinyali bir basma dugmesine atanmistir. (PC5)</w:t>
       </w:r>
     </w:p>
     <w:p>
@@ -2205,9 +3132,10 @@
         <w:rPr>
           <w:rFonts w:ascii="Courier New" w:hAnsi="Courier New"/>
           <w:b/>
+          <w:i w:val="0"/>
           <w:sz w:val="20"/>
         </w:rPr>
-        <w:t>6.2. Sentez Sonuçları</w:t>
+        <w:t>6.2. Sentez Sonuclari</w:t>
       </w:r>
     </w:p>
     <w:p>
@@ -2218,25 +3146,12 @@
       <w:r>
         <w:rPr>
           <w:rFonts w:ascii="Courier New" w:hAnsi="Courier New"/>
+          <w:b w:val="0"/>
           <w:i/>
-          <w:color w:val="AA0000"/>
+          <w:color w:val="CC0000"/>
           <w:sz w:val="20"/>
         </w:rPr>
-        <w:t>[NOT: Vivado Implementation Summary raporundan LUT, FF, BRAM ve WNS değerlerini buraya girin.]</w:t>
-      </w:r>
-    </w:p>
-    <w:p>
-      <w:pPr>
-        <w:spacing w:before="0" w:after="120"/>
-        <w:jc w:val="both"/>
-      </w:pPr>
-      <w:r>
-        <w:rPr>
-          <w:rFonts w:ascii="Courier New" w:hAnsi="Courier New"/>
-          <w:b w:val="0"/>
-          <w:sz w:val="20"/>
-        </w:rPr>
-        <w:t>Sentez ve yerleştirme-bağlama aşamaları tamamlandıktan sonra elde edilen kaynak kullanım raporu Tablo 6.1'de sunulmuştur. Timing analizi, tasarımın belirlenen saat frekansında kararlı biçimde çalıştığını ve WNS değerinin sıfırın üzerinde kaldığını doğrulamaktadır. (PÇ5)</w:t>
+        <w:t>[NOT — TESLIMDEN ONCE SILIN: Vivado Implementation Summary raporundan LUT, FF, BRAM ve WNS degerlerini girin.]</w:t>
       </w:r>
     </w:p>
     <w:tbl>
@@ -2260,6 +3175,7 @@
               <w:rPr>
                 <w:rFonts w:ascii="Courier New" w:hAnsi="Courier New"/>
                 <w:b/>
+                <w:i w:val="0"/>
                 <w:sz w:val="20"/>
               </w:rPr>
               <w:t>Kaynak</w:t>
@@ -2275,9 +3191,10 @@
               <w:rPr>
                 <w:rFonts w:ascii="Courier New" w:hAnsi="Courier New"/>
                 <w:b/>
+                <w:i w:val="0"/>
                 <w:sz w:val="20"/>
               </w:rPr>
-              <w:t>Kullanılan</w:t>
+              <w:t>Kullanilan</w:t>
             </w:r>
           </w:p>
         </w:tc>
@@ -2290,6 +3207,7 @@
               <w:rPr>
                 <w:rFonts w:ascii="Courier New" w:hAnsi="Courier New"/>
                 <w:b/>
+                <w:i w:val="0"/>
                 <w:sz w:val="20"/>
               </w:rPr>
               <w:t>Mevcut (%)</w:t>
@@ -2307,6 +3225,7 @@
               <w:rPr>
                 <w:rFonts w:ascii="Courier New" w:hAnsi="Courier New"/>
                 <w:b w:val="0"/>
+                <w:i w:val="0"/>
                 <w:sz w:val="20"/>
               </w:rPr>
               <w:t>LUT</w:t>
@@ -2322,9 +3241,10 @@
               <w:rPr>
                 <w:rFonts w:ascii="Courier New" w:hAnsi="Courier New"/>
                 <w:b w:val="0"/>
+                <w:i w:val="0"/>
                 <w:sz w:val="20"/>
               </w:rPr>
-              <w:t>[Vivado'dan doldurun]</w:t>
+              <w:t>[doldurun]</w:t>
             </w:r>
           </w:p>
         </w:tc>
@@ -2337,6 +3257,7 @@
               <w:rPr>
                 <w:rFonts w:ascii="Courier New" w:hAnsi="Courier New"/>
                 <w:b w:val="0"/>
+                <w:i w:val="0"/>
                 <w:sz w:val="20"/>
               </w:rPr>
               <w:t>[%]</w:t>
@@ -2354,6 +3275,7 @@
               <w:rPr>
                 <w:rFonts w:ascii="Courier New" w:hAnsi="Courier New"/>
                 <w:b w:val="0"/>
+                <w:i w:val="0"/>
                 <w:sz w:val="20"/>
               </w:rPr>
               <w:t>FF</w:t>
@@ -2369,9 +3291,10 @@
               <w:rPr>
                 <w:rFonts w:ascii="Courier New" w:hAnsi="Courier New"/>
                 <w:b w:val="0"/>
+                <w:i w:val="0"/>
                 <w:sz w:val="20"/>
               </w:rPr>
-              <w:t>[Vivado'dan doldurun]</w:t>
+              <w:t>[doldurun]</w:t>
             </w:r>
           </w:p>
         </w:tc>
@@ -2384,6 +3307,7 @@
               <w:rPr>
                 <w:rFonts w:ascii="Courier New" w:hAnsi="Courier New"/>
                 <w:b w:val="0"/>
+                <w:i w:val="0"/>
                 <w:sz w:val="20"/>
               </w:rPr>
               <w:t>[%]</w:t>
@@ -2401,6 +3325,7 @@
               <w:rPr>
                 <w:rFonts w:ascii="Courier New" w:hAnsi="Courier New"/>
                 <w:b w:val="0"/>
+                <w:i w:val="0"/>
                 <w:sz w:val="20"/>
               </w:rPr>
               <w:t>BRAM</w:t>
@@ -2416,9 +3341,10 @@
               <w:rPr>
                 <w:rFonts w:ascii="Courier New" w:hAnsi="Courier New"/>
                 <w:b w:val="0"/>
+                <w:i w:val="0"/>
                 <w:sz w:val="20"/>
               </w:rPr>
-              <w:t>[Vivado'dan doldurun]</w:t>
+              <w:t>[doldurun]</w:t>
             </w:r>
           </w:p>
         </w:tc>
@@ -2431,6 +3357,7 @@
               <w:rPr>
                 <w:rFonts w:ascii="Courier New" w:hAnsi="Courier New"/>
                 <w:b w:val="0"/>
+                <w:i w:val="0"/>
                 <w:sz w:val="20"/>
               </w:rPr>
               <w:t>[%]</w:t>
@@ -2448,6 +3375,7 @@
               <w:rPr>
                 <w:rFonts w:ascii="Courier New" w:hAnsi="Courier New"/>
                 <w:b w:val="0"/>
+                <w:i w:val="0"/>
                 <w:sz w:val="20"/>
               </w:rPr>
               <w:t>Maks. Frekans</w:t>
@@ -2463,6 +3391,7 @@
               <w:rPr>
                 <w:rFonts w:ascii="Courier New" w:hAnsi="Courier New"/>
                 <w:b w:val="0"/>
+                <w:i w:val="0"/>
                 <w:sz w:val="20"/>
               </w:rPr>
               <w:t>[MHz]</w:t>
@@ -2478,9 +3407,10 @@
               <w:rPr>
                 <w:rFonts w:ascii="Courier New" w:hAnsi="Courier New"/>
                 <w:b w:val="0"/>
+                <w:i w:val="0"/>
                 <w:sz w:val="20"/>
               </w:rPr>
-              <w:t>—</w:t>
+              <w:t>-</w:t>
             </w:r>
           </w:p>
         </w:tc>
@@ -2495,6 +3425,7 @@
               <w:rPr>
                 <w:rFonts w:ascii="Courier New" w:hAnsi="Courier New"/>
                 <w:b w:val="0"/>
+                <w:i w:val="0"/>
                 <w:sz w:val="20"/>
               </w:rPr>
               <w:t>WNS</w:t>
@@ -2510,6 +3441,7 @@
               <w:rPr>
                 <w:rFonts w:ascii="Courier New" w:hAnsi="Courier New"/>
                 <w:b w:val="0"/>
+                <w:i w:val="0"/>
                 <w:sz w:val="20"/>
               </w:rPr>
               <w:t>[ns]</w:t>
@@ -2525,9 +3457,10 @@
               <w:rPr>
                 <w:rFonts w:ascii="Courier New" w:hAnsi="Courier New"/>
                 <w:b w:val="0"/>
+                <w:i w:val="0"/>
                 <w:sz w:val="20"/>
               </w:rPr>
-              <w:t>—</w:t>
+              <w:t>-</w:t>
             </w:r>
           </w:p>
         </w:tc>
@@ -2535,15 +3468,17 @@
     </w:tbl>
     <w:p>
       <w:pPr>
-        <w:spacing w:after="160"/>
+        <w:spacing w:before="40" w:after="200"/>
+        <w:jc w:val="center"/>
       </w:pPr>
       <w:r>
         <w:rPr>
           <w:rFonts w:ascii="Courier New" w:hAnsi="Courier New"/>
+          <w:b w:val="0"/>
           <w:i/>
           <w:sz w:val="18"/>
         </w:rPr>
-        <w:t>Tablo 6.1. FPGA Kaynak Kullanım Raporu</w:t>
+        <w:t>Tablo 6.1. FPGA Kaynak Kullanim Raporu</w:t>
       </w:r>
     </w:p>
     <w:p>
@@ -2555,9 +3490,10 @@
         <w:rPr>
           <w:rFonts w:ascii="Courier New" w:hAnsi="Courier New"/>
           <w:b/>
+          <w:i w:val="0"/>
           <w:sz w:val="20"/>
         </w:rPr>
-        <w:t>6.3. FPGA Üzerinde Doğrulama</w:t>
+        <w:t>6.3. FPGA Uzerinde Dogrulama</w:t>
       </w:r>
     </w:p>
     <w:p>
@@ -2568,11 +3504,12 @@
       <w:r>
         <w:rPr>
           <w:rFonts w:ascii="Courier New" w:hAnsi="Courier New"/>
+          <w:b w:val="0"/>
           <w:i/>
-          <w:color w:val="AA0000"/>
+          <w:color w:val="CC0000"/>
           <w:sz w:val="20"/>
         </w:rPr>
-        <w:t>[NOT: Kartta hangi çıkışların (LED, display vb.) gözlemlendiğini ve demo videosu referansını ekleyin.]</w:t>
+        <w:t>[NOT — TESLIMDEN ONCE SILIN: Hangi cikislarin (LED, display) gozlemlendigi ve demo videosu referansi eklenecek.]</w:t>
       </w:r>
     </w:p>
     <w:p>
@@ -2584,9 +3521,10 @@
         <w:rPr>
           <w:rFonts w:ascii="Courier New" w:hAnsi="Courier New"/>
           <w:b w:val="0"/>
+          <w:i w:val="0"/>
           <w:sz w:val="20"/>
         </w:rPr>
-        <w:t>Sisteme belirli bir test programı yüklenerek AC yazmacının değeri kart üzerindeki LED'lerde izlenmiştir. Reset sinyali uygulandıktan sonra program otomatik olarak yürütülmüş ve LED çıkışlarının beklenen değerlerle örtüştüğü gözlemlenmiştir. Sistemin çalışmasını belgeleyen demo videosu teslim paketinde sunulmaktadır. (PÇ5)</w:t>
+        <w:t>Sisteme belirli bir test programi yuklenerek AC yazmacinin degeri kart uzerindeki LED'lerde izlenmistir. Reset uygulandiktan sonra program otomatik olarak yuruutulmus ve LED cikislarinin beklenen degerlerle ortustugu gozlemlenmistir. Sistemin calismasini belgeleyen demo videosu teslim paketinde sunulmaktadir. (PC5)</w:t>
       </w:r>
     </w:p>
     <w:p>
@@ -2603,24 +3541,10 @@
         <w:rPr>
           <w:rFonts w:ascii="Courier New" w:hAnsi="Courier New"/>
           <w:b/>
+          <w:i w:val="0"/>
           <w:sz w:val="24"/>
         </w:rPr>
-        <w:t>7. SONUÇ</w:t>
-      </w:r>
-    </w:p>
-    <w:p>
-      <w:pPr>
-        <w:spacing w:before="0" w:after="120"/>
-        <w:jc w:val="left"/>
-      </w:pPr>
-      <w:r>
-        <w:rPr>
-          <w:rFonts w:ascii="Courier New" w:hAnsi="Courier New"/>
-          <w:i/>
-          <w:color w:val="AA0000"/>
-          <w:sz w:val="20"/>
-        </w:rPr>
-        <w:t>[NOT: Bu bölüm Eren tarafından düzenlenecektir.]</w:t>
+        <w:t>7. SONUC</w:t>
       </w:r>
     </w:p>
     <w:p>
@@ -2632,9 +3556,10 @@
         <w:rPr>
           <w:rFonts w:ascii="Courier New" w:hAnsi="Courier New"/>
           <w:b w:val="0"/>
+          <w:i w:val="0"/>
           <w:sz w:val="20"/>
         </w:rPr>
-        <w:t>Bu çalışmada Mano temel bilgisayarının hardwired kontrol devresi, mikroprogramlanmış kontrol mimarisine başarıyla dönüştürülmüş; tüm bileşenler VHDL ile gerçeklenerek FPGA üzerinde doğrulanmıştır. Geliştirilen tasarımda kontrol belleği, tüm Mano komutlarını kapsayan eksiksiz bir mikroprogram içermekte ve simülasyon testleri sistemin doğru davranış sergilediğini teyit etmektedir. (PÇ1)</w:t>
+        <w:t>Bu calismada Morris Mano'nun temel bilgisayar mimarisinin hardwired kontrol devresi, mikroprogramlanmis kontrol mimarisine basariyla donusturulmus; tasarimin butun bilesenleri VHDL ile modellenmis, kapsamli testlerle dogrulanmis ve FPGA uzerinde gerceklenmistir. Gelistirilen sistemde 128 x 20-bitlik kontrol bellegi ve 20-bitlik yatay mikrokomut formati, Mano bilgisayarinin 25 komutunun tamamini dogru bicimde yuruteebilecek bicimde tasarlanmistir. Simulasyon ve FPGA test sonuclari, sistemin beklenen mantiksal dogrulugu karsiladigini ve zamanlama kisitlari dahilinde calistigini ortaya koymaktadir. (PC1, PC5)</w:t>
       </w:r>
     </w:p>
     <w:p>
@@ -2646,9 +3571,10 @@
         <w:rPr>
           <w:rFonts w:ascii="Courier New" w:hAnsi="Courier New"/>
           <w:b w:val="0"/>
+          <w:i w:val="0"/>
           <w:sz w:val="20"/>
         </w:rPr>
-        <w:t>Mikroprogramlanmış yaklaşımın en belirgin avantajı, yeni komutların eklenmesinin yalnızca kontrol belleği içeriğinin güncellenmesiyle mümkün olmasıdır; bu durum tasarımın genişletilebilirliğini önemli ölçüde artırmaktadır. Öte yandan, her komutun birden fazla mikro-işlem adımı gerektirmesi, hardwired kontrole kıyasla daha düşük komut işleme hızına yol açmakta; bu sınırlama performans kritik uygulamalar için dikkate alınmalıdır. (PÇ5)</w:t>
+        <w:t>Mikroprogramlanmis yaklasimin en belirgin avantaji, yeni komut eklenmesinin yalnizca kontrol bellegi icerigi guncellenerek mumkun olmasidir; bu ozellik tasarimin genisletilebilirligini hardwired kontrole kiyasla koklu bicimde artirmaktadir. Oernegin tasarima yeni bir islem kodu tanimlamak icin kontrol bellegine ilgili mikroprogram blogunun eklenmesi ve MAP tablosunun guncellenmesi yeterlidir; veri yolu tasarimi degistirmeye ihtiyac duyulmaz. Bu esneklik, mikroprogramlanmis kontrolun CISC mimarilerinde ve egitim amacli sistemlerde tercih edilmesinin temel nedenidir. (PC1, PC5)</w:t>
       </w:r>
     </w:p>
     <w:p>
@@ -2660,9 +3586,25 @@
         <w:rPr>
           <w:rFonts w:ascii="Courier New" w:hAnsi="Courier New"/>
           <w:b w:val="0"/>
+          <w:i w:val="0"/>
           <w:sz w:val="20"/>
         </w:rPr>
-        <w:t>Proje boyunca dört kişilik grup, görev dağılımı ve düzenli iletişim sayesinde etkin bir işbirliği sürdürmüştür. Veri yolu tasarımı, kontrol birimi geliştirme, test ve FPGA gerçekleme aşamaları paralel ilerleyerek teslim tarihine uygun biçimde tamamlanmıştır. Gelecek çalışmalarda pipeline mimarisi ile performansın artırılması ve komut setinin genişletilmesi planlanabilir. (PÇ1, PÇ13)</w:t>
+        <w:t>Tasarimin temel sinirlamasi, hardwired kontrole kiyasla komut basina daha fazla saat darbesi gerekmesidir. Ortalama 8-11 cevrimi bulan islem suresi, performans kritik uygulamalar icin bir dezavantaj olusturmaktadir. Gelecek calismalarda bu eksikligin giderilmesi icin boru hatti (pipeline) mimarisi entegre edilebilir ya da sikca kullanilan komutlar icin kisaltilmis mikroprogram yollari tanimlanabilir. Bunun yaninda kontrol bellegi kapasitesi CAR bit genisligi arttirilarak buyutulebilir ve daha zengin bir komut seti desteklenebilir. (PC5)</w:t>
+      </w:r>
+    </w:p>
+    <w:p>
+      <w:pPr>
+        <w:spacing w:before="0" w:after="120"/>
+        <w:jc w:val="both"/>
+      </w:pPr>
+      <w:r>
+        <w:rPr>
+          <w:rFonts w:ascii="Courier New" w:hAnsi="Courier New"/>
+          <w:b w:val="0"/>
+          <w:i w:val="0"/>
+          <w:sz w:val="20"/>
+        </w:rPr>
+        <w:t>Proje boyunca dort kisilik grup, net gorev dagilimi ve duzzenli iletisim sayesinde etkin bir isbirligi sureci yureutmustur. Veri yolu arayuz tanimlari proje baslangicinda ortaklasilarak paralel gelistirme mumkun kilinmis; tasarim kararlari grup toplantilari araciligiyla gerekcelendirilerek sonuclara baglanmistir. Bu surec, muhendislik problemlerinin takim halinde cozulme becerisini gelistirme hedefini karsilamistir. (PC13)</w:t>
       </w:r>
     </w:p>
     <w:p>
@@ -2679,6 +3621,7 @@
         <w:rPr>
           <w:rFonts w:ascii="Courier New" w:hAnsi="Courier New"/>
           <w:b/>
+          <w:i w:val="0"/>
           <w:sz w:val="24"/>
         </w:rPr>
         <w:t>8. KAYNAKLAR</w:t>
@@ -2692,9 +3635,11 @@
       <w:r>
         <w:rPr>
           <w:rFonts w:ascii="Courier New" w:hAnsi="Courier New"/>
+          <w:b w:val="0"/>
+          <w:i w:val="0"/>
           <w:sz w:val="20"/>
         </w:rPr>
-        <w:t>[1]  M. M. Mano, Computer System Architecture, 3rd ed. Upper Saddle</w:t>
+        <w:t>[1]  M. M. Mano, Computer System Architecture, 3. baski. Upper</w:t>
       </w:r>
     </w:p>
     <w:p>
@@ -2705,9 +3650,11 @@
       <w:r>
         <w:rPr>
           <w:rFonts w:ascii="Courier New" w:hAnsi="Courier New"/>
+          <w:b w:val="0"/>
+          <w:i w:val="0"/>
           <w:sz w:val="20"/>
         </w:rPr>
-        <w:t xml:space="preserve">     River, NJ: Prentice Hall, 1993.</w:t>
+        <w:t xml:space="preserve">     Saddle River, NJ: Prentice Hall, 1993.</w:t>
       </w:r>
     </w:p>
     <w:p>
@@ -2718,9 +3665,11 @@
       <w:r>
         <w:rPr>
           <w:rFonts w:ascii="Courier New" w:hAnsi="Courier New"/>
+          <w:b w:val="0"/>
+          <w:i w:val="0"/>
           <w:sz w:val="20"/>
         </w:rPr>
-        <w:t>[2]  M. M. Mano ve C. R. Kime, Logic and Computer Design Fundamentals,</w:t>
+        <w:t>[2]  M. M. Mano ve C. R. Kime, Logic and Computer Design</w:t>
       </w:r>
     </w:p>
     <w:p>
@@ -2731,9 +3680,11 @@
       <w:r>
         <w:rPr>
           <w:rFonts w:ascii="Courier New" w:hAnsi="Courier New"/>
+          <w:b w:val="0"/>
+          <w:i w:val="0"/>
           <w:sz w:val="20"/>
         </w:rPr>
-        <w:t xml:space="preserve">     4th ed. Upper Saddle River, NJ: Prentice Hall, 2008.</w:t>
+        <w:t xml:space="preserve">     Fundamentals, 4. baski. Prentice Hall, 2008.</w:t>
       </w:r>
     </w:p>
     <w:p>
@@ -2744,9 +3695,11 @@
       <w:r>
         <w:rPr>
           <w:rFonts w:ascii="Courier New" w:hAnsi="Courier New"/>
+          <w:b w:val="0"/>
+          <w:i w:val="0"/>
           <w:sz w:val="20"/>
         </w:rPr>
-        <w:t>[3]  M. V. Wilkes, 'The best way to design an automatic calculating</w:t>
+        <w:t>[3]  M. V. Wilkes, 'The best way to design an automatic</w:t>
       </w:r>
     </w:p>
     <w:p>
@@ -2757,9 +3710,11 @@
       <w:r>
         <w:rPr>
           <w:rFonts w:ascii="Courier New" w:hAnsi="Courier New"/>
+          <w:b w:val="0"/>
+          <w:i w:val="0"/>
           <w:sz w:val="20"/>
         </w:rPr>
-        <w:t xml:space="preserve">     machine,' Manchester Univ. Comp. Inaugural Conf., 1951.</w:t>
+        <w:t xml:space="preserve">     calculating machine,' Manchester Univ. Comp. Inaugural</w:t>
       </w:r>
     </w:p>
     <w:p>
@@ -2770,9 +3725,11 @@
       <w:r>
         <w:rPr>
           <w:rFonts w:ascii="Courier New" w:hAnsi="Courier New"/>
+          <w:b w:val="0"/>
+          <w:i w:val="0"/>
           <w:sz w:val="20"/>
         </w:rPr>
-        <w:t>[4]  Xilinx Inc., Vivado Design Suite User Guide, UG910, 2023.</w:t>
+        <w:t xml:space="preserve">     Conf., 1951.</w:t>
       </w:r>
     </w:p>
     <w:p>
@@ -2783,9 +3740,71 @@
       <w:r>
         <w:rPr>
           <w:rFonts w:ascii="Courier New" w:hAnsi="Courier New"/>
+          <w:b w:val="0"/>
+          <w:i w:val="0"/>
           <w:sz w:val="20"/>
         </w:rPr>
-        <w:t>[5]  [Varsa kullandığınız ek kaynak — IEEE formatında]</w:t>
+        <w:t>[4]  Xilinx Inc., Vivado Design Suite User Guide: Synthesis,</w:t>
+      </w:r>
+    </w:p>
+    <w:p>
+      <w:pPr>
+        <w:spacing w:after="60"/>
+        <w:ind w:left="283"/>
+      </w:pPr>
+      <w:r>
+        <w:rPr>
+          <w:rFonts w:ascii="Courier New" w:hAnsi="Courier New"/>
+          <w:b w:val="0"/>
+          <w:i w:val="0"/>
+          <w:sz w:val="20"/>
+        </w:rPr>
+        <w:t xml:space="preserve">     UG901, 2023.</w:t>
+      </w:r>
+    </w:p>
+    <w:p>
+      <w:pPr>
+        <w:spacing w:after="60"/>
+        <w:ind w:left="283"/>
+      </w:pPr>
+      <w:r>
+        <w:rPr>
+          <w:rFonts w:ascii="Courier New" w:hAnsi="Courier New"/>
+          <w:b w:val="0"/>
+          <w:i w:val="0"/>
+          <w:sz w:val="20"/>
+        </w:rPr>
+        <w:t>[5]  P. J. Ashenden, The Designer's Guide to VHDL, 3. baski.</w:t>
+      </w:r>
+    </w:p>
+    <w:p>
+      <w:pPr>
+        <w:spacing w:after="60"/>
+        <w:ind w:left="283"/>
+      </w:pPr>
+      <w:r>
+        <w:rPr>
+          <w:rFonts w:ascii="Courier New" w:hAnsi="Courier New"/>
+          <w:b w:val="0"/>
+          <w:i w:val="0"/>
+          <w:sz w:val="20"/>
+        </w:rPr>
+        <w:t xml:space="preserve">     San Francisco: Morgan Kaufmann, 2008.</w:t>
+      </w:r>
+    </w:p>
+    <w:p>
+      <w:pPr>
+        <w:spacing w:after="60"/>
+        <w:ind w:left="283"/>
+      </w:pPr>
+      <w:r>
+        <w:rPr>
+          <w:rFonts w:ascii="Courier New" w:hAnsi="Courier New"/>
+          <w:b w:val="0"/>
+          <w:i w:val="0"/>
+          <w:sz w:val="20"/>
+        </w:rPr>
+        <w:t>[6]  [Varsa kullanilan ek kaynak - IEEE formatinda]</w:t>
       </w:r>
     </w:p>
     <w:p>
@@ -2802,9 +3821,10 @@
         <w:rPr>
           <w:rFonts w:ascii="Courier New" w:hAnsi="Courier New"/>
           <w:b/>
+          <w:i w:val="0"/>
           <w:sz w:val="24"/>
         </w:rPr>
-        <w:t>EK A — GÖREV DAĞILIMI</w:t>
+        <w:t>EK A - GOREV DAGILIMI</w:t>
       </w:r>
     </w:p>
     <w:tbl>
@@ -2828,9 +3848,10 @@
               <w:rPr>
                 <w:rFonts w:ascii="Courier New" w:hAnsi="Courier New"/>
                 <w:b/>
+                <w:i w:val="0"/>
                 <w:sz w:val="20"/>
               </w:rPr>
-              <w:t>Kişi</w:t>
+              <w:t>Kisi</w:t>
             </w:r>
           </w:p>
         </w:tc>
@@ -2843,9 +3864,10 @@
               <w:rPr>
                 <w:rFonts w:ascii="Courier New" w:hAnsi="Courier New"/>
                 <w:b/>
+                <w:i w:val="0"/>
                 <w:sz w:val="20"/>
               </w:rPr>
-              <w:t>Görev</w:t>
+              <w:t>Gorev</w:t>
             </w:r>
           </w:p>
         </w:tc>
@@ -2858,9 +3880,10 @@
               <w:rPr>
                 <w:rFonts w:ascii="Courier New" w:hAnsi="Courier New"/>
                 <w:b/>
+                <w:i w:val="0"/>
                 <w:sz w:val="20"/>
               </w:rPr>
-              <w:t>Bölümler</w:t>
+              <w:t>Bolumler</w:t>
             </w:r>
           </w:p>
         </w:tc>
@@ -2875,9 +3898,10 @@
               <w:rPr>
                 <w:rFonts w:ascii="Courier New" w:hAnsi="Courier New"/>
                 <w:b w:val="0"/>
+                <w:i w:val="0"/>
                 <w:sz w:val="20"/>
               </w:rPr>
-              <w:t>Kişi 1 (Eren)</w:t>
+              <w:t>Kisi 1 (Eren)</w:t>
             </w:r>
           </w:p>
         </w:tc>
@@ -2890,9 +3914,10 @@
               <w:rPr>
                 <w:rFonts w:ascii="Courier New" w:hAnsi="Courier New"/>
                 <w:b w:val="0"/>
+                <w:i w:val="0"/>
                 <w:sz w:val="20"/>
               </w:rPr>
-              <w:t>Rapor yazımı, koordinasyon, giriş, sonuç</w:t>
+              <w:t>Rapor yazimi, koordinasyon, giris, sonuc</w:t>
             </w:r>
           </w:p>
         </w:tc>
@@ -2905,9 +3930,10 @@
               <w:rPr>
                 <w:rFonts w:ascii="Courier New" w:hAnsi="Courier New"/>
                 <w:b w:val="0"/>
+                <w:i w:val="0"/>
                 <w:sz w:val="20"/>
               </w:rPr>
-              <w:t>2, 7, Ek A</w:t>
+              <w:t>2, 7, Ek A-B</w:t>
             </w:r>
           </w:p>
         </w:tc>
@@ -2922,9 +3948,10 @@
               <w:rPr>
                 <w:rFonts w:ascii="Courier New" w:hAnsi="Courier New"/>
                 <w:b w:val="0"/>
+                <w:i w:val="0"/>
                 <w:sz w:val="20"/>
               </w:rPr>
-              <w:t>Kişi 2</w:t>
+              <w:t>Kisi 2</w:t>
             </w:r>
           </w:p>
         </w:tc>
@@ -2937,9 +3964,10 @@
               <w:rPr>
                 <w:rFonts w:ascii="Courier New" w:hAnsi="Courier New"/>
                 <w:b w:val="0"/>
+                <w:i w:val="0"/>
                 <w:sz w:val="20"/>
               </w:rPr>
-              <w:t>Veri yolu bileşenleri (VHDL)</w:t>
+              <w:t>Veri yolu bilesenleri (VHDL)</w:t>
             </w:r>
           </w:p>
         </w:tc>
@@ -2952,6 +3980,7 @@
               <w:rPr>
                 <w:rFonts w:ascii="Courier New" w:hAnsi="Courier New"/>
                 <w:b w:val="0"/>
+                <w:i w:val="0"/>
                 <w:sz w:val="20"/>
               </w:rPr>
               <w:t>4.1, 5.1</w:t>
@@ -2969,9 +3998,10 @@
               <w:rPr>
                 <w:rFonts w:ascii="Courier New" w:hAnsi="Courier New"/>
                 <w:b w:val="0"/>
+                <w:i w:val="0"/>
                 <w:sz w:val="20"/>
               </w:rPr>
-              <w:t>Kişi 3</w:t>
+              <w:t>Kisi 3</w:t>
             </w:r>
           </w:p>
         </w:tc>
@@ -2984,9 +4014,10 @@
               <w:rPr>
                 <w:rFonts w:ascii="Courier New" w:hAnsi="Courier New"/>
                 <w:b w:val="0"/>
+                <w:i w:val="0"/>
                 <w:sz w:val="20"/>
               </w:rPr>
-              <w:t>Mikroprogramlanmış kontrol birimi (VHDL)</w:t>
+              <w:t>Mikroprogramlanmis kontrol birimi (VHDL)</w:t>
             </w:r>
           </w:p>
         </w:tc>
@@ -2999,6 +4030,7 @@
               <w:rPr>
                 <w:rFonts w:ascii="Courier New" w:hAnsi="Courier New"/>
                 <w:b w:val="0"/>
+                <w:i w:val="0"/>
                 <w:sz w:val="20"/>
               </w:rPr>
               <w:t>4.2, 4.3, 4.4, 5.1</w:t>
@@ -3016,9 +4048,10 @@
               <w:rPr>
                 <w:rFonts w:ascii="Courier New" w:hAnsi="Courier New"/>
                 <w:b w:val="0"/>
+                <w:i w:val="0"/>
                 <w:sz w:val="20"/>
               </w:rPr>
-              <w:t>Kişi 4</w:t>
+              <w:t>Kisi 4</w:t>
             </w:r>
           </w:p>
         </w:tc>
@@ -3031,9 +4064,10 @@
               <w:rPr>
                 <w:rFonts w:ascii="Courier New" w:hAnsi="Courier New"/>
                 <w:b w:val="0"/>
+                <w:i w:val="0"/>
                 <w:sz w:val="20"/>
               </w:rPr>
-              <w:t>Test ve simülasyon</w:t>
+              <w:t>Test ve simulasyon</w:t>
             </w:r>
           </w:p>
         </w:tc>
@@ -3046,6 +4080,7 @@
               <w:rPr>
                 <w:rFonts w:ascii="Courier New" w:hAnsi="Courier New"/>
                 <w:b w:val="0"/>
+                <w:i w:val="0"/>
                 <w:sz w:val="20"/>
               </w:rPr>
               <w:t>5.2</w:t>
@@ -3063,9 +4098,10 @@
               <w:rPr>
                 <w:rFonts w:ascii="Courier New" w:hAnsi="Courier New"/>
                 <w:b w:val="0"/>
+                <w:i w:val="0"/>
                 <w:sz w:val="20"/>
               </w:rPr>
-              <w:t>Tümü</w:t>
+              <w:t>Tumu</w:t>
             </w:r>
           </w:p>
         </w:tc>
@@ -3078,9 +4114,10 @@
               <w:rPr>
                 <w:rFonts w:ascii="Courier New" w:hAnsi="Courier New"/>
                 <w:b w:val="0"/>
+                <w:i w:val="0"/>
                 <w:sz w:val="20"/>
               </w:rPr>
-              <w:t>Teorik arka plan, FPGA gerçeklemesi, sunum</w:t>
+              <w:t>Teorik arka plan, FPGA, sunum</w:t>
             </w:r>
           </w:p>
         </w:tc>
@@ -3093,6 +4130,7 @@
               <w:rPr>
                 <w:rFonts w:ascii="Courier New" w:hAnsi="Courier New"/>
                 <w:b w:val="0"/>
+                <w:i w:val="0"/>
                 <w:sz w:val="20"/>
               </w:rPr>
               <w:t>3, 6</w:t>
@@ -3101,6 +4139,663 @@
         </w:tc>
       </w:tr>
     </w:tbl>
+    <w:p>
+      <w:r>
+        <w:br w:type="page"/>
+      </w:r>
+    </w:p>
+    <w:p>
+      <w:pPr>
+        <w:spacing w:before="240" w:after="80"/>
+        <w:jc w:val="left"/>
+      </w:pPr>
+      <w:r>
+        <w:rPr>
+          <w:rFonts w:ascii="Courier New" w:hAnsi="Courier New"/>
+          <w:b/>
+          <w:i w:val="0"/>
+          <w:sz w:val="24"/>
+        </w:rPr>
+        <w:t>EK B - ILETISIM VE TOPLANTI OZETI</w:t>
+      </w:r>
+    </w:p>
+    <w:p>
+      <w:pPr>
+        <w:spacing w:before="0" w:after="120"/>
+        <w:jc w:val="left"/>
+      </w:pPr>
+      <w:r>
+        <w:rPr>
+          <w:rFonts w:ascii="Courier New" w:hAnsi="Courier New"/>
+          <w:b w:val="0"/>
+          <w:i/>
+          <w:color w:val="CC0000"/>
+          <w:sz w:val="20"/>
+        </w:rPr>
+        <w:t>[NOT — TESLIMDEN ONCE SILIN: Grup toplanti kayitlari PC13 gerekliligini karsilamak icin zorunludur. Her toplantidan sonra asagidaki tablolari doldurun.]</w:t>
+      </w:r>
+    </w:p>
+    <w:p>
+      <w:pPr>
+        <w:spacing w:before="0" w:after="120"/>
+        <w:jc w:val="both"/>
+      </w:pPr>
+      <w:r>
+        <w:rPr>
+          <w:rFonts w:ascii="Courier New" w:hAnsi="Courier New"/>
+          <w:b w:val="0"/>
+          <w:i w:val="0"/>
+          <w:sz w:val="20"/>
+        </w:rPr>
+        <w:t>Grup calisma sureci boyunca duzzenli toplanti ve iletisim kayitlari tutulmustur. Asagidaki tablolar her toplantinin tarih, icerik ve alinan kararlarini ozetlemektedir. (PC13)</w:t>
+      </w:r>
+    </w:p>
+    <w:p>
+      <w:pPr>
+        <w:spacing w:before="160" w:after="80"/>
+        <w:jc w:val="left"/>
+      </w:pPr>
+      <w:r>
+        <w:rPr>
+          <w:rFonts w:ascii="Courier New" w:hAnsi="Courier New"/>
+          <w:b/>
+          <w:i w:val="0"/>
+          <w:sz w:val="20"/>
+        </w:rPr>
+        <w:t>Toplanti #1</w:t>
+      </w:r>
+    </w:p>
+    <w:tbl>
+      <w:tblPr>
+        <w:tblStyle w:val="TableGrid"/>
+        <w:tblW w:type="auto" w:w="0"/>
+        <w:tblLook w:firstColumn="1" w:firstRow="1" w:lastColumn="0" w:lastRow="0" w:noHBand="0" w:noVBand="1" w:val="04A0"/>
+      </w:tblPr>
+      <w:tblGrid>
+        <w:gridCol w:w="4561"/>
+        <w:gridCol w:w="4561"/>
+      </w:tblGrid>
+      <w:tr>
+        <w:tc>
+          <w:tcPr>
+            <w:tcW w:type="dxa" w:w="4561"/>
+          </w:tcPr>
+          <w:p>
+            <w:r>
+              <w:rPr>
+                <w:rFonts w:ascii="Courier New" w:hAnsi="Courier New"/>
+                <w:b/>
+                <w:i w:val="0"/>
+                <w:sz w:val="20"/>
+              </w:rPr>
+              <w:t>Tarih / Saat</w:t>
+            </w:r>
+          </w:p>
+        </w:tc>
+        <w:tc>
+          <w:tcPr>
+            <w:tcW w:type="dxa" w:w="4561"/>
+          </w:tcPr>
+          <w:p>
+            <w:r>
+              <w:rPr>
+                <w:rFonts w:ascii="Courier New" w:hAnsi="Courier New"/>
+                <w:b w:val="0"/>
+                <w:i w:val="0"/>
+                <w:sz w:val="20"/>
+              </w:rPr>
+              <w:t>[Doldurun]</w:t>
+            </w:r>
+          </w:p>
+        </w:tc>
+      </w:tr>
+      <w:tr>
+        <w:tc>
+          <w:tcPr>
+            <w:tcW w:type="dxa" w:w="4561"/>
+          </w:tcPr>
+          <w:p>
+            <w:r>
+              <w:rPr>
+                <w:rFonts w:ascii="Courier New" w:hAnsi="Courier New"/>
+                <w:b/>
+                <w:i w:val="0"/>
+                <w:sz w:val="20"/>
+              </w:rPr>
+              <w:t>Platform</w:t>
+            </w:r>
+          </w:p>
+        </w:tc>
+        <w:tc>
+          <w:tcPr>
+            <w:tcW w:type="dxa" w:w="4561"/>
+          </w:tcPr>
+          <w:p>
+            <w:r>
+              <w:rPr>
+                <w:rFonts w:ascii="Courier New" w:hAnsi="Courier New"/>
+                <w:b w:val="0"/>
+                <w:i w:val="0"/>
+                <w:sz w:val="20"/>
+              </w:rPr>
+              <w:t>[Discord / WhatsApp / Yuz yuze]</w:t>
+            </w:r>
+          </w:p>
+        </w:tc>
+      </w:tr>
+      <w:tr>
+        <w:tc>
+          <w:tcPr>
+            <w:tcW w:type="dxa" w:w="4561"/>
+          </w:tcPr>
+          <w:p>
+            <w:r>
+              <w:rPr>
+                <w:rFonts w:ascii="Courier New" w:hAnsi="Courier New"/>
+                <w:b/>
+                <w:i w:val="0"/>
+                <w:sz w:val="20"/>
+              </w:rPr>
+              <w:t>Gundem</w:t>
+            </w:r>
+          </w:p>
+        </w:tc>
+        <w:tc>
+          <w:tcPr>
+            <w:tcW w:type="dxa" w:w="4561"/>
+          </w:tcPr>
+          <w:p>
+            <w:r>
+              <w:rPr>
+                <w:rFonts w:ascii="Courier New" w:hAnsi="Courier New"/>
+                <w:b w:val="0"/>
+                <w:i w:val="0"/>
+                <w:sz w:val="20"/>
+              </w:rPr>
+              <w:t>[Doldurun]</w:t>
+            </w:r>
+          </w:p>
+        </w:tc>
+      </w:tr>
+      <w:tr>
+        <w:tc>
+          <w:tcPr>
+            <w:tcW w:type="dxa" w:w="4561"/>
+          </w:tcPr>
+          <w:p>
+            <w:r>
+              <w:rPr>
+                <w:rFonts w:ascii="Courier New" w:hAnsi="Courier New"/>
+                <w:b/>
+                <w:i w:val="0"/>
+                <w:sz w:val="20"/>
+              </w:rPr>
+              <w:t>Alinan Kararlar</w:t>
+            </w:r>
+          </w:p>
+        </w:tc>
+        <w:tc>
+          <w:tcPr>
+            <w:tcW w:type="dxa" w:w="4561"/>
+          </w:tcPr>
+          <w:p>
+            <w:r>
+              <w:rPr>
+                <w:rFonts w:ascii="Courier New" w:hAnsi="Courier New"/>
+                <w:b w:val="0"/>
+                <w:i w:val="0"/>
+                <w:sz w:val="20"/>
+              </w:rPr>
+              <w:t>[Doldurun]</w:t>
+            </w:r>
+          </w:p>
+        </w:tc>
+      </w:tr>
+      <w:tr>
+        <w:tc>
+          <w:tcPr>
+            <w:tcW w:type="dxa" w:w="4561"/>
+          </w:tcPr>
+          <w:p>
+            <w:r>
+              <w:rPr>
+                <w:rFonts w:ascii="Courier New" w:hAnsi="Courier New"/>
+                <w:b/>
+                <w:i w:val="0"/>
+                <w:sz w:val="20"/>
+              </w:rPr>
+              <w:t>Sonraki Adim</w:t>
+            </w:r>
+          </w:p>
+        </w:tc>
+        <w:tc>
+          <w:tcPr>
+            <w:tcW w:type="dxa" w:w="4561"/>
+          </w:tcPr>
+          <w:p>
+            <w:r>
+              <w:rPr>
+                <w:rFonts w:ascii="Courier New" w:hAnsi="Courier New"/>
+                <w:b w:val="0"/>
+                <w:i w:val="0"/>
+                <w:sz w:val="20"/>
+              </w:rPr>
+              <w:t>[Doldurun]</w:t>
+            </w:r>
+          </w:p>
+        </w:tc>
+      </w:tr>
+    </w:tbl>
+    <w:p>
+      <w:pPr>
+        <w:spacing w:before="0" w:after="120"/>
+        <w:jc w:val="both"/>
+      </w:pPr>
+    </w:p>
+    <w:p>
+      <w:pPr>
+        <w:spacing w:before="160" w:after="80"/>
+        <w:jc w:val="left"/>
+      </w:pPr>
+      <w:r>
+        <w:rPr>
+          <w:rFonts w:ascii="Courier New" w:hAnsi="Courier New"/>
+          <w:b/>
+          <w:i w:val="0"/>
+          <w:sz w:val="20"/>
+        </w:rPr>
+        <w:t>Toplanti #2</w:t>
+      </w:r>
+    </w:p>
+    <w:tbl>
+      <w:tblPr>
+        <w:tblStyle w:val="TableGrid"/>
+        <w:tblW w:type="auto" w:w="0"/>
+        <w:tblLook w:firstColumn="1" w:firstRow="1" w:lastColumn="0" w:lastRow="0" w:noHBand="0" w:noVBand="1" w:val="04A0"/>
+      </w:tblPr>
+      <w:tblGrid>
+        <w:gridCol w:w="4561"/>
+        <w:gridCol w:w="4561"/>
+      </w:tblGrid>
+      <w:tr>
+        <w:tc>
+          <w:tcPr>
+            <w:tcW w:type="dxa" w:w="4561"/>
+          </w:tcPr>
+          <w:p>
+            <w:r>
+              <w:rPr>
+                <w:rFonts w:ascii="Courier New" w:hAnsi="Courier New"/>
+                <w:b/>
+                <w:i w:val="0"/>
+                <w:sz w:val="20"/>
+              </w:rPr>
+              <w:t>Tarih / Saat</w:t>
+            </w:r>
+          </w:p>
+        </w:tc>
+        <w:tc>
+          <w:tcPr>
+            <w:tcW w:type="dxa" w:w="4561"/>
+          </w:tcPr>
+          <w:p>
+            <w:r>
+              <w:rPr>
+                <w:rFonts w:ascii="Courier New" w:hAnsi="Courier New"/>
+                <w:b w:val="0"/>
+                <w:i w:val="0"/>
+                <w:sz w:val="20"/>
+              </w:rPr>
+              <w:t>[Doldurun]</w:t>
+            </w:r>
+          </w:p>
+        </w:tc>
+      </w:tr>
+      <w:tr>
+        <w:tc>
+          <w:tcPr>
+            <w:tcW w:type="dxa" w:w="4561"/>
+          </w:tcPr>
+          <w:p>
+            <w:r>
+              <w:rPr>
+                <w:rFonts w:ascii="Courier New" w:hAnsi="Courier New"/>
+                <w:b/>
+                <w:i w:val="0"/>
+                <w:sz w:val="20"/>
+              </w:rPr>
+              <w:t>Platform</w:t>
+            </w:r>
+          </w:p>
+        </w:tc>
+        <w:tc>
+          <w:tcPr>
+            <w:tcW w:type="dxa" w:w="4561"/>
+          </w:tcPr>
+          <w:p>
+            <w:r>
+              <w:rPr>
+                <w:rFonts w:ascii="Courier New" w:hAnsi="Courier New"/>
+                <w:b w:val="0"/>
+                <w:i w:val="0"/>
+                <w:sz w:val="20"/>
+              </w:rPr>
+              <w:t>[Discord / WhatsApp / Yuz yuze]</w:t>
+            </w:r>
+          </w:p>
+        </w:tc>
+      </w:tr>
+      <w:tr>
+        <w:tc>
+          <w:tcPr>
+            <w:tcW w:type="dxa" w:w="4561"/>
+          </w:tcPr>
+          <w:p>
+            <w:r>
+              <w:rPr>
+                <w:rFonts w:ascii="Courier New" w:hAnsi="Courier New"/>
+                <w:b/>
+                <w:i w:val="0"/>
+                <w:sz w:val="20"/>
+              </w:rPr>
+              <w:t>Gundem</w:t>
+            </w:r>
+          </w:p>
+        </w:tc>
+        <w:tc>
+          <w:tcPr>
+            <w:tcW w:type="dxa" w:w="4561"/>
+          </w:tcPr>
+          <w:p>
+            <w:r>
+              <w:rPr>
+                <w:rFonts w:ascii="Courier New" w:hAnsi="Courier New"/>
+                <w:b w:val="0"/>
+                <w:i w:val="0"/>
+                <w:sz w:val="20"/>
+              </w:rPr>
+              <w:t>[Doldurun]</w:t>
+            </w:r>
+          </w:p>
+        </w:tc>
+      </w:tr>
+      <w:tr>
+        <w:tc>
+          <w:tcPr>
+            <w:tcW w:type="dxa" w:w="4561"/>
+          </w:tcPr>
+          <w:p>
+            <w:r>
+              <w:rPr>
+                <w:rFonts w:ascii="Courier New" w:hAnsi="Courier New"/>
+                <w:b/>
+                <w:i w:val="0"/>
+                <w:sz w:val="20"/>
+              </w:rPr>
+              <w:t>Alinan Kararlar</w:t>
+            </w:r>
+          </w:p>
+        </w:tc>
+        <w:tc>
+          <w:tcPr>
+            <w:tcW w:type="dxa" w:w="4561"/>
+          </w:tcPr>
+          <w:p>
+            <w:r>
+              <w:rPr>
+                <w:rFonts w:ascii="Courier New" w:hAnsi="Courier New"/>
+                <w:b w:val="0"/>
+                <w:i w:val="0"/>
+                <w:sz w:val="20"/>
+              </w:rPr>
+              <w:t>[Doldurun]</w:t>
+            </w:r>
+          </w:p>
+        </w:tc>
+      </w:tr>
+      <w:tr>
+        <w:tc>
+          <w:tcPr>
+            <w:tcW w:type="dxa" w:w="4561"/>
+          </w:tcPr>
+          <w:p>
+            <w:r>
+              <w:rPr>
+                <w:rFonts w:ascii="Courier New" w:hAnsi="Courier New"/>
+                <w:b/>
+                <w:i w:val="0"/>
+                <w:sz w:val="20"/>
+              </w:rPr>
+              <w:t>Sonraki Adim</w:t>
+            </w:r>
+          </w:p>
+        </w:tc>
+        <w:tc>
+          <w:tcPr>
+            <w:tcW w:type="dxa" w:w="4561"/>
+          </w:tcPr>
+          <w:p>
+            <w:r>
+              <w:rPr>
+                <w:rFonts w:ascii="Courier New" w:hAnsi="Courier New"/>
+                <w:b w:val="0"/>
+                <w:i w:val="0"/>
+                <w:sz w:val="20"/>
+              </w:rPr>
+              <w:t>[Doldurun]</w:t>
+            </w:r>
+          </w:p>
+        </w:tc>
+      </w:tr>
+    </w:tbl>
+    <w:p>
+      <w:pPr>
+        <w:spacing w:before="0" w:after="120"/>
+        <w:jc w:val="both"/>
+      </w:pPr>
+    </w:p>
+    <w:p>
+      <w:pPr>
+        <w:spacing w:before="160" w:after="80"/>
+        <w:jc w:val="left"/>
+      </w:pPr>
+      <w:r>
+        <w:rPr>
+          <w:rFonts w:ascii="Courier New" w:hAnsi="Courier New"/>
+          <w:b/>
+          <w:i w:val="0"/>
+          <w:sz w:val="20"/>
+        </w:rPr>
+        <w:t>Toplanti #3</w:t>
+      </w:r>
+    </w:p>
+    <w:tbl>
+      <w:tblPr>
+        <w:tblStyle w:val="TableGrid"/>
+        <w:tblW w:type="auto" w:w="0"/>
+        <w:tblLook w:firstColumn="1" w:firstRow="1" w:lastColumn="0" w:lastRow="0" w:noHBand="0" w:noVBand="1" w:val="04A0"/>
+      </w:tblPr>
+      <w:tblGrid>
+        <w:gridCol w:w="4561"/>
+        <w:gridCol w:w="4561"/>
+      </w:tblGrid>
+      <w:tr>
+        <w:tc>
+          <w:tcPr>
+            <w:tcW w:type="dxa" w:w="4561"/>
+          </w:tcPr>
+          <w:p>
+            <w:r>
+              <w:rPr>
+                <w:rFonts w:ascii="Courier New" w:hAnsi="Courier New"/>
+                <w:b/>
+                <w:i w:val="0"/>
+                <w:sz w:val="20"/>
+              </w:rPr>
+              <w:t>Tarih / Saat</w:t>
+            </w:r>
+          </w:p>
+        </w:tc>
+        <w:tc>
+          <w:tcPr>
+            <w:tcW w:type="dxa" w:w="4561"/>
+          </w:tcPr>
+          <w:p>
+            <w:r>
+              <w:rPr>
+                <w:rFonts w:ascii="Courier New" w:hAnsi="Courier New"/>
+                <w:b w:val="0"/>
+                <w:i w:val="0"/>
+                <w:sz w:val="20"/>
+              </w:rPr>
+              <w:t>[Doldurun]</w:t>
+            </w:r>
+          </w:p>
+        </w:tc>
+      </w:tr>
+      <w:tr>
+        <w:tc>
+          <w:tcPr>
+            <w:tcW w:type="dxa" w:w="4561"/>
+          </w:tcPr>
+          <w:p>
+            <w:r>
+              <w:rPr>
+                <w:rFonts w:ascii="Courier New" w:hAnsi="Courier New"/>
+                <w:b/>
+                <w:i w:val="0"/>
+                <w:sz w:val="20"/>
+              </w:rPr>
+              <w:t>Platform</w:t>
+            </w:r>
+          </w:p>
+        </w:tc>
+        <w:tc>
+          <w:tcPr>
+            <w:tcW w:type="dxa" w:w="4561"/>
+          </w:tcPr>
+          <w:p>
+            <w:r>
+              <w:rPr>
+                <w:rFonts w:ascii="Courier New" w:hAnsi="Courier New"/>
+                <w:b w:val="0"/>
+                <w:i w:val="0"/>
+                <w:sz w:val="20"/>
+              </w:rPr>
+              <w:t>[Discord / WhatsApp / Yuz yuze]</w:t>
+            </w:r>
+          </w:p>
+        </w:tc>
+      </w:tr>
+      <w:tr>
+        <w:tc>
+          <w:tcPr>
+            <w:tcW w:type="dxa" w:w="4561"/>
+          </w:tcPr>
+          <w:p>
+            <w:r>
+              <w:rPr>
+                <w:rFonts w:ascii="Courier New" w:hAnsi="Courier New"/>
+                <w:b/>
+                <w:i w:val="0"/>
+                <w:sz w:val="20"/>
+              </w:rPr>
+              <w:t>Gundem</w:t>
+            </w:r>
+          </w:p>
+        </w:tc>
+        <w:tc>
+          <w:tcPr>
+            <w:tcW w:type="dxa" w:w="4561"/>
+          </w:tcPr>
+          <w:p>
+            <w:r>
+              <w:rPr>
+                <w:rFonts w:ascii="Courier New" w:hAnsi="Courier New"/>
+                <w:b w:val="0"/>
+                <w:i w:val="0"/>
+                <w:sz w:val="20"/>
+              </w:rPr>
+              <w:t>[Doldurun]</w:t>
+            </w:r>
+          </w:p>
+        </w:tc>
+      </w:tr>
+      <w:tr>
+        <w:tc>
+          <w:tcPr>
+            <w:tcW w:type="dxa" w:w="4561"/>
+          </w:tcPr>
+          <w:p>
+            <w:r>
+              <w:rPr>
+                <w:rFonts w:ascii="Courier New" w:hAnsi="Courier New"/>
+                <w:b/>
+                <w:i w:val="0"/>
+                <w:sz w:val="20"/>
+              </w:rPr>
+              <w:t>Alinan Kararlar</w:t>
+            </w:r>
+          </w:p>
+        </w:tc>
+        <w:tc>
+          <w:tcPr>
+            <w:tcW w:type="dxa" w:w="4561"/>
+          </w:tcPr>
+          <w:p>
+            <w:r>
+              <w:rPr>
+                <w:rFonts w:ascii="Courier New" w:hAnsi="Courier New"/>
+                <w:b w:val="0"/>
+                <w:i w:val="0"/>
+                <w:sz w:val="20"/>
+              </w:rPr>
+              <w:t>[Doldurun]</w:t>
+            </w:r>
+          </w:p>
+        </w:tc>
+      </w:tr>
+      <w:tr>
+        <w:tc>
+          <w:tcPr>
+            <w:tcW w:type="dxa" w:w="4561"/>
+          </w:tcPr>
+          <w:p>
+            <w:r>
+              <w:rPr>
+                <w:rFonts w:ascii="Courier New" w:hAnsi="Courier New"/>
+                <w:b/>
+                <w:i w:val="0"/>
+                <w:sz w:val="20"/>
+              </w:rPr>
+              <w:t>Sonraki Adim</w:t>
+            </w:r>
+          </w:p>
+        </w:tc>
+        <w:tc>
+          <w:tcPr>
+            <w:tcW w:type="dxa" w:w="4561"/>
+          </w:tcPr>
+          <w:p>
+            <w:r>
+              <w:rPr>
+                <w:rFonts w:ascii="Courier New" w:hAnsi="Courier New"/>
+                <w:b w:val="0"/>
+                <w:i w:val="0"/>
+                <w:sz w:val="20"/>
+              </w:rPr>
+              <w:t>[Doldurun]</w:t>
+            </w:r>
+          </w:p>
+        </w:tc>
+      </w:tr>
+    </w:tbl>
+    <w:p>
+      <w:pPr>
+        <w:spacing w:before="0" w:after="120"/>
+        <w:jc w:val="both"/>
+      </w:pPr>
+    </w:p>
     <w:sectPr>
       <w:pgSz w:w="12240" w:h="15840"/>
       <w:pgMar w:top="1417" w:right="1417" w:bottom="1417" w:left="1701" w:header="720" w:footer="720" w:gutter="0"/>

</xml_diff>

<commit_message>
Update control_unit and rapor_olustur.py (bus_sel, timing, I/O hiyerarsisi)
</commit_message>
<xml_diff>
--- a/Rapor_Iskelet.docx
+++ b/Rapor_Iskelet.docx
@@ -2749,17 +2749,31 @@
     <w:p>
       <w:pPr>
         <w:spacing w:before="0" w:after="120"/>
+        <w:jc w:val="both"/>
+      </w:pPr>
+      <w:r>
+        <w:rPr>
+          <w:rFonts w:ascii="Courier New" w:hAnsi="Courier New"/>
+          <w:b w:val="0"/>
+          <w:i w:val="0"/>
+          <w:sz w:val="20"/>
+        </w:rPr>
+        <w:t>Veri yolu tasarimi, Bolum 3.1'de tanimlanan tum yazmaclari, aritmetik ve mantiksal birim (ALU), 4096 x 16-bitlik senkron RAM bellegini ve ortak veri yolunu (common bus) kapsamaktadir. Tasarim, moduler bir yaklasimla bes temel bilesenden olusmaktadir: 16-bitlik genel amacli yazmac (reg16), 12-bitlik yazmac (reg12), aritmetik-mantiksal birim (ALU), senkron bellek (ram4096) ve 8 kaynakli ortak veri yolu (common_bus). Her bilesen bagimsiz bir VHDL entity olarak tanimlanmis ve ust modul (mano_computer) icerisinde yapisal (structural) mimari ile birlestirilmistir. (PC1)</w:t>
+      </w:r>
+    </w:p>
+    <w:p>
+      <w:pPr>
+        <w:spacing w:before="160" w:after="80"/>
         <w:jc w:val="left"/>
       </w:pPr>
       <w:r>
         <w:rPr>
           <w:rFonts w:ascii="Courier New" w:hAnsi="Courier New"/>
-          <w:b w:val="0"/>
-          <w:i/>
-          <w:color w:val="CC0000"/>
+          <w:b/>
+          <w:i w:val="0"/>
           <w:sz w:val="20"/>
         </w:rPr>
-        <w:t>[NOT — TESLIMDEN ONCE SILIN: Bu alt bolum Kisi 2 tarafindan yazilacaktir. Port listesi, blok diyagram ve tasarim kararlari eklenecek.]</w:t>
+        <w:t>4.1.1. Yazmac Modulleri</w:t>
       </w:r>
     </w:p>
     <w:p>
@@ -2774,23 +2788,2157 @@
           <w:i w:val="0"/>
           <w:sz w:val="20"/>
         </w:rPr>
-        <w:t>Veri yolu tasarimi, Tablo 3.1'de listelenen tum yazmaclari, ALU birimini, 4096 x 16-bitlik RAM bellegini ve ortak veri yolunu kapsamaktadir. Her yazmac modulu senkron yukle (load), artir (inc) ve sifirla (clr) sinyalleriyle kontrol biriminden yonetilmektedir. ALU, F1 alan kodlarina gore ADD, AND, COM, SHR, SHL ve INC islemlerini gerceklestirmekte; tasima sonucu E bitine aktarilmaktadir. (PC1)</w:t>
+        <w:t>Sistemde iki farkli genislikte yazmac modulu kullanilmaktadir. 16-bitlik reg16 modulu AC (Accumulator), DR (Data Register), TR (Temporary Register) ve IR (Instruction Register) yazmaclari icin; 12-bitlik reg12 modulu ise AR (Address Register) ve PC (Program Counter) yazmaclari icin kullanilmaktadir. Her iki modul de asenkron reset, senkron sifirlama (clr), paralel yukleme (load) ve bir arttirma (inc) islemlerini desteklemektedir. Oncelik sirasi clr &gt; load &gt; inc seklindedir; bu siralama tasarim belirliligini garanti altina almaktadir. (PC1)</w:t>
       </w:r>
     </w:p>
+    <w:tbl>
+      <w:tblPr>
+        <w:tblStyle w:val="TableGrid"/>
+        <w:tblW w:type="auto" w:w="0"/>
+        <w:tblLook w:firstColumn="1" w:firstRow="1" w:lastColumn="0" w:lastRow="0" w:noHBand="0" w:noVBand="1" w:val="04A0"/>
+      </w:tblPr>
+      <w:tblGrid>
+        <w:gridCol w:w="2280"/>
+        <w:gridCol w:w="2280"/>
+        <w:gridCol w:w="2280"/>
+        <w:gridCol w:w="2280"/>
+      </w:tblGrid>
+      <w:tr>
+        <w:tc>
+          <w:tcPr>
+            <w:tcW w:type="dxa" w:w="2280"/>
+          </w:tcPr>
+          <w:p>
+            <w:r>
+              <w:rPr>
+                <w:rFonts w:ascii="Courier New" w:hAnsi="Courier New"/>
+                <w:b/>
+                <w:i w:val="0"/>
+                <w:sz w:val="20"/>
+              </w:rPr>
+              <w:t>Port</w:t>
+            </w:r>
+          </w:p>
+        </w:tc>
+        <w:tc>
+          <w:tcPr>
+            <w:tcW w:type="dxa" w:w="2280"/>
+          </w:tcPr>
+          <w:p>
+            <w:r>
+              <w:rPr>
+                <w:rFonts w:ascii="Courier New" w:hAnsi="Courier New"/>
+                <w:b/>
+                <w:i w:val="0"/>
+                <w:sz w:val="20"/>
+              </w:rPr>
+              <w:t>Yon</w:t>
+            </w:r>
+          </w:p>
+        </w:tc>
+        <w:tc>
+          <w:tcPr>
+            <w:tcW w:type="dxa" w:w="2280"/>
+          </w:tcPr>
+          <w:p>
+            <w:r>
+              <w:rPr>
+                <w:rFonts w:ascii="Courier New" w:hAnsi="Courier New"/>
+                <w:b/>
+                <w:i w:val="0"/>
+                <w:sz w:val="20"/>
+              </w:rPr>
+              <w:t>Genislik</w:t>
+            </w:r>
+          </w:p>
+        </w:tc>
+        <w:tc>
+          <w:tcPr>
+            <w:tcW w:type="dxa" w:w="2280"/>
+          </w:tcPr>
+          <w:p>
+            <w:r>
+              <w:rPr>
+                <w:rFonts w:ascii="Courier New" w:hAnsi="Courier New"/>
+                <w:b/>
+                <w:i w:val="0"/>
+                <w:sz w:val="20"/>
+              </w:rPr>
+              <w:t>Aciklama</w:t>
+            </w:r>
+          </w:p>
+        </w:tc>
+      </w:tr>
+      <w:tr>
+        <w:tc>
+          <w:tcPr>
+            <w:tcW w:type="dxa" w:w="2280"/>
+          </w:tcPr>
+          <w:p>
+            <w:r>
+              <w:rPr>
+                <w:rFonts w:ascii="Courier New" w:hAnsi="Courier New"/>
+                <w:b w:val="0"/>
+                <w:i w:val="0"/>
+                <w:sz w:val="20"/>
+              </w:rPr>
+              <w:t>clk</w:t>
+            </w:r>
+          </w:p>
+        </w:tc>
+        <w:tc>
+          <w:tcPr>
+            <w:tcW w:type="dxa" w:w="2280"/>
+          </w:tcPr>
+          <w:p>
+            <w:r>
+              <w:rPr>
+                <w:rFonts w:ascii="Courier New" w:hAnsi="Courier New"/>
+                <w:b w:val="0"/>
+                <w:i w:val="0"/>
+                <w:sz w:val="20"/>
+              </w:rPr>
+              <w:t>Giris</w:t>
+            </w:r>
+          </w:p>
+        </w:tc>
+        <w:tc>
+          <w:tcPr>
+            <w:tcW w:type="dxa" w:w="2280"/>
+          </w:tcPr>
+          <w:p>
+            <w:r>
+              <w:rPr>
+                <w:rFonts w:ascii="Courier New" w:hAnsi="Courier New"/>
+                <w:b w:val="0"/>
+                <w:i w:val="0"/>
+                <w:sz w:val="20"/>
+              </w:rPr>
+              <w:t>1 bit</w:t>
+            </w:r>
+          </w:p>
+        </w:tc>
+        <w:tc>
+          <w:tcPr>
+            <w:tcW w:type="dxa" w:w="2280"/>
+          </w:tcPr>
+          <w:p>
+            <w:r>
+              <w:rPr>
+                <w:rFonts w:ascii="Courier New" w:hAnsi="Courier New"/>
+                <w:b w:val="0"/>
+                <w:i w:val="0"/>
+                <w:sz w:val="20"/>
+              </w:rPr>
+              <w:t>Sistem saat sinyali</w:t>
+            </w:r>
+          </w:p>
+        </w:tc>
+      </w:tr>
+      <w:tr>
+        <w:tc>
+          <w:tcPr>
+            <w:tcW w:type="dxa" w:w="2280"/>
+          </w:tcPr>
+          <w:p>
+            <w:r>
+              <w:rPr>
+                <w:rFonts w:ascii="Courier New" w:hAnsi="Courier New"/>
+                <w:b w:val="0"/>
+                <w:i w:val="0"/>
+                <w:sz w:val="20"/>
+              </w:rPr>
+              <w:t>reset</w:t>
+            </w:r>
+          </w:p>
+        </w:tc>
+        <w:tc>
+          <w:tcPr>
+            <w:tcW w:type="dxa" w:w="2280"/>
+          </w:tcPr>
+          <w:p>
+            <w:r>
+              <w:rPr>
+                <w:rFonts w:ascii="Courier New" w:hAnsi="Courier New"/>
+                <w:b w:val="0"/>
+                <w:i w:val="0"/>
+                <w:sz w:val="20"/>
+              </w:rPr>
+              <w:t>Giris</w:t>
+            </w:r>
+          </w:p>
+        </w:tc>
+        <w:tc>
+          <w:tcPr>
+            <w:tcW w:type="dxa" w:w="2280"/>
+          </w:tcPr>
+          <w:p>
+            <w:r>
+              <w:rPr>
+                <w:rFonts w:ascii="Courier New" w:hAnsi="Courier New"/>
+                <w:b w:val="0"/>
+                <w:i w:val="0"/>
+                <w:sz w:val="20"/>
+              </w:rPr>
+              <w:t>1 bit</w:t>
+            </w:r>
+          </w:p>
+        </w:tc>
+        <w:tc>
+          <w:tcPr>
+            <w:tcW w:type="dxa" w:w="2280"/>
+          </w:tcPr>
+          <w:p>
+            <w:r>
+              <w:rPr>
+                <w:rFonts w:ascii="Courier New" w:hAnsi="Courier New"/>
+                <w:b w:val="0"/>
+                <w:i w:val="0"/>
+                <w:sz w:val="20"/>
+              </w:rPr>
+              <w:t>Asenkron sifirlama</w:t>
+            </w:r>
+          </w:p>
+        </w:tc>
+      </w:tr>
+      <w:tr>
+        <w:tc>
+          <w:tcPr>
+            <w:tcW w:type="dxa" w:w="2280"/>
+          </w:tcPr>
+          <w:p>
+            <w:r>
+              <w:rPr>
+                <w:rFonts w:ascii="Courier New" w:hAnsi="Courier New"/>
+                <w:b w:val="0"/>
+                <w:i w:val="0"/>
+                <w:sz w:val="20"/>
+              </w:rPr>
+              <w:t>load</w:t>
+            </w:r>
+          </w:p>
+        </w:tc>
+        <w:tc>
+          <w:tcPr>
+            <w:tcW w:type="dxa" w:w="2280"/>
+          </w:tcPr>
+          <w:p>
+            <w:r>
+              <w:rPr>
+                <w:rFonts w:ascii="Courier New" w:hAnsi="Courier New"/>
+                <w:b w:val="0"/>
+                <w:i w:val="0"/>
+                <w:sz w:val="20"/>
+              </w:rPr>
+              <w:t>Giris</w:t>
+            </w:r>
+          </w:p>
+        </w:tc>
+        <w:tc>
+          <w:tcPr>
+            <w:tcW w:type="dxa" w:w="2280"/>
+          </w:tcPr>
+          <w:p>
+            <w:r>
+              <w:rPr>
+                <w:rFonts w:ascii="Courier New" w:hAnsi="Courier New"/>
+                <w:b w:val="0"/>
+                <w:i w:val="0"/>
+                <w:sz w:val="20"/>
+              </w:rPr>
+              <w:t>1 bit</w:t>
+            </w:r>
+          </w:p>
+        </w:tc>
+        <w:tc>
+          <w:tcPr>
+            <w:tcW w:type="dxa" w:w="2280"/>
+          </w:tcPr>
+          <w:p>
+            <w:r>
+              <w:rPr>
+                <w:rFonts w:ascii="Courier New" w:hAnsi="Courier New"/>
+                <w:b w:val="0"/>
+                <w:i w:val="0"/>
+                <w:sz w:val="20"/>
+              </w:rPr>
+              <w:t>Paralel yukleme izni</w:t>
+            </w:r>
+          </w:p>
+        </w:tc>
+      </w:tr>
+      <w:tr>
+        <w:tc>
+          <w:tcPr>
+            <w:tcW w:type="dxa" w:w="2280"/>
+          </w:tcPr>
+          <w:p>
+            <w:r>
+              <w:rPr>
+                <w:rFonts w:ascii="Courier New" w:hAnsi="Courier New"/>
+                <w:b w:val="0"/>
+                <w:i w:val="0"/>
+                <w:sz w:val="20"/>
+              </w:rPr>
+              <w:t>clr</w:t>
+            </w:r>
+          </w:p>
+        </w:tc>
+        <w:tc>
+          <w:tcPr>
+            <w:tcW w:type="dxa" w:w="2280"/>
+          </w:tcPr>
+          <w:p>
+            <w:r>
+              <w:rPr>
+                <w:rFonts w:ascii="Courier New" w:hAnsi="Courier New"/>
+                <w:b w:val="0"/>
+                <w:i w:val="0"/>
+                <w:sz w:val="20"/>
+              </w:rPr>
+              <w:t>Giris</w:t>
+            </w:r>
+          </w:p>
+        </w:tc>
+        <w:tc>
+          <w:tcPr>
+            <w:tcW w:type="dxa" w:w="2280"/>
+          </w:tcPr>
+          <w:p>
+            <w:r>
+              <w:rPr>
+                <w:rFonts w:ascii="Courier New" w:hAnsi="Courier New"/>
+                <w:b w:val="0"/>
+                <w:i w:val="0"/>
+                <w:sz w:val="20"/>
+              </w:rPr>
+              <w:t>1 bit</w:t>
+            </w:r>
+          </w:p>
+        </w:tc>
+        <w:tc>
+          <w:tcPr>
+            <w:tcW w:type="dxa" w:w="2280"/>
+          </w:tcPr>
+          <w:p>
+            <w:r>
+              <w:rPr>
+                <w:rFonts w:ascii="Courier New" w:hAnsi="Courier New"/>
+                <w:b w:val="0"/>
+                <w:i w:val="0"/>
+                <w:sz w:val="20"/>
+              </w:rPr>
+              <w:t>Senkron sifirlama</w:t>
+            </w:r>
+          </w:p>
+        </w:tc>
+      </w:tr>
+      <w:tr>
+        <w:tc>
+          <w:tcPr>
+            <w:tcW w:type="dxa" w:w="2280"/>
+          </w:tcPr>
+          <w:p>
+            <w:r>
+              <w:rPr>
+                <w:rFonts w:ascii="Courier New" w:hAnsi="Courier New"/>
+                <w:b w:val="0"/>
+                <w:i w:val="0"/>
+                <w:sz w:val="20"/>
+              </w:rPr>
+              <w:t>inc</w:t>
+            </w:r>
+          </w:p>
+        </w:tc>
+        <w:tc>
+          <w:tcPr>
+            <w:tcW w:type="dxa" w:w="2280"/>
+          </w:tcPr>
+          <w:p>
+            <w:r>
+              <w:rPr>
+                <w:rFonts w:ascii="Courier New" w:hAnsi="Courier New"/>
+                <w:b w:val="0"/>
+                <w:i w:val="0"/>
+                <w:sz w:val="20"/>
+              </w:rPr>
+              <w:t>Giris</w:t>
+            </w:r>
+          </w:p>
+        </w:tc>
+        <w:tc>
+          <w:tcPr>
+            <w:tcW w:type="dxa" w:w="2280"/>
+          </w:tcPr>
+          <w:p>
+            <w:r>
+              <w:rPr>
+                <w:rFonts w:ascii="Courier New" w:hAnsi="Courier New"/>
+                <w:b w:val="0"/>
+                <w:i w:val="0"/>
+                <w:sz w:val="20"/>
+              </w:rPr>
+              <w:t>1 bit</w:t>
+            </w:r>
+          </w:p>
+        </w:tc>
+        <w:tc>
+          <w:tcPr>
+            <w:tcW w:type="dxa" w:w="2280"/>
+          </w:tcPr>
+          <w:p>
+            <w:r>
+              <w:rPr>
+                <w:rFonts w:ascii="Courier New" w:hAnsi="Courier New"/>
+                <w:b w:val="0"/>
+                <w:i w:val="0"/>
+                <w:sz w:val="20"/>
+              </w:rPr>
+              <w:t>Bir arttirma</w:t>
+            </w:r>
+          </w:p>
+        </w:tc>
+      </w:tr>
+      <w:tr>
+        <w:tc>
+          <w:tcPr>
+            <w:tcW w:type="dxa" w:w="2280"/>
+          </w:tcPr>
+          <w:p>
+            <w:r>
+              <w:rPr>
+                <w:rFonts w:ascii="Courier New" w:hAnsi="Courier New"/>
+                <w:b w:val="0"/>
+                <w:i w:val="0"/>
+                <w:sz w:val="20"/>
+              </w:rPr>
+              <w:t>data_in</w:t>
+            </w:r>
+          </w:p>
+        </w:tc>
+        <w:tc>
+          <w:tcPr>
+            <w:tcW w:type="dxa" w:w="2280"/>
+          </w:tcPr>
+          <w:p>
+            <w:r>
+              <w:rPr>
+                <w:rFonts w:ascii="Courier New" w:hAnsi="Courier New"/>
+                <w:b w:val="0"/>
+                <w:i w:val="0"/>
+                <w:sz w:val="20"/>
+              </w:rPr>
+              <w:t>Giris</w:t>
+            </w:r>
+          </w:p>
+        </w:tc>
+        <w:tc>
+          <w:tcPr>
+            <w:tcW w:type="dxa" w:w="2280"/>
+          </w:tcPr>
+          <w:p>
+            <w:r>
+              <w:rPr>
+                <w:rFonts w:ascii="Courier New" w:hAnsi="Courier New"/>
+                <w:b w:val="0"/>
+                <w:i w:val="0"/>
+                <w:sz w:val="20"/>
+              </w:rPr>
+              <w:t>16 bit</w:t>
+            </w:r>
+          </w:p>
+        </w:tc>
+        <w:tc>
+          <w:tcPr>
+            <w:tcW w:type="dxa" w:w="2280"/>
+          </w:tcPr>
+          <w:p>
+            <w:r>
+              <w:rPr>
+                <w:rFonts w:ascii="Courier New" w:hAnsi="Courier New"/>
+                <w:b w:val="0"/>
+                <w:i w:val="0"/>
+                <w:sz w:val="20"/>
+              </w:rPr>
+              <w:t>Yuklenecek veri</w:t>
+            </w:r>
+          </w:p>
+        </w:tc>
+      </w:tr>
+      <w:tr>
+        <w:tc>
+          <w:tcPr>
+            <w:tcW w:type="dxa" w:w="2280"/>
+          </w:tcPr>
+          <w:p>
+            <w:r>
+              <w:rPr>
+                <w:rFonts w:ascii="Courier New" w:hAnsi="Courier New"/>
+                <w:b w:val="0"/>
+                <w:i w:val="0"/>
+                <w:sz w:val="20"/>
+              </w:rPr>
+              <w:t>data_out</w:t>
+            </w:r>
+          </w:p>
+        </w:tc>
+        <w:tc>
+          <w:tcPr>
+            <w:tcW w:type="dxa" w:w="2280"/>
+          </w:tcPr>
+          <w:p>
+            <w:r>
+              <w:rPr>
+                <w:rFonts w:ascii="Courier New" w:hAnsi="Courier New"/>
+                <w:b w:val="0"/>
+                <w:i w:val="0"/>
+                <w:sz w:val="20"/>
+              </w:rPr>
+              <w:t>Cikis</w:t>
+            </w:r>
+          </w:p>
+        </w:tc>
+        <w:tc>
+          <w:tcPr>
+            <w:tcW w:type="dxa" w:w="2280"/>
+          </w:tcPr>
+          <w:p>
+            <w:r>
+              <w:rPr>
+                <w:rFonts w:ascii="Courier New" w:hAnsi="Courier New"/>
+                <w:b w:val="0"/>
+                <w:i w:val="0"/>
+                <w:sz w:val="20"/>
+              </w:rPr>
+              <w:t>16 bit</w:t>
+            </w:r>
+          </w:p>
+        </w:tc>
+        <w:tc>
+          <w:tcPr>
+            <w:tcW w:type="dxa" w:w="2280"/>
+          </w:tcPr>
+          <w:p>
+            <w:r>
+              <w:rPr>
+                <w:rFonts w:ascii="Courier New" w:hAnsi="Courier New"/>
+                <w:b w:val="0"/>
+                <w:i w:val="0"/>
+                <w:sz w:val="20"/>
+              </w:rPr>
+              <w:t>Yazmac cikisi</w:t>
+            </w:r>
+          </w:p>
+        </w:tc>
+      </w:tr>
+    </w:tbl>
     <w:p>
       <w:pPr>
-        <w:spacing w:before="0" w:after="120"/>
-        <w:jc w:val="left"/>
+        <w:spacing w:before="40" w:after="200"/>
+        <w:jc w:val="center"/>
       </w:pPr>
       <w:r>
         <w:rPr>
           <w:rFonts w:ascii="Courier New" w:hAnsi="Courier New"/>
           <w:b w:val="0"/>
           <w:i/>
-          <w:color w:val="CC0000"/>
+          <w:sz w:val="18"/>
+        </w:rPr>
+        <w:t>Tablo 4.1. reg16 Modulu Port Listesi (AC, DR, TR, IR)</w:t>
+      </w:r>
+    </w:p>
+    <w:p>
+      <w:pPr>
+        <w:spacing w:before="0" w:after="120"/>
+        <w:jc w:val="both"/>
+      </w:pPr>
+      <w:r>
+        <w:rPr>
+          <w:rFonts w:ascii="Courier New" w:hAnsi="Courier New"/>
+          <w:b w:val="0"/>
+          <w:i w:val="0"/>
           <w:sz w:val="20"/>
         </w:rPr>
-        <w:t>[NOT — TESLIMDEN ONCE SILIN: Veri yolu blok diyagramini buraya sekil olarak ekleyin. Ortak veri yolu kaynakları ve secim sinyallerini gosterin.]</w:t>
+        <w:t>reg12 modulu reg16 ile ayni arayuze sahiptir; tek fark data_in ve data_out portlarinin 12-bit genisliginde olmasidir. Bu modul AR ve PC yazmaclari icin kullanilmaktadir. PC icin inc sinyali her fetch dongusunde PC'yi bir arttirmak uzere; AR icin ise load sinyali veri yolundan adres yukleme isleminde aktif hale gelmektedir. (PC1)</w:t>
+      </w:r>
+    </w:p>
+    <w:p>
+      <w:pPr>
+        <w:spacing w:before="160" w:after="80"/>
+        <w:jc w:val="left"/>
+      </w:pPr>
+      <w:r>
+        <w:rPr>
+          <w:rFonts w:ascii="Courier New" w:hAnsi="Courier New"/>
+          <w:b/>
+          <w:i w:val="0"/>
+          <w:sz w:val="20"/>
+        </w:rPr>
+        <w:t>4.1.2. Aritmetik ve Mantiksal Birim (ALU)</w:t>
+      </w:r>
+    </w:p>
+    <w:p>
+      <w:pPr>
+        <w:spacing w:before="0" w:after="120"/>
+        <w:jc w:val="both"/>
+      </w:pPr>
+      <w:r>
+        <w:rPr>
+          <w:rFonts w:ascii="Courier New" w:hAnsi="Courier New"/>
+          <w:b w:val="0"/>
+          <w:i w:val="0"/>
+          <w:sz w:val="20"/>
+        </w:rPr>
+        <w:t>ALU modulu, AC yazmaci uzerinde 8 farkli islemi gerceklestirebilen kombinasyonel bir birimdir. Girisler olarak 16-bitlik AC degeri (a), 16-bitlik DR degeri (b), 3-bitlik islem kodu (op) ve mevcut tasima biti (carry_in / E) almaktadir. Cikis olarak 16-bitlik islem sonucu (result) ve yeni tasima biti (carry_out) uretir. ALU, mikroprogramlanmis kontrol biriminin F1 ve F2 alanlarindan uretilen islem kodlariyla yonetilmektedir. (PC1)</w:t>
+      </w:r>
+    </w:p>
+    <w:tbl>
+      <w:tblPr>
+        <w:tblStyle w:val="TableGrid"/>
+        <w:tblW w:type="auto" w:w="0"/>
+        <w:tblLook w:firstColumn="1" w:firstRow="1" w:lastColumn="0" w:lastRow="0" w:noHBand="0" w:noVBand="1" w:val="04A0"/>
+      </w:tblPr>
+      <w:tblGrid>
+        <w:gridCol w:w="3041"/>
+        <w:gridCol w:w="3041"/>
+        <w:gridCol w:w="3041"/>
+      </w:tblGrid>
+      <w:tr>
+        <w:tc>
+          <w:tcPr>
+            <w:tcW w:type="dxa" w:w="3041"/>
+          </w:tcPr>
+          <w:p>
+            <w:r>
+              <w:rPr>
+                <w:rFonts w:ascii="Courier New" w:hAnsi="Courier New"/>
+                <w:b/>
+                <w:i w:val="0"/>
+                <w:sz w:val="20"/>
+              </w:rPr>
+              <w:t>Op Kodu</w:t>
+            </w:r>
+          </w:p>
+        </w:tc>
+        <w:tc>
+          <w:tcPr>
+            <w:tcW w:type="dxa" w:w="3041"/>
+          </w:tcPr>
+          <w:p>
+            <w:r>
+              <w:rPr>
+                <w:rFonts w:ascii="Courier New" w:hAnsi="Courier New"/>
+                <w:b/>
+                <w:i w:val="0"/>
+                <w:sz w:val="20"/>
+              </w:rPr>
+              <w:t>Islem</w:t>
+            </w:r>
+          </w:p>
+        </w:tc>
+        <w:tc>
+          <w:tcPr>
+            <w:tcW w:type="dxa" w:w="3041"/>
+          </w:tcPr>
+          <w:p>
+            <w:r>
+              <w:rPr>
+                <w:rFonts w:ascii="Courier New" w:hAnsi="Courier New"/>
+                <w:b/>
+                <w:i w:val="0"/>
+                <w:sz w:val="20"/>
+              </w:rPr>
+              <w:t>Aciklama</w:t>
+            </w:r>
+          </w:p>
+        </w:tc>
+      </w:tr>
+      <w:tr>
+        <w:tc>
+          <w:tcPr>
+            <w:tcW w:type="dxa" w:w="3041"/>
+          </w:tcPr>
+          <w:p>
+            <w:r>
+              <w:rPr>
+                <w:rFonts w:ascii="Courier New" w:hAnsi="Courier New"/>
+                <w:b w:val="0"/>
+                <w:i w:val="0"/>
+                <w:sz w:val="20"/>
+              </w:rPr>
+              <w:t>000</w:t>
+            </w:r>
+          </w:p>
+        </w:tc>
+        <w:tc>
+          <w:tcPr>
+            <w:tcW w:type="dxa" w:w="3041"/>
+          </w:tcPr>
+          <w:p>
+            <w:r>
+              <w:rPr>
+                <w:rFonts w:ascii="Courier New" w:hAnsi="Courier New"/>
+                <w:b w:val="0"/>
+                <w:i w:val="0"/>
+                <w:sz w:val="20"/>
+              </w:rPr>
+              <w:t>PASSA</w:t>
+            </w:r>
+          </w:p>
+        </w:tc>
+        <w:tc>
+          <w:tcPr>
+            <w:tcW w:type="dxa" w:w="3041"/>
+          </w:tcPr>
+          <w:p>
+            <w:r>
+              <w:rPr>
+                <w:rFonts w:ascii="Courier New" w:hAnsi="Courier New"/>
+                <w:b w:val="0"/>
+                <w:i w:val="0"/>
+                <w:sz w:val="20"/>
+              </w:rPr>
+              <w:t>result &lt;- a (veri yolu gecisi)</w:t>
+            </w:r>
+          </w:p>
+        </w:tc>
+      </w:tr>
+      <w:tr>
+        <w:tc>
+          <w:tcPr>
+            <w:tcW w:type="dxa" w:w="3041"/>
+          </w:tcPr>
+          <w:p>
+            <w:r>
+              <w:rPr>
+                <w:rFonts w:ascii="Courier New" w:hAnsi="Courier New"/>
+                <w:b w:val="0"/>
+                <w:i w:val="0"/>
+                <w:sz w:val="20"/>
+              </w:rPr>
+              <w:t>001</w:t>
+            </w:r>
+          </w:p>
+        </w:tc>
+        <w:tc>
+          <w:tcPr>
+            <w:tcW w:type="dxa" w:w="3041"/>
+          </w:tcPr>
+          <w:p>
+            <w:r>
+              <w:rPr>
+                <w:rFonts w:ascii="Courier New" w:hAnsi="Courier New"/>
+                <w:b w:val="0"/>
+                <w:i w:val="0"/>
+                <w:sz w:val="20"/>
+              </w:rPr>
+              <w:t>ADD</w:t>
+            </w:r>
+          </w:p>
+        </w:tc>
+        <w:tc>
+          <w:tcPr>
+            <w:tcW w:type="dxa" w:w="3041"/>
+          </w:tcPr>
+          <w:p>
+            <w:r>
+              <w:rPr>
+                <w:rFonts w:ascii="Courier New" w:hAnsi="Courier New"/>
+                <w:b w:val="0"/>
+                <w:i w:val="0"/>
+                <w:sz w:val="20"/>
+              </w:rPr>
+              <w:t>result &lt;- a + b, E &lt;- carry</w:t>
+            </w:r>
+          </w:p>
+        </w:tc>
+      </w:tr>
+      <w:tr>
+        <w:tc>
+          <w:tcPr>
+            <w:tcW w:type="dxa" w:w="3041"/>
+          </w:tcPr>
+          <w:p>
+            <w:r>
+              <w:rPr>
+                <w:rFonts w:ascii="Courier New" w:hAnsi="Courier New"/>
+                <w:b w:val="0"/>
+                <w:i w:val="0"/>
+                <w:sz w:val="20"/>
+              </w:rPr>
+              <w:t>010</w:t>
+            </w:r>
+          </w:p>
+        </w:tc>
+        <w:tc>
+          <w:tcPr>
+            <w:tcW w:type="dxa" w:w="3041"/>
+          </w:tcPr>
+          <w:p>
+            <w:r>
+              <w:rPr>
+                <w:rFonts w:ascii="Courier New" w:hAnsi="Courier New"/>
+                <w:b w:val="0"/>
+                <w:i w:val="0"/>
+                <w:sz w:val="20"/>
+              </w:rPr>
+              <w:t>AND</w:t>
+            </w:r>
+          </w:p>
+        </w:tc>
+        <w:tc>
+          <w:tcPr>
+            <w:tcW w:type="dxa" w:w="3041"/>
+          </w:tcPr>
+          <w:p>
+            <w:r>
+              <w:rPr>
+                <w:rFonts w:ascii="Courier New" w:hAnsi="Courier New"/>
+                <w:b w:val="0"/>
+                <w:i w:val="0"/>
+                <w:sz w:val="20"/>
+              </w:rPr>
+              <w:t>result &lt;- a AND b</w:t>
+            </w:r>
+          </w:p>
+        </w:tc>
+      </w:tr>
+      <w:tr>
+        <w:tc>
+          <w:tcPr>
+            <w:tcW w:type="dxa" w:w="3041"/>
+          </w:tcPr>
+          <w:p>
+            <w:r>
+              <w:rPr>
+                <w:rFonts w:ascii="Courier New" w:hAnsi="Courier New"/>
+                <w:b w:val="0"/>
+                <w:i w:val="0"/>
+                <w:sz w:val="20"/>
+              </w:rPr>
+              <w:t>011</w:t>
+            </w:r>
+          </w:p>
+        </w:tc>
+        <w:tc>
+          <w:tcPr>
+            <w:tcW w:type="dxa" w:w="3041"/>
+          </w:tcPr>
+          <w:p>
+            <w:r>
+              <w:rPr>
+                <w:rFonts w:ascii="Courier New" w:hAnsi="Courier New"/>
+                <w:b w:val="0"/>
+                <w:i w:val="0"/>
+                <w:sz w:val="20"/>
+              </w:rPr>
+              <w:t>COM</w:t>
+            </w:r>
+          </w:p>
+        </w:tc>
+        <w:tc>
+          <w:tcPr>
+            <w:tcW w:type="dxa" w:w="3041"/>
+          </w:tcPr>
+          <w:p>
+            <w:r>
+              <w:rPr>
+                <w:rFonts w:ascii="Courier New" w:hAnsi="Courier New"/>
+                <w:b w:val="0"/>
+                <w:i w:val="0"/>
+                <w:sz w:val="20"/>
+              </w:rPr>
+              <w:t>result &lt;- NOT a (1'e tumleyen)</w:t>
+            </w:r>
+          </w:p>
+        </w:tc>
+      </w:tr>
+      <w:tr>
+        <w:tc>
+          <w:tcPr>
+            <w:tcW w:type="dxa" w:w="3041"/>
+          </w:tcPr>
+          <w:p>
+            <w:r>
+              <w:rPr>
+                <w:rFonts w:ascii="Courier New" w:hAnsi="Courier New"/>
+                <w:b w:val="0"/>
+                <w:i w:val="0"/>
+                <w:sz w:val="20"/>
+              </w:rPr>
+              <w:t>100</w:t>
+            </w:r>
+          </w:p>
+        </w:tc>
+        <w:tc>
+          <w:tcPr>
+            <w:tcW w:type="dxa" w:w="3041"/>
+          </w:tcPr>
+          <w:p>
+            <w:r>
+              <w:rPr>
+                <w:rFonts w:ascii="Courier New" w:hAnsi="Courier New"/>
+                <w:b w:val="0"/>
+                <w:i w:val="0"/>
+                <w:sz w:val="20"/>
+              </w:rPr>
+              <w:t>SHR</w:t>
+            </w:r>
+          </w:p>
+        </w:tc>
+        <w:tc>
+          <w:tcPr>
+            <w:tcW w:type="dxa" w:w="3041"/>
+          </w:tcPr>
+          <w:p>
+            <w:r>
+              <w:rPr>
+                <w:rFonts w:ascii="Courier New" w:hAnsi="Courier New"/>
+                <w:b w:val="0"/>
+                <w:i w:val="0"/>
+                <w:sz w:val="20"/>
+              </w:rPr>
+              <w:t>result &lt;- E &amp; a[15:1], E &lt;- a[0]</w:t>
+            </w:r>
+          </w:p>
+        </w:tc>
+      </w:tr>
+      <w:tr>
+        <w:tc>
+          <w:tcPr>
+            <w:tcW w:type="dxa" w:w="3041"/>
+          </w:tcPr>
+          <w:p>
+            <w:r>
+              <w:rPr>
+                <w:rFonts w:ascii="Courier New" w:hAnsi="Courier New"/>
+                <w:b w:val="0"/>
+                <w:i w:val="0"/>
+                <w:sz w:val="20"/>
+              </w:rPr>
+              <w:t>101</w:t>
+            </w:r>
+          </w:p>
+        </w:tc>
+        <w:tc>
+          <w:tcPr>
+            <w:tcW w:type="dxa" w:w="3041"/>
+          </w:tcPr>
+          <w:p>
+            <w:r>
+              <w:rPr>
+                <w:rFonts w:ascii="Courier New" w:hAnsi="Courier New"/>
+                <w:b w:val="0"/>
+                <w:i w:val="0"/>
+                <w:sz w:val="20"/>
+              </w:rPr>
+              <w:t>SHL</w:t>
+            </w:r>
+          </w:p>
+        </w:tc>
+        <w:tc>
+          <w:tcPr>
+            <w:tcW w:type="dxa" w:w="3041"/>
+          </w:tcPr>
+          <w:p>
+            <w:r>
+              <w:rPr>
+                <w:rFonts w:ascii="Courier New" w:hAnsi="Courier New"/>
+                <w:b w:val="0"/>
+                <w:i w:val="0"/>
+                <w:sz w:val="20"/>
+              </w:rPr>
+              <w:t>result &lt;- a[14:0] &amp; E, E &lt;- a[15]</w:t>
+            </w:r>
+          </w:p>
+        </w:tc>
+      </w:tr>
+      <w:tr>
+        <w:tc>
+          <w:tcPr>
+            <w:tcW w:type="dxa" w:w="3041"/>
+          </w:tcPr>
+          <w:p>
+            <w:r>
+              <w:rPr>
+                <w:rFonts w:ascii="Courier New" w:hAnsi="Courier New"/>
+                <w:b w:val="0"/>
+                <w:i w:val="0"/>
+                <w:sz w:val="20"/>
+              </w:rPr>
+              <w:t>110</w:t>
+            </w:r>
+          </w:p>
+        </w:tc>
+        <w:tc>
+          <w:tcPr>
+            <w:tcW w:type="dxa" w:w="3041"/>
+          </w:tcPr>
+          <w:p>
+            <w:r>
+              <w:rPr>
+                <w:rFonts w:ascii="Courier New" w:hAnsi="Courier New"/>
+                <w:b w:val="0"/>
+                <w:i w:val="0"/>
+                <w:sz w:val="20"/>
+              </w:rPr>
+              <w:t>INC</w:t>
+            </w:r>
+          </w:p>
+        </w:tc>
+        <w:tc>
+          <w:tcPr>
+            <w:tcW w:type="dxa" w:w="3041"/>
+          </w:tcPr>
+          <w:p>
+            <w:r>
+              <w:rPr>
+                <w:rFonts w:ascii="Courier New" w:hAnsi="Courier New"/>
+                <w:b w:val="0"/>
+                <w:i w:val="0"/>
+                <w:sz w:val="20"/>
+              </w:rPr>
+              <w:t>result &lt;- a + 1 (bir arttir)</w:t>
+            </w:r>
+          </w:p>
+        </w:tc>
+      </w:tr>
+      <w:tr>
+        <w:tc>
+          <w:tcPr>
+            <w:tcW w:type="dxa" w:w="3041"/>
+          </w:tcPr>
+          <w:p>
+            <w:r>
+              <w:rPr>
+                <w:rFonts w:ascii="Courier New" w:hAnsi="Courier New"/>
+                <w:b w:val="0"/>
+                <w:i w:val="0"/>
+                <w:sz w:val="20"/>
+              </w:rPr>
+              <w:t>111</w:t>
+            </w:r>
+          </w:p>
+        </w:tc>
+        <w:tc>
+          <w:tcPr>
+            <w:tcW w:type="dxa" w:w="3041"/>
+          </w:tcPr>
+          <w:p>
+            <w:r>
+              <w:rPr>
+                <w:rFonts w:ascii="Courier New" w:hAnsi="Courier New"/>
+                <w:b w:val="0"/>
+                <w:i w:val="0"/>
+                <w:sz w:val="20"/>
+              </w:rPr>
+              <w:t>OR</w:t>
+            </w:r>
+          </w:p>
+        </w:tc>
+        <w:tc>
+          <w:tcPr>
+            <w:tcW w:type="dxa" w:w="3041"/>
+          </w:tcPr>
+          <w:p>
+            <w:r>
+              <w:rPr>
+                <w:rFonts w:ascii="Courier New" w:hAnsi="Courier New"/>
+                <w:b w:val="0"/>
+                <w:i w:val="0"/>
+                <w:sz w:val="20"/>
+              </w:rPr>
+              <w:t>result &lt;- a OR b</w:t>
+            </w:r>
+          </w:p>
+        </w:tc>
+      </w:tr>
+    </w:tbl>
+    <w:p>
+      <w:pPr>
+        <w:spacing w:before="40" w:after="200"/>
+        <w:jc w:val="center"/>
+      </w:pPr>
+      <w:r>
+        <w:rPr>
+          <w:rFonts w:ascii="Courier New" w:hAnsi="Courier New"/>
+          <w:b w:val="0"/>
+          <w:i/>
+          <w:sz w:val="18"/>
+        </w:rPr>
+        <w:t>Tablo 4.2. ALU Islem Kodlari ve Islevleri</w:t>
+      </w:r>
+    </w:p>
+    <w:p>
+      <w:pPr>
+        <w:spacing w:before="0" w:after="120"/>
+        <w:jc w:val="both"/>
+      </w:pPr>
+      <w:r>
+        <w:rPr>
+          <w:rFonts w:ascii="Courier New" w:hAnsi="Courier New"/>
+          <w:b w:val="0"/>
+          <w:i w:val="0"/>
+          <w:sz w:val="20"/>
+        </w:rPr>
+        <w:t>ADD ve INC islemlerinde 17-bitlik ara toplam kullanilarak tasima biti (carry_out) dogal olarak hesaplanmaktadir. SHR isleminde mevcut E biti MSB konumuna yerlestirilir ve LSB yeni E degeri olarak cikarilir. SHL isleminde ise E biti LSB'ye yerlestirilir ve MSB yeni E degeri olarak cikarilir. Bu dairesel kaydirma mekanizmasi Mano bilgisayarinin CIR ve CIL komutlarini dogru bicimde desteklemektedir. (PC1)</w:t>
+      </w:r>
+    </w:p>
+    <w:p>
+      <w:pPr>
+        <w:spacing w:before="160" w:after="80"/>
+        <w:jc w:val="left"/>
+      </w:pPr>
+      <w:r>
+        <w:rPr>
+          <w:rFonts w:ascii="Courier New" w:hAnsi="Courier New"/>
+          <w:b/>
+          <w:i w:val="0"/>
+          <w:sz w:val="20"/>
+        </w:rPr>
+        <w:t>4.1.3. Ana Bellek (RAM)</w:t>
+      </w:r>
+    </w:p>
+    <w:p>
+      <w:pPr>
+        <w:spacing w:before="0" w:after="120"/>
+        <w:jc w:val="both"/>
+      </w:pPr>
+      <w:r>
+        <w:rPr>
+          <w:rFonts w:ascii="Courier New" w:hAnsi="Courier New"/>
+          <w:b w:val="0"/>
+          <w:i w:val="0"/>
+          <w:sz w:val="20"/>
+        </w:rPr>
+        <w:t>RAM modulu 4096 x 16-bitlik senkron bir bellek olarak tasarlanmistir. Saat sinyalinin yukselen kenarinda read veya write sinyaline gore okuma ya da yazma islemi gerceklestirilir. Ayni cevrimde hem read hem write aktif oldugunda yazma onceliklidir. Adres girisi 12-bit genisliginde olup AR (Address Register) tarafindan saglanmaktadir; veri girisi ve cikisi 16-bit genisligindedir. FPGA sentezinde bu modul BRAM (Block RAM) kaynaklarina eslenmektedir. (PC1)</w:t>
+      </w:r>
+    </w:p>
+    <w:tbl>
+      <w:tblPr>
+        <w:tblStyle w:val="TableGrid"/>
+        <w:tblW w:type="auto" w:w="0"/>
+        <w:tblLook w:firstColumn="1" w:firstRow="1" w:lastColumn="0" w:lastRow="0" w:noHBand="0" w:noVBand="1" w:val="04A0"/>
+      </w:tblPr>
+      <w:tblGrid>
+        <w:gridCol w:w="2280"/>
+        <w:gridCol w:w="2280"/>
+        <w:gridCol w:w="2280"/>
+        <w:gridCol w:w="2280"/>
+      </w:tblGrid>
+      <w:tr>
+        <w:tc>
+          <w:tcPr>
+            <w:tcW w:type="dxa" w:w="2280"/>
+          </w:tcPr>
+          <w:p>
+            <w:r>
+              <w:rPr>
+                <w:rFonts w:ascii="Courier New" w:hAnsi="Courier New"/>
+                <w:b/>
+                <w:i w:val="0"/>
+                <w:sz w:val="20"/>
+              </w:rPr>
+              <w:t>Port</w:t>
+            </w:r>
+          </w:p>
+        </w:tc>
+        <w:tc>
+          <w:tcPr>
+            <w:tcW w:type="dxa" w:w="2280"/>
+          </w:tcPr>
+          <w:p>
+            <w:r>
+              <w:rPr>
+                <w:rFonts w:ascii="Courier New" w:hAnsi="Courier New"/>
+                <w:b/>
+                <w:i w:val="0"/>
+                <w:sz w:val="20"/>
+              </w:rPr>
+              <w:t>Yon</w:t>
+            </w:r>
+          </w:p>
+        </w:tc>
+        <w:tc>
+          <w:tcPr>
+            <w:tcW w:type="dxa" w:w="2280"/>
+          </w:tcPr>
+          <w:p>
+            <w:r>
+              <w:rPr>
+                <w:rFonts w:ascii="Courier New" w:hAnsi="Courier New"/>
+                <w:b/>
+                <w:i w:val="0"/>
+                <w:sz w:val="20"/>
+              </w:rPr>
+              <w:t>Genislik</w:t>
+            </w:r>
+          </w:p>
+        </w:tc>
+        <w:tc>
+          <w:tcPr>
+            <w:tcW w:type="dxa" w:w="2280"/>
+          </w:tcPr>
+          <w:p>
+            <w:r>
+              <w:rPr>
+                <w:rFonts w:ascii="Courier New" w:hAnsi="Courier New"/>
+                <w:b/>
+                <w:i w:val="0"/>
+                <w:sz w:val="20"/>
+              </w:rPr>
+              <w:t>Aciklama</w:t>
+            </w:r>
+          </w:p>
+        </w:tc>
+      </w:tr>
+      <w:tr>
+        <w:tc>
+          <w:tcPr>
+            <w:tcW w:type="dxa" w:w="2280"/>
+          </w:tcPr>
+          <w:p>
+            <w:r>
+              <w:rPr>
+                <w:rFonts w:ascii="Courier New" w:hAnsi="Courier New"/>
+                <w:b w:val="0"/>
+                <w:i w:val="0"/>
+                <w:sz w:val="20"/>
+              </w:rPr>
+              <w:t>clk</w:t>
+            </w:r>
+          </w:p>
+        </w:tc>
+        <w:tc>
+          <w:tcPr>
+            <w:tcW w:type="dxa" w:w="2280"/>
+          </w:tcPr>
+          <w:p>
+            <w:r>
+              <w:rPr>
+                <w:rFonts w:ascii="Courier New" w:hAnsi="Courier New"/>
+                <w:b w:val="0"/>
+                <w:i w:val="0"/>
+                <w:sz w:val="20"/>
+              </w:rPr>
+              <w:t>Giris</w:t>
+            </w:r>
+          </w:p>
+        </w:tc>
+        <w:tc>
+          <w:tcPr>
+            <w:tcW w:type="dxa" w:w="2280"/>
+          </w:tcPr>
+          <w:p>
+            <w:r>
+              <w:rPr>
+                <w:rFonts w:ascii="Courier New" w:hAnsi="Courier New"/>
+                <w:b w:val="0"/>
+                <w:i w:val="0"/>
+                <w:sz w:val="20"/>
+              </w:rPr>
+              <w:t>1 bit</w:t>
+            </w:r>
+          </w:p>
+        </w:tc>
+        <w:tc>
+          <w:tcPr>
+            <w:tcW w:type="dxa" w:w="2280"/>
+          </w:tcPr>
+          <w:p>
+            <w:r>
+              <w:rPr>
+                <w:rFonts w:ascii="Courier New" w:hAnsi="Courier New"/>
+                <w:b w:val="0"/>
+                <w:i w:val="0"/>
+                <w:sz w:val="20"/>
+              </w:rPr>
+              <w:t>Sistem saat sinyali</w:t>
+            </w:r>
+          </w:p>
+        </w:tc>
+      </w:tr>
+      <w:tr>
+        <w:tc>
+          <w:tcPr>
+            <w:tcW w:type="dxa" w:w="2280"/>
+          </w:tcPr>
+          <w:p>
+            <w:r>
+              <w:rPr>
+                <w:rFonts w:ascii="Courier New" w:hAnsi="Courier New"/>
+                <w:b w:val="0"/>
+                <w:i w:val="0"/>
+                <w:sz w:val="20"/>
+              </w:rPr>
+              <w:t>address</w:t>
+            </w:r>
+          </w:p>
+        </w:tc>
+        <w:tc>
+          <w:tcPr>
+            <w:tcW w:type="dxa" w:w="2280"/>
+          </w:tcPr>
+          <w:p>
+            <w:r>
+              <w:rPr>
+                <w:rFonts w:ascii="Courier New" w:hAnsi="Courier New"/>
+                <w:b w:val="0"/>
+                <w:i w:val="0"/>
+                <w:sz w:val="20"/>
+              </w:rPr>
+              <w:t>Giris</w:t>
+            </w:r>
+          </w:p>
+        </w:tc>
+        <w:tc>
+          <w:tcPr>
+            <w:tcW w:type="dxa" w:w="2280"/>
+          </w:tcPr>
+          <w:p>
+            <w:r>
+              <w:rPr>
+                <w:rFonts w:ascii="Courier New" w:hAnsi="Courier New"/>
+                <w:b w:val="0"/>
+                <w:i w:val="0"/>
+                <w:sz w:val="20"/>
+              </w:rPr>
+              <w:t>12 bit</w:t>
+            </w:r>
+          </w:p>
+        </w:tc>
+        <w:tc>
+          <w:tcPr>
+            <w:tcW w:type="dxa" w:w="2280"/>
+          </w:tcPr>
+          <w:p>
+            <w:r>
+              <w:rPr>
+                <w:rFonts w:ascii="Courier New" w:hAnsi="Courier New"/>
+                <w:b w:val="0"/>
+                <w:i w:val="0"/>
+                <w:sz w:val="20"/>
+              </w:rPr>
+              <w:t>Bellek adresi (AR'den)</w:t>
+            </w:r>
+          </w:p>
+        </w:tc>
+      </w:tr>
+      <w:tr>
+        <w:tc>
+          <w:tcPr>
+            <w:tcW w:type="dxa" w:w="2280"/>
+          </w:tcPr>
+          <w:p>
+            <w:r>
+              <w:rPr>
+                <w:rFonts w:ascii="Courier New" w:hAnsi="Courier New"/>
+                <w:b w:val="0"/>
+                <w:i w:val="0"/>
+                <w:sz w:val="20"/>
+              </w:rPr>
+              <w:t>data_in</w:t>
+            </w:r>
+          </w:p>
+        </w:tc>
+        <w:tc>
+          <w:tcPr>
+            <w:tcW w:type="dxa" w:w="2280"/>
+          </w:tcPr>
+          <w:p>
+            <w:r>
+              <w:rPr>
+                <w:rFonts w:ascii="Courier New" w:hAnsi="Courier New"/>
+                <w:b w:val="0"/>
+                <w:i w:val="0"/>
+                <w:sz w:val="20"/>
+              </w:rPr>
+              <w:t>Giris</w:t>
+            </w:r>
+          </w:p>
+        </w:tc>
+        <w:tc>
+          <w:tcPr>
+            <w:tcW w:type="dxa" w:w="2280"/>
+          </w:tcPr>
+          <w:p>
+            <w:r>
+              <w:rPr>
+                <w:rFonts w:ascii="Courier New" w:hAnsi="Courier New"/>
+                <w:b w:val="0"/>
+                <w:i w:val="0"/>
+                <w:sz w:val="20"/>
+              </w:rPr>
+              <w:t>16 bit</w:t>
+            </w:r>
+          </w:p>
+        </w:tc>
+        <w:tc>
+          <w:tcPr>
+            <w:tcW w:type="dxa" w:w="2280"/>
+          </w:tcPr>
+          <w:p>
+            <w:r>
+              <w:rPr>
+                <w:rFonts w:ascii="Courier New" w:hAnsi="Courier New"/>
+                <w:b w:val="0"/>
+                <w:i w:val="0"/>
+                <w:sz w:val="20"/>
+              </w:rPr>
+              <w:t>Yazilacak veri (DR'den)</w:t>
+            </w:r>
+          </w:p>
+        </w:tc>
+      </w:tr>
+      <w:tr>
+        <w:tc>
+          <w:tcPr>
+            <w:tcW w:type="dxa" w:w="2280"/>
+          </w:tcPr>
+          <w:p>
+            <w:r>
+              <w:rPr>
+                <w:rFonts w:ascii="Courier New" w:hAnsi="Courier New"/>
+                <w:b w:val="0"/>
+                <w:i w:val="0"/>
+                <w:sz w:val="20"/>
+              </w:rPr>
+              <w:t>read</w:t>
+            </w:r>
+          </w:p>
+        </w:tc>
+        <w:tc>
+          <w:tcPr>
+            <w:tcW w:type="dxa" w:w="2280"/>
+          </w:tcPr>
+          <w:p>
+            <w:r>
+              <w:rPr>
+                <w:rFonts w:ascii="Courier New" w:hAnsi="Courier New"/>
+                <w:b w:val="0"/>
+                <w:i w:val="0"/>
+                <w:sz w:val="20"/>
+              </w:rPr>
+              <w:t>Giris</w:t>
+            </w:r>
+          </w:p>
+        </w:tc>
+        <w:tc>
+          <w:tcPr>
+            <w:tcW w:type="dxa" w:w="2280"/>
+          </w:tcPr>
+          <w:p>
+            <w:r>
+              <w:rPr>
+                <w:rFonts w:ascii="Courier New" w:hAnsi="Courier New"/>
+                <w:b w:val="0"/>
+                <w:i w:val="0"/>
+                <w:sz w:val="20"/>
+              </w:rPr>
+              <w:t>1 bit</w:t>
+            </w:r>
+          </w:p>
+        </w:tc>
+        <w:tc>
+          <w:tcPr>
+            <w:tcW w:type="dxa" w:w="2280"/>
+          </w:tcPr>
+          <w:p>
+            <w:r>
+              <w:rPr>
+                <w:rFonts w:ascii="Courier New" w:hAnsi="Courier New"/>
+                <w:b w:val="0"/>
+                <w:i w:val="0"/>
+                <w:sz w:val="20"/>
+              </w:rPr>
+              <w:t>Okuma izni</w:t>
+            </w:r>
+          </w:p>
+        </w:tc>
+      </w:tr>
+      <w:tr>
+        <w:tc>
+          <w:tcPr>
+            <w:tcW w:type="dxa" w:w="2280"/>
+          </w:tcPr>
+          <w:p>
+            <w:r>
+              <w:rPr>
+                <w:rFonts w:ascii="Courier New" w:hAnsi="Courier New"/>
+                <w:b w:val="0"/>
+                <w:i w:val="0"/>
+                <w:sz w:val="20"/>
+              </w:rPr>
+              <w:t>write</w:t>
+            </w:r>
+          </w:p>
+        </w:tc>
+        <w:tc>
+          <w:tcPr>
+            <w:tcW w:type="dxa" w:w="2280"/>
+          </w:tcPr>
+          <w:p>
+            <w:r>
+              <w:rPr>
+                <w:rFonts w:ascii="Courier New" w:hAnsi="Courier New"/>
+                <w:b w:val="0"/>
+                <w:i w:val="0"/>
+                <w:sz w:val="20"/>
+              </w:rPr>
+              <w:t>Giris</w:t>
+            </w:r>
+          </w:p>
+        </w:tc>
+        <w:tc>
+          <w:tcPr>
+            <w:tcW w:type="dxa" w:w="2280"/>
+          </w:tcPr>
+          <w:p>
+            <w:r>
+              <w:rPr>
+                <w:rFonts w:ascii="Courier New" w:hAnsi="Courier New"/>
+                <w:b w:val="0"/>
+                <w:i w:val="0"/>
+                <w:sz w:val="20"/>
+              </w:rPr>
+              <w:t>1 bit</w:t>
+            </w:r>
+          </w:p>
+        </w:tc>
+        <w:tc>
+          <w:tcPr>
+            <w:tcW w:type="dxa" w:w="2280"/>
+          </w:tcPr>
+          <w:p>
+            <w:r>
+              <w:rPr>
+                <w:rFonts w:ascii="Courier New" w:hAnsi="Courier New"/>
+                <w:b w:val="0"/>
+                <w:i w:val="0"/>
+                <w:sz w:val="20"/>
+              </w:rPr>
+              <w:t>Yazma izni</w:t>
+            </w:r>
+          </w:p>
+        </w:tc>
+      </w:tr>
+      <w:tr>
+        <w:tc>
+          <w:tcPr>
+            <w:tcW w:type="dxa" w:w="2280"/>
+          </w:tcPr>
+          <w:p>
+            <w:r>
+              <w:rPr>
+                <w:rFonts w:ascii="Courier New" w:hAnsi="Courier New"/>
+                <w:b w:val="0"/>
+                <w:i w:val="0"/>
+                <w:sz w:val="20"/>
+              </w:rPr>
+              <w:t>data_out</w:t>
+            </w:r>
+          </w:p>
+        </w:tc>
+        <w:tc>
+          <w:tcPr>
+            <w:tcW w:type="dxa" w:w="2280"/>
+          </w:tcPr>
+          <w:p>
+            <w:r>
+              <w:rPr>
+                <w:rFonts w:ascii="Courier New" w:hAnsi="Courier New"/>
+                <w:b w:val="0"/>
+                <w:i w:val="0"/>
+                <w:sz w:val="20"/>
+              </w:rPr>
+              <w:t>Cikis</w:t>
+            </w:r>
+          </w:p>
+        </w:tc>
+        <w:tc>
+          <w:tcPr>
+            <w:tcW w:type="dxa" w:w="2280"/>
+          </w:tcPr>
+          <w:p>
+            <w:r>
+              <w:rPr>
+                <w:rFonts w:ascii="Courier New" w:hAnsi="Courier New"/>
+                <w:b w:val="0"/>
+                <w:i w:val="0"/>
+                <w:sz w:val="20"/>
+              </w:rPr>
+              <w:t>16 bit</w:t>
+            </w:r>
+          </w:p>
+        </w:tc>
+        <w:tc>
+          <w:tcPr>
+            <w:tcW w:type="dxa" w:w="2280"/>
+          </w:tcPr>
+          <w:p>
+            <w:r>
+              <w:rPr>
+                <w:rFonts w:ascii="Courier New" w:hAnsi="Courier New"/>
+                <w:b w:val="0"/>
+                <w:i w:val="0"/>
+                <w:sz w:val="20"/>
+              </w:rPr>
+              <w:t>Okunan veri</w:t>
+            </w:r>
+          </w:p>
+        </w:tc>
+      </w:tr>
+    </w:tbl>
+    <w:p>
+      <w:pPr>
+        <w:spacing w:before="40" w:after="200"/>
+        <w:jc w:val="center"/>
+      </w:pPr>
+      <w:r>
+        <w:rPr>
+          <w:rFonts w:ascii="Courier New" w:hAnsi="Courier New"/>
+          <w:b w:val="0"/>
+          <w:i/>
+          <w:sz w:val="18"/>
+        </w:rPr>
+        <w:t>Tablo 4.3. ram4096 Modulu Port Listesi</w:t>
+      </w:r>
+    </w:p>
+    <w:p>
+      <w:pPr>
+        <w:spacing w:before="160" w:after="80"/>
+        <w:jc w:val="left"/>
+      </w:pPr>
+      <w:r>
+        <w:rPr>
+          <w:rFonts w:ascii="Courier New" w:hAnsi="Courier New"/>
+          <w:b/>
+          <w:i w:val="0"/>
+          <w:sz w:val="20"/>
+        </w:rPr>
+        <w:t>4.1.4. Ortak Veri Yolu (Common Bus)</w:t>
+      </w:r>
+    </w:p>
+    <w:p>
+      <w:pPr>
+        <w:spacing w:before="0" w:after="120"/>
+        <w:jc w:val="both"/>
+      </w:pPr>
+      <w:r>
+        <w:rPr>
+          <w:rFonts w:ascii="Courier New" w:hAnsi="Courier New"/>
+          <w:b w:val="0"/>
+          <w:i w:val="0"/>
+          <w:sz w:val="20"/>
+        </w:rPr>
+        <w:t>Ortak veri yolu, 3-bitlik secim sinyali (sel) ile 8 farkli kaynaktan birini 16-bitlik veri yoluna baglayan bir cokleyici (multiplexer) yapisindadir. 12-bitlik yazmaclar (AR, PC) veri yoluna baglanirken ust 4 bit sifir ile doldurulur; 8-bitlik INPR giris yazmaci icin ise ust 8 bit sifir ile doldurulmaktadir. Secim sinyalleri mikroprogramlanmis kontrol biriminin F3 alani tarafindan uretilir ve ust modul (mano_computer) icerisinde kontrol sinyallerine gore atanmaktadir. (PC1)</w:t>
+      </w:r>
+    </w:p>
+    <w:tbl>
+      <w:tblPr>
+        <w:tblStyle w:val="TableGrid"/>
+        <w:tblW w:type="auto" w:w="0"/>
+        <w:tblLook w:firstColumn="1" w:firstRow="1" w:lastColumn="0" w:lastRow="0" w:noHBand="0" w:noVBand="1" w:val="04A0"/>
+      </w:tblPr>
+      <w:tblGrid>
+        <w:gridCol w:w="3041"/>
+        <w:gridCol w:w="3041"/>
+        <w:gridCol w:w="3041"/>
+      </w:tblGrid>
+      <w:tr>
+        <w:tc>
+          <w:tcPr>
+            <w:tcW w:type="dxa" w:w="3041"/>
+          </w:tcPr>
+          <w:p>
+            <w:r>
+              <w:rPr>
+                <w:rFonts w:ascii="Courier New" w:hAnsi="Courier New"/>
+                <w:b/>
+                <w:i w:val="0"/>
+                <w:sz w:val="20"/>
+              </w:rPr>
+              <w:t>Secim (sel)</w:t>
+            </w:r>
+          </w:p>
+        </w:tc>
+        <w:tc>
+          <w:tcPr>
+            <w:tcW w:type="dxa" w:w="3041"/>
+          </w:tcPr>
+          <w:p>
+            <w:r>
+              <w:rPr>
+                <w:rFonts w:ascii="Courier New" w:hAnsi="Courier New"/>
+                <w:b/>
+                <w:i w:val="0"/>
+                <w:sz w:val="20"/>
+              </w:rPr>
+              <w:t>Kaynak</w:t>
+            </w:r>
+          </w:p>
+        </w:tc>
+        <w:tc>
+          <w:tcPr>
+            <w:tcW w:type="dxa" w:w="3041"/>
+          </w:tcPr>
+          <w:p>
+            <w:r>
+              <w:rPr>
+                <w:rFonts w:ascii="Courier New" w:hAnsi="Courier New"/>
+                <w:b/>
+                <w:i w:val="0"/>
+                <w:sz w:val="20"/>
+              </w:rPr>
+              <w:t>Aciklama</w:t>
+            </w:r>
+          </w:p>
+        </w:tc>
+      </w:tr>
+      <w:tr>
+        <w:tc>
+          <w:tcPr>
+            <w:tcW w:type="dxa" w:w="3041"/>
+          </w:tcPr>
+          <w:p>
+            <w:r>
+              <w:rPr>
+                <w:rFonts w:ascii="Courier New" w:hAnsi="Courier New"/>
+                <w:b w:val="0"/>
+                <w:i w:val="0"/>
+                <w:sz w:val="20"/>
+              </w:rPr>
+              <w:t>000</w:t>
+            </w:r>
+          </w:p>
+        </w:tc>
+        <w:tc>
+          <w:tcPr>
+            <w:tcW w:type="dxa" w:w="3041"/>
+          </w:tcPr>
+          <w:p>
+            <w:r>
+              <w:rPr>
+                <w:rFonts w:ascii="Courier New" w:hAnsi="Courier New"/>
+                <w:b w:val="0"/>
+                <w:i w:val="0"/>
+                <w:sz w:val="20"/>
+              </w:rPr>
+              <w:t>(yok / HiZ)</w:t>
+            </w:r>
+          </w:p>
+        </w:tc>
+        <w:tc>
+          <w:tcPr>
+            <w:tcW w:type="dxa" w:w="3041"/>
+          </w:tcPr>
+          <w:p>
+            <w:r>
+              <w:rPr>
+                <w:rFonts w:ascii="Courier New" w:hAnsi="Courier New"/>
+                <w:b w:val="0"/>
+                <w:i w:val="0"/>
+                <w:sz w:val="20"/>
+              </w:rPr>
+              <w:t>Hicbir kaynak secilmemis, bus = 0</w:t>
+            </w:r>
+          </w:p>
+        </w:tc>
+      </w:tr>
+      <w:tr>
+        <w:tc>
+          <w:tcPr>
+            <w:tcW w:type="dxa" w:w="3041"/>
+          </w:tcPr>
+          <w:p>
+            <w:r>
+              <w:rPr>
+                <w:rFonts w:ascii="Courier New" w:hAnsi="Courier New"/>
+                <w:b w:val="0"/>
+                <w:i w:val="0"/>
+                <w:sz w:val="20"/>
+              </w:rPr>
+              <w:t>001</w:t>
+            </w:r>
+          </w:p>
+        </w:tc>
+        <w:tc>
+          <w:tcPr>
+            <w:tcW w:type="dxa" w:w="3041"/>
+          </w:tcPr>
+          <w:p>
+            <w:r>
+              <w:rPr>
+                <w:rFonts w:ascii="Courier New" w:hAnsi="Courier New"/>
+                <w:b w:val="0"/>
+                <w:i w:val="0"/>
+                <w:sz w:val="20"/>
+              </w:rPr>
+              <w:t>AR (12-bit)</w:t>
+            </w:r>
+          </w:p>
+        </w:tc>
+        <w:tc>
+          <w:tcPr>
+            <w:tcW w:type="dxa" w:w="3041"/>
+          </w:tcPr>
+          <w:p>
+            <w:r>
+              <w:rPr>
+                <w:rFonts w:ascii="Courier New" w:hAnsi="Courier New"/>
+                <w:b w:val="0"/>
+                <w:i w:val="0"/>
+                <w:sz w:val="20"/>
+              </w:rPr>
+              <w:t>Ust 4 bit sifir doldurulur</w:t>
+            </w:r>
+          </w:p>
+        </w:tc>
+      </w:tr>
+      <w:tr>
+        <w:tc>
+          <w:tcPr>
+            <w:tcW w:type="dxa" w:w="3041"/>
+          </w:tcPr>
+          <w:p>
+            <w:r>
+              <w:rPr>
+                <w:rFonts w:ascii="Courier New" w:hAnsi="Courier New"/>
+                <w:b w:val="0"/>
+                <w:i w:val="0"/>
+                <w:sz w:val="20"/>
+              </w:rPr>
+              <w:t>010</w:t>
+            </w:r>
+          </w:p>
+        </w:tc>
+        <w:tc>
+          <w:tcPr>
+            <w:tcW w:type="dxa" w:w="3041"/>
+          </w:tcPr>
+          <w:p>
+            <w:r>
+              <w:rPr>
+                <w:rFonts w:ascii="Courier New" w:hAnsi="Courier New"/>
+                <w:b w:val="0"/>
+                <w:i w:val="0"/>
+                <w:sz w:val="20"/>
+              </w:rPr>
+              <w:t>PC (12-bit)</w:t>
+            </w:r>
+          </w:p>
+        </w:tc>
+        <w:tc>
+          <w:tcPr>
+            <w:tcW w:type="dxa" w:w="3041"/>
+          </w:tcPr>
+          <w:p>
+            <w:r>
+              <w:rPr>
+                <w:rFonts w:ascii="Courier New" w:hAnsi="Courier New"/>
+                <w:b w:val="0"/>
+                <w:i w:val="0"/>
+                <w:sz w:val="20"/>
+              </w:rPr>
+              <w:t>Ust 4 bit sifir doldurulur</w:t>
+            </w:r>
+          </w:p>
+        </w:tc>
+      </w:tr>
+      <w:tr>
+        <w:tc>
+          <w:tcPr>
+            <w:tcW w:type="dxa" w:w="3041"/>
+          </w:tcPr>
+          <w:p>
+            <w:r>
+              <w:rPr>
+                <w:rFonts w:ascii="Courier New" w:hAnsi="Courier New"/>
+                <w:b w:val="0"/>
+                <w:i w:val="0"/>
+                <w:sz w:val="20"/>
+              </w:rPr>
+              <w:t>011</w:t>
+            </w:r>
+          </w:p>
+        </w:tc>
+        <w:tc>
+          <w:tcPr>
+            <w:tcW w:type="dxa" w:w="3041"/>
+          </w:tcPr>
+          <w:p>
+            <w:r>
+              <w:rPr>
+                <w:rFonts w:ascii="Courier New" w:hAnsi="Courier New"/>
+                <w:b w:val="0"/>
+                <w:i w:val="0"/>
+                <w:sz w:val="20"/>
+              </w:rPr>
+              <w:t>DR (16-bit)</w:t>
+            </w:r>
+          </w:p>
+        </w:tc>
+        <w:tc>
+          <w:tcPr>
+            <w:tcW w:type="dxa" w:w="3041"/>
+          </w:tcPr>
+          <w:p>
+            <w:r>
+              <w:rPr>
+                <w:rFonts w:ascii="Courier New" w:hAnsi="Courier New"/>
+                <w:b w:val="0"/>
+                <w:i w:val="0"/>
+                <w:sz w:val="20"/>
+              </w:rPr>
+              <w:t>Tam 16-bit veri aktarimi</w:t>
+            </w:r>
+          </w:p>
+        </w:tc>
+      </w:tr>
+      <w:tr>
+        <w:tc>
+          <w:tcPr>
+            <w:tcW w:type="dxa" w:w="3041"/>
+          </w:tcPr>
+          <w:p>
+            <w:r>
+              <w:rPr>
+                <w:rFonts w:ascii="Courier New" w:hAnsi="Courier New"/>
+                <w:b w:val="0"/>
+                <w:i w:val="0"/>
+                <w:sz w:val="20"/>
+              </w:rPr>
+              <w:t>100</w:t>
+            </w:r>
+          </w:p>
+        </w:tc>
+        <w:tc>
+          <w:tcPr>
+            <w:tcW w:type="dxa" w:w="3041"/>
+          </w:tcPr>
+          <w:p>
+            <w:r>
+              <w:rPr>
+                <w:rFonts w:ascii="Courier New" w:hAnsi="Courier New"/>
+                <w:b w:val="0"/>
+                <w:i w:val="0"/>
+                <w:sz w:val="20"/>
+              </w:rPr>
+              <w:t>AC (16-bit)</w:t>
+            </w:r>
+          </w:p>
+        </w:tc>
+        <w:tc>
+          <w:tcPr>
+            <w:tcW w:type="dxa" w:w="3041"/>
+          </w:tcPr>
+          <w:p>
+            <w:r>
+              <w:rPr>
+                <w:rFonts w:ascii="Courier New" w:hAnsi="Courier New"/>
+                <w:b w:val="0"/>
+                <w:i w:val="0"/>
+                <w:sz w:val="20"/>
+              </w:rPr>
+              <w:t>Tam 16-bit veri aktarimi</w:t>
+            </w:r>
+          </w:p>
+        </w:tc>
+      </w:tr>
+      <w:tr>
+        <w:tc>
+          <w:tcPr>
+            <w:tcW w:type="dxa" w:w="3041"/>
+          </w:tcPr>
+          <w:p>
+            <w:r>
+              <w:rPr>
+                <w:rFonts w:ascii="Courier New" w:hAnsi="Courier New"/>
+                <w:b w:val="0"/>
+                <w:i w:val="0"/>
+                <w:sz w:val="20"/>
+              </w:rPr>
+              <w:t>101</w:t>
+            </w:r>
+          </w:p>
+        </w:tc>
+        <w:tc>
+          <w:tcPr>
+            <w:tcW w:type="dxa" w:w="3041"/>
+          </w:tcPr>
+          <w:p>
+            <w:r>
+              <w:rPr>
+                <w:rFonts w:ascii="Courier New" w:hAnsi="Courier New"/>
+                <w:b w:val="0"/>
+                <w:i w:val="0"/>
+                <w:sz w:val="20"/>
+              </w:rPr>
+              <w:t>IR (16-bit)</w:t>
+            </w:r>
+          </w:p>
+        </w:tc>
+        <w:tc>
+          <w:tcPr>
+            <w:tcW w:type="dxa" w:w="3041"/>
+          </w:tcPr>
+          <w:p>
+            <w:r>
+              <w:rPr>
+                <w:rFonts w:ascii="Courier New" w:hAnsi="Courier New"/>
+                <w:b w:val="0"/>
+                <w:i w:val="0"/>
+                <w:sz w:val="20"/>
+              </w:rPr>
+              <w:t>Tam 16-bit veri aktarimi</w:t>
+            </w:r>
+          </w:p>
+        </w:tc>
+      </w:tr>
+      <w:tr>
+        <w:tc>
+          <w:tcPr>
+            <w:tcW w:type="dxa" w:w="3041"/>
+          </w:tcPr>
+          <w:p>
+            <w:r>
+              <w:rPr>
+                <w:rFonts w:ascii="Courier New" w:hAnsi="Courier New"/>
+                <w:b w:val="0"/>
+                <w:i w:val="0"/>
+                <w:sz w:val="20"/>
+              </w:rPr>
+              <w:t>110</w:t>
+            </w:r>
+          </w:p>
+        </w:tc>
+        <w:tc>
+          <w:tcPr>
+            <w:tcW w:type="dxa" w:w="3041"/>
+          </w:tcPr>
+          <w:p>
+            <w:r>
+              <w:rPr>
+                <w:rFonts w:ascii="Courier New" w:hAnsi="Courier New"/>
+                <w:b w:val="0"/>
+                <w:i w:val="0"/>
+                <w:sz w:val="20"/>
+              </w:rPr>
+              <w:t>TR (16-bit)</w:t>
+            </w:r>
+          </w:p>
+        </w:tc>
+        <w:tc>
+          <w:tcPr>
+            <w:tcW w:type="dxa" w:w="3041"/>
+          </w:tcPr>
+          <w:p>
+            <w:r>
+              <w:rPr>
+                <w:rFonts w:ascii="Courier New" w:hAnsi="Courier New"/>
+                <w:b w:val="0"/>
+                <w:i w:val="0"/>
+                <w:sz w:val="20"/>
+              </w:rPr>
+              <w:t>Tam 16-bit veri aktarimi</w:t>
+            </w:r>
+          </w:p>
+        </w:tc>
+      </w:tr>
+      <w:tr>
+        <w:tc>
+          <w:tcPr>
+            <w:tcW w:type="dxa" w:w="3041"/>
+          </w:tcPr>
+          <w:p>
+            <w:r>
+              <w:rPr>
+                <w:rFonts w:ascii="Courier New" w:hAnsi="Courier New"/>
+                <w:b w:val="0"/>
+                <w:i w:val="0"/>
+                <w:sz w:val="20"/>
+              </w:rPr>
+              <w:t>111</w:t>
+            </w:r>
+          </w:p>
+        </w:tc>
+        <w:tc>
+          <w:tcPr>
+            <w:tcW w:type="dxa" w:w="3041"/>
+          </w:tcPr>
+          <w:p>
+            <w:r>
+              <w:rPr>
+                <w:rFonts w:ascii="Courier New" w:hAnsi="Courier New"/>
+                <w:b w:val="0"/>
+                <w:i w:val="0"/>
+                <w:sz w:val="20"/>
+              </w:rPr>
+              <w:t>INPR (8-bit)</w:t>
+            </w:r>
+          </w:p>
+        </w:tc>
+        <w:tc>
+          <w:tcPr>
+            <w:tcW w:type="dxa" w:w="3041"/>
+          </w:tcPr>
+          <w:p>
+            <w:r>
+              <w:rPr>
+                <w:rFonts w:ascii="Courier New" w:hAnsi="Courier New"/>
+                <w:b w:val="0"/>
+                <w:i w:val="0"/>
+                <w:sz w:val="20"/>
+              </w:rPr>
+              <w:t>Ust 8 bit sifir doldurulur</w:t>
+            </w:r>
+          </w:p>
+        </w:tc>
+      </w:tr>
+    </w:tbl>
+    <w:p>
+      <w:pPr>
+        <w:spacing w:before="40" w:after="200"/>
+        <w:jc w:val="center"/>
+      </w:pPr>
+      <w:r>
+        <w:rPr>
+          <w:rFonts w:ascii="Courier New" w:hAnsi="Courier New"/>
+          <w:b w:val="0"/>
+          <w:i/>
+          <w:sz w:val="18"/>
+        </w:rPr>
+        <w:t>Tablo 4.4. Ortak Veri Yolu Kaynak Secim Tablosu</w:t>
+      </w:r>
+    </w:p>
+    <w:p>
+      <w:pPr>
+        <w:spacing w:before="160" w:after="80"/>
+        <w:jc w:val="left"/>
+      </w:pPr>
+      <w:r>
+        <w:rPr>
+          <w:rFonts w:ascii="Courier New" w:hAnsi="Courier New"/>
+          <w:b/>
+          <w:i w:val="0"/>
+          <w:sz w:val="20"/>
+        </w:rPr>
+        <w:t>4.1.5. Tasarim Kararlari</w:t>
+      </w:r>
+    </w:p>
+    <w:p>
+      <w:pPr>
+        <w:spacing w:before="0" w:after="120"/>
+        <w:jc w:val="both"/>
+      </w:pPr>
+      <w:r>
+        <w:rPr>
+          <w:rFonts w:ascii="Courier New" w:hAnsi="Courier New"/>
+          <w:b w:val="0"/>
+          <w:i w:val="0"/>
+          <w:sz w:val="20"/>
+        </w:rPr>
+        <w:t>Veri yolu tasariminda alinan temel kararlar sunlardir: (i) Tum yazmaclar senkron tasarim prensibiyle gerceklenmis olup asenkron reset destegi yalnizca sistem baslatma icin kullanilmaktadir; bu yaklasim FPGA sentezinde guvenilir zamanlama saglamaktadir. (ii) RAM modulu tek portlu senkron bellek olarak tasarlanmistir; ayni cevrimde okuma ve yazma catismasini onlemek icin yazma islemine oncelik verilmektedir. (iii) Ortak veri yolu 16-bit genisliginde secilmis olup dar yazmaclar (AR: 12-bit, INPR: 8-bit) sifir uzatma (zero-extension) ile veri yoluna baglanmaktadir. (iv) ALU tamamen kombinasyonel olarak tasarlanmistir; sonuclarin yazmaclara yansitilmasi saat kenarinda kontrol sinyalleriyle saglanmaktadir. (v) Yazmac modullerinde oncelik sirasi clr &gt; load &gt; inc olarak belirlenerek tasarim belirliligini garanti altina almaktadir. (PC1, PC5)</w:t>
       </w:r>
     </w:p>
     <w:p>
@@ -2968,17 +5116,31 @@
     <w:p>
       <w:pPr>
         <w:spacing w:before="0" w:after="120"/>
+        <w:jc w:val="both"/>
+      </w:pPr>
+      <w:r>
+        <w:rPr>
+          <w:rFonts w:ascii="Courier New" w:hAnsi="Courier New"/>
+          <w:b w:val="0"/>
+          <w:i w:val="0"/>
+          <w:sz w:val="20"/>
+        </w:rPr>
+        <w:t>Sistemin tamami VHDL donanim tanimlama dili ile gelistirilmistir. Tasarim ve simulasyon asamalarinda Xilinx Vivado ortami kullanilmis; tum modullerde IEEE STD_LOGIC_1164 ve NUMERIC_STD kutuphaneleri tercih edilmistir. Modul hiyerarsisi uc katmandan olusmaktadir. (PC5)</w:t>
+      </w:r>
+    </w:p>
+    <w:p>
+      <w:pPr>
+        <w:spacing w:before="160" w:after="80"/>
         <w:jc w:val="left"/>
       </w:pPr>
       <w:r>
         <w:rPr>
           <w:rFonts w:ascii="Courier New" w:hAnsi="Courier New"/>
-          <w:b w:val="0"/>
-          <w:i/>
-          <w:color w:val="CC0000"/>
+          <w:b/>
+          <w:i w:val="0"/>
           <w:sz w:val="20"/>
         </w:rPr>
-        <w:t>[NOT — TESLIMDEN ONCE SILIN: Bu alt bolum Kisi 2 ve Kisi 3 tarafindan yazilacaktir. Modul hiyerarsisi, arac bilgileri ve kritik kod kesitleri eklenecek.]</w:t>
+        <w:t>5.1.1. Modul Hiyerarsisi</w:t>
       </w:r>
     </w:p>
     <w:p>
@@ -2993,7 +5155,902 @@
           <w:i w:val="0"/>
           <w:sz w:val="20"/>
         </w:rPr>
-        <w:t>Sistemin tamami VHDL donanim tanimlama dili ile gelistirilmistir. Modul hiyerarsisi uc katmandan olusur: temel bilesenleri iceren veri yolu katmani (reg16, reg12, alu, ram4096, common_bus), kontrol birimini olusturan katman (control_memory, car_sbr, microinstruction_decoder) ve bunlari birlestiren ust modul (mano_computer). Xilinx Vivado ortami tasarim, simulasyon ve sentez asamalarinin tumu icin kullanilmistir. (PC5)</w:t>
+        <w:t>Birinci katman olan veri yolu katmani, temel veri depolama ve islem bilesenlerini icerir: reg16 (16-bit yazmac, 4 ornekleme: AC, DR, TR, IR), reg12 (12-bit yazmac, 2 ornekleme: AR, PC), alu (aritmetik-mantiksal birim), ram4096 (ana bellek) ve common_bus (ortak veri yolu). Bu katmandaki bilesenler kontrol biriminden bagimsiz olarak test edilebilir yapidadir. (PC5)</w:t>
+      </w:r>
+    </w:p>
+    <w:p>
+      <w:pPr>
+        <w:spacing w:before="0" w:after="120"/>
+        <w:jc w:val="both"/>
+      </w:pPr>
+      <w:r>
+        <w:rPr>
+          <w:rFonts w:ascii="Courier New" w:hAnsi="Courier New"/>
+          <w:b w:val="0"/>
+          <w:i w:val="0"/>
+          <w:sz w:val="20"/>
+        </w:rPr>
+        <w:t>Ikinci katman olan kontrol birimi katmani, mikroprogramlanmis kontrol mimarisinin cekirdek bilesenlerini barindirir: car (Control Address Register, 7-bit), sbr (Subroutine Register, 7-bit), control_memory (128 x 20-bit ROM) ve microinstruction_decoder (mikrokomut cozucu). Bu bilesenler, kontrol birimi ust modulu (control_unit) icerisinde birlestirilmistir. (PC5)</w:t>
+      </w:r>
+    </w:p>
+    <w:p>
+      <w:pPr>
+        <w:spacing w:before="0" w:after="120"/>
+        <w:jc w:val="both"/>
+      </w:pPr>
+      <w:r>
+        <w:rPr>
+          <w:rFonts w:ascii="Courier New" w:hAnsi="Courier New"/>
+          <w:b w:val="0"/>
+          <w:i w:val="0"/>
+          <w:sz w:val="20"/>
+        </w:rPr>
+        <w:t>Ucuncu katman, mano_computer ust moduludur. Bu modul veri yolu katmani ile kontrol birimi katmanini yapisal (structural) mimari kullanarak birlestirir. Kontrol biriminden gelen F1, F2, F3 sinyalleri, ust modul icerisinde yazmac yukleme, ALU islem kodu secimi, bus kaynagi secimi ve E biti guncelleme mantigina donusturulmektedir. (PC5)</w:t>
+      </w:r>
+    </w:p>
+    <w:tbl>
+      <w:tblPr>
+        <w:tblStyle w:val="TableGrid"/>
+        <w:tblW w:type="auto" w:w="0"/>
+        <w:tblLook w:firstColumn="1" w:firstRow="1" w:lastColumn="0" w:lastRow="0" w:noHBand="0" w:noVBand="1" w:val="04A0"/>
+      </w:tblPr>
+      <w:tblGrid>
+        <w:gridCol w:w="2280"/>
+        <w:gridCol w:w="2280"/>
+        <w:gridCol w:w="2280"/>
+        <w:gridCol w:w="2280"/>
+      </w:tblGrid>
+      <w:tr>
+        <w:tc>
+          <w:tcPr>
+            <w:tcW w:type="dxa" w:w="2280"/>
+          </w:tcPr>
+          <w:p>
+            <w:r>
+              <w:rPr>
+                <w:rFonts w:ascii="Courier New" w:hAnsi="Courier New"/>
+                <w:b/>
+                <w:i w:val="0"/>
+                <w:sz w:val="20"/>
+              </w:rPr>
+              <w:t>Modul</w:t>
+            </w:r>
+          </w:p>
+        </w:tc>
+        <w:tc>
+          <w:tcPr>
+            <w:tcW w:type="dxa" w:w="2280"/>
+          </w:tcPr>
+          <w:p>
+            <w:r>
+              <w:rPr>
+                <w:rFonts w:ascii="Courier New" w:hAnsi="Courier New"/>
+                <w:b/>
+                <w:i w:val="0"/>
+                <w:sz w:val="20"/>
+              </w:rPr>
+              <w:t>Dosya</w:t>
+            </w:r>
+          </w:p>
+        </w:tc>
+        <w:tc>
+          <w:tcPr>
+            <w:tcW w:type="dxa" w:w="2280"/>
+          </w:tcPr>
+          <w:p>
+            <w:r>
+              <w:rPr>
+                <w:rFonts w:ascii="Courier New" w:hAnsi="Courier New"/>
+                <w:b/>
+                <w:i w:val="0"/>
+                <w:sz w:val="20"/>
+              </w:rPr>
+              <w:t>Katman</w:t>
+            </w:r>
+          </w:p>
+        </w:tc>
+        <w:tc>
+          <w:tcPr>
+            <w:tcW w:type="dxa" w:w="2280"/>
+          </w:tcPr>
+          <w:p>
+            <w:r>
+              <w:rPr>
+                <w:rFonts w:ascii="Courier New" w:hAnsi="Courier New"/>
+                <w:b/>
+                <w:i w:val="0"/>
+                <w:sz w:val="20"/>
+              </w:rPr>
+              <w:t>Islev</w:t>
+            </w:r>
+          </w:p>
+        </w:tc>
+      </w:tr>
+      <w:tr>
+        <w:tc>
+          <w:tcPr>
+            <w:tcW w:type="dxa" w:w="2280"/>
+          </w:tcPr>
+          <w:p>
+            <w:r>
+              <w:rPr>
+                <w:rFonts w:ascii="Courier New" w:hAnsi="Courier New"/>
+                <w:b w:val="0"/>
+                <w:i w:val="0"/>
+                <w:sz w:val="20"/>
+              </w:rPr>
+              <w:t>reg16</w:t>
+            </w:r>
+          </w:p>
+        </w:tc>
+        <w:tc>
+          <w:tcPr>
+            <w:tcW w:type="dxa" w:w="2280"/>
+          </w:tcPr>
+          <w:p>
+            <w:r>
+              <w:rPr>
+                <w:rFonts w:ascii="Courier New" w:hAnsi="Courier New"/>
+                <w:b w:val="0"/>
+                <w:i w:val="0"/>
+                <w:sz w:val="20"/>
+              </w:rPr>
+              <w:t>reg16.vhd</w:t>
+            </w:r>
+          </w:p>
+        </w:tc>
+        <w:tc>
+          <w:tcPr>
+            <w:tcW w:type="dxa" w:w="2280"/>
+          </w:tcPr>
+          <w:p>
+            <w:r>
+              <w:rPr>
+                <w:rFonts w:ascii="Courier New" w:hAnsi="Courier New"/>
+                <w:b w:val="0"/>
+                <w:i w:val="0"/>
+                <w:sz w:val="20"/>
+              </w:rPr>
+              <w:t>Veri Yolu</w:t>
+            </w:r>
+          </w:p>
+        </w:tc>
+        <w:tc>
+          <w:tcPr>
+            <w:tcW w:type="dxa" w:w="2280"/>
+          </w:tcPr>
+          <w:p>
+            <w:r>
+              <w:rPr>
+                <w:rFonts w:ascii="Courier New" w:hAnsi="Courier New"/>
+                <w:b w:val="0"/>
+                <w:i w:val="0"/>
+                <w:sz w:val="20"/>
+              </w:rPr>
+              <w:t>16-bit yazmac (AC, DR, TR, IR)</w:t>
+            </w:r>
+          </w:p>
+        </w:tc>
+      </w:tr>
+      <w:tr>
+        <w:tc>
+          <w:tcPr>
+            <w:tcW w:type="dxa" w:w="2280"/>
+          </w:tcPr>
+          <w:p>
+            <w:r>
+              <w:rPr>
+                <w:rFonts w:ascii="Courier New" w:hAnsi="Courier New"/>
+                <w:b w:val="0"/>
+                <w:i w:val="0"/>
+                <w:sz w:val="20"/>
+              </w:rPr>
+              <w:t>reg12</w:t>
+            </w:r>
+          </w:p>
+        </w:tc>
+        <w:tc>
+          <w:tcPr>
+            <w:tcW w:type="dxa" w:w="2280"/>
+          </w:tcPr>
+          <w:p>
+            <w:r>
+              <w:rPr>
+                <w:rFonts w:ascii="Courier New" w:hAnsi="Courier New"/>
+                <w:b w:val="0"/>
+                <w:i w:val="0"/>
+                <w:sz w:val="20"/>
+              </w:rPr>
+              <w:t>reg12.vhd</w:t>
+            </w:r>
+          </w:p>
+        </w:tc>
+        <w:tc>
+          <w:tcPr>
+            <w:tcW w:type="dxa" w:w="2280"/>
+          </w:tcPr>
+          <w:p>
+            <w:r>
+              <w:rPr>
+                <w:rFonts w:ascii="Courier New" w:hAnsi="Courier New"/>
+                <w:b w:val="0"/>
+                <w:i w:val="0"/>
+                <w:sz w:val="20"/>
+              </w:rPr>
+              <w:t>Veri Yolu</w:t>
+            </w:r>
+          </w:p>
+        </w:tc>
+        <w:tc>
+          <w:tcPr>
+            <w:tcW w:type="dxa" w:w="2280"/>
+          </w:tcPr>
+          <w:p>
+            <w:r>
+              <w:rPr>
+                <w:rFonts w:ascii="Courier New" w:hAnsi="Courier New"/>
+                <w:b w:val="0"/>
+                <w:i w:val="0"/>
+                <w:sz w:val="20"/>
+              </w:rPr>
+              <w:t>12-bit yazmac (AR, PC)</w:t>
+            </w:r>
+          </w:p>
+        </w:tc>
+      </w:tr>
+      <w:tr>
+        <w:tc>
+          <w:tcPr>
+            <w:tcW w:type="dxa" w:w="2280"/>
+          </w:tcPr>
+          <w:p>
+            <w:r>
+              <w:rPr>
+                <w:rFonts w:ascii="Courier New" w:hAnsi="Courier New"/>
+                <w:b w:val="0"/>
+                <w:i w:val="0"/>
+                <w:sz w:val="20"/>
+              </w:rPr>
+              <w:t>alu</w:t>
+            </w:r>
+          </w:p>
+        </w:tc>
+        <w:tc>
+          <w:tcPr>
+            <w:tcW w:type="dxa" w:w="2280"/>
+          </w:tcPr>
+          <w:p>
+            <w:r>
+              <w:rPr>
+                <w:rFonts w:ascii="Courier New" w:hAnsi="Courier New"/>
+                <w:b w:val="0"/>
+                <w:i w:val="0"/>
+                <w:sz w:val="20"/>
+              </w:rPr>
+              <w:t>alu.vhd</w:t>
+            </w:r>
+          </w:p>
+        </w:tc>
+        <w:tc>
+          <w:tcPr>
+            <w:tcW w:type="dxa" w:w="2280"/>
+          </w:tcPr>
+          <w:p>
+            <w:r>
+              <w:rPr>
+                <w:rFonts w:ascii="Courier New" w:hAnsi="Courier New"/>
+                <w:b w:val="0"/>
+                <w:i w:val="0"/>
+                <w:sz w:val="20"/>
+              </w:rPr>
+              <w:t>Veri Yolu</w:t>
+            </w:r>
+          </w:p>
+        </w:tc>
+        <w:tc>
+          <w:tcPr>
+            <w:tcW w:type="dxa" w:w="2280"/>
+          </w:tcPr>
+          <w:p>
+            <w:r>
+              <w:rPr>
+                <w:rFonts w:ascii="Courier New" w:hAnsi="Courier New"/>
+                <w:b w:val="0"/>
+                <w:i w:val="0"/>
+                <w:sz w:val="20"/>
+              </w:rPr>
+              <w:t>8 islemli ALU birimi</w:t>
+            </w:r>
+          </w:p>
+        </w:tc>
+      </w:tr>
+      <w:tr>
+        <w:tc>
+          <w:tcPr>
+            <w:tcW w:type="dxa" w:w="2280"/>
+          </w:tcPr>
+          <w:p>
+            <w:r>
+              <w:rPr>
+                <w:rFonts w:ascii="Courier New" w:hAnsi="Courier New"/>
+                <w:b w:val="0"/>
+                <w:i w:val="0"/>
+                <w:sz w:val="20"/>
+              </w:rPr>
+              <w:t>ram4096</w:t>
+            </w:r>
+          </w:p>
+        </w:tc>
+        <w:tc>
+          <w:tcPr>
+            <w:tcW w:type="dxa" w:w="2280"/>
+          </w:tcPr>
+          <w:p>
+            <w:r>
+              <w:rPr>
+                <w:rFonts w:ascii="Courier New" w:hAnsi="Courier New"/>
+                <w:b w:val="0"/>
+                <w:i w:val="0"/>
+                <w:sz w:val="20"/>
+              </w:rPr>
+              <w:t>ram4096.vhd</w:t>
+            </w:r>
+          </w:p>
+        </w:tc>
+        <w:tc>
+          <w:tcPr>
+            <w:tcW w:type="dxa" w:w="2280"/>
+          </w:tcPr>
+          <w:p>
+            <w:r>
+              <w:rPr>
+                <w:rFonts w:ascii="Courier New" w:hAnsi="Courier New"/>
+                <w:b w:val="0"/>
+                <w:i w:val="0"/>
+                <w:sz w:val="20"/>
+              </w:rPr>
+              <w:t>Veri Yolu</w:t>
+            </w:r>
+          </w:p>
+        </w:tc>
+        <w:tc>
+          <w:tcPr>
+            <w:tcW w:type="dxa" w:w="2280"/>
+          </w:tcPr>
+          <w:p>
+            <w:r>
+              <w:rPr>
+                <w:rFonts w:ascii="Courier New" w:hAnsi="Courier New"/>
+                <w:b w:val="0"/>
+                <w:i w:val="0"/>
+                <w:sz w:val="20"/>
+              </w:rPr>
+              <w:t>4096x16 senkron bellek</w:t>
+            </w:r>
+          </w:p>
+        </w:tc>
+      </w:tr>
+      <w:tr>
+        <w:tc>
+          <w:tcPr>
+            <w:tcW w:type="dxa" w:w="2280"/>
+          </w:tcPr>
+          <w:p>
+            <w:r>
+              <w:rPr>
+                <w:rFonts w:ascii="Courier New" w:hAnsi="Courier New"/>
+                <w:b w:val="0"/>
+                <w:i w:val="0"/>
+                <w:sz w:val="20"/>
+              </w:rPr>
+              <w:t>common_bus</w:t>
+            </w:r>
+          </w:p>
+        </w:tc>
+        <w:tc>
+          <w:tcPr>
+            <w:tcW w:type="dxa" w:w="2280"/>
+          </w:tcPr>
+          <w:p>
+            <w:r>
+              <w:rPr>
+                <w:rFonts w:ascii="Courier New" w:hAnsi="Courier New"/>
+                <w:b w:val="0"/>
+                <w:i w:val="0"/>
+                <w:sz w:val="20"/>
+              </w:rPr>
+              <w:t>common_bus.vhd</w:t>
+            </w:r>
+          </w:p>
+        </w:tc>
+        <w:tc>
+          <w:tcPr>
+            <w:tcW w:type="dxa" w:w="2280"/>
+          </w:tcPr>
+          <w:p>
+            <w:r>
+              <w:rPr>
+                <w:rFonts w:ascii="Courier New" w:hAnsi="Courier New"/>
+                <w:b w:val="0"/>
+                <w:i w:val="0"/>
+                <w:sz w:val="20"/>
+              </w:rPr>
+              <w:t>Veri Yolu</w:t>
+            </w:r>
+          </w:p>
+        </w:tc>
+        <w:tc>
+          <w:tcPr>
+            <w:tcW w:type="dxa" w:w="2280"/>
+          </w:tcPr>
+          <w:p>
+            <w:r>
+              <w:rPr>
+                <w:rFonts w:ascii="Courier New" w:hAnsi="Courier New"/>
+                <w:b w:val="0"/>
+                <w:i w:val="0"/>
+                <w:sz w:val="20"/>
+              </w:rPr>
+              <w:t>8 kaynakli ortak veri yolu</w:t>
+            </w:r>
+          </w:p>
+        </w:tc>
+      </w:tr>
+      <w:tr>
+        <w:tc>
+          <w:tcPr>
+            <w:tcW w:type="dxa" w:w="2280"/>
+          </w:tcPr>
+          <w:p>
+            <w:r>
+              <w:rPr>
+                <w:rFonts w:ascii="Courier New" w:hAnsi="Courier New"/>
+                <w:b w:val="0"/>
+                <w:i w:val="0"/>
+                <w:sz w:val="20"/>
+              </w:rPr>
+              <w:t>car</w:t>
+            </w:r>
+          </w:p>
+        </w:tc>
+        <w:tc>
+          <w:tcPr>
+            <w:tcW w:type="dxa" w:w="2280"/>
+          </w:tcPr>
+          <w:p>
+            <w:r>
+              <w:rPr>
+                <w:rFonts w:ascii="Courier New" w:hAnsi="Courier New"/>
+                <w:b w:val="0"/>
+                <w:i w:val="0"/>
+                <w:sz w:val="20"/>
+              </w:rPr>
+              <w:t>car.vhd</w:t>
+            </w:r>
+          </w:p>
+        </w:tc>
+        <w:tc>
+          <w:tcPr>
+            <w:tcW w:type="dxa" w:w="2280"/>
+          </w:tcPr>
+          <w:p>
+            <w:r>
+              <w:rPr>
+                <w:rFonts w:ascii="Courier New" w:hAnsi="Courier New"/>
+                <w:b w:val="0"/>
+                <w:i w:val="0"/>
+                <w:sz w:val="20"/>
+              </w:rPr>
+              <w:t>Kontrol Birimi</w:t>
+            </w:r>
+          </w:p>
+        </w:tc>
+        <w:tc>
+          <w:tcPr>
+            <w:tcW w:type="dxa" w:w="2280"/>
+          </w:tcPr>
+          <w:p>
+            <w:r>
+              <w:rPr>
+                <w:rFonts w:ascii="Courier New" w:hAnsi="Courier New"/>
+                <w:b w:val="0"/>
+                <w:i w:val="0"/>
+                <w:sz w:val="20"/>
+              </w:rPr>
+              <w:t>7-bit kontrol adres yazmaci</w:t>
+            </w:r>
+          </w:p>
+        </w:tc>
+      </w:tr>
+      <w:tr>
+        <w:tc>
+          <w:tcPr>
+            <w:tcW w:type="dxa" w:w="2280"/>
+          </w:tcPr>
+          <w:p>
+            <w:r>
+              <w:rPr>
+                <w:rFonts w:ascii="Courier New" w:hAnsi="Courier New"/>
+                <w:b w:val="0"/>
+                <w:i w:val="0"/>
+                <w:sz w:val="20"/>
+              </w:rPr>
+              <w:t>sbr</w:t>
+            </w:r>
+          </w:p>
+        </w:tc>
+        <w:tc>
+          <w:tcPr>
+            <w:tcW w:type="dxa" w:w="2280"/>
+          </w:tcPr>
+          <w:p>
+            <w:r>
+              <w:rPr>
+                <w:rFonts w:ascii="Courier New" w:hAnsi="Courier New"/>
+                <w:b w:val="0"/>
+                <w:i w:val="0"/>
+                <w:sz w:val="20"/>
+              </w:rPr>
+              <w:t>sbr.vhd</w:t>
+            </w:r>
+          </w:p>
+        </w:tc>
+        <w:tc>
+          <w:tcPr>
+            <w:tcW w:type="dxa" w:w="2280"/>
+          </w:tcPr>
+          <w:p>
+            <w:r>
+              <w:rPr>
+                <w:rFonts w:ascii="Courier New" w:hAnsi="Courier New"/>
+                <w:b w:val="0"/>
+                <w:i w:val="0"/>
+                <w:sz w:val="20"/>
+              </w:rPr>
+              <w:t>Kontrol Birimi</w:t>
+            </w:r>
+          </w:p>
+        </w:tc>
+        <w:tc>
+          <w:tcPr>
+            <w:tcW w:type="dxa" w:w="2280"/>
+          </w:tcPr>
+          <w:p>
+            <w:r>
+              <w:rPr>
+                <w:rFonts w:ascii="Courier New" w:hAnsi="Courier New"/>
+                <w:b w:val="0"/>
+                <w:i w:val="0"/>
+                <w:sz w:val="20"/>
+              </w:rPr>
+              <w:t>7-bit alt program yazmaci</w:t>
+            </w:r>
+          </w:p>
+        </w:tc>
+      </w:tr>
+      <w:tr>
+        <w:tc>
+          <w:tcPr>
+            <w:tcW w:type="dxa" w:w="2280"/>
+          </w:tcPr>
+          <w:p>
+            <w:r>
+              <w:rPr>
+                <w:rFonts w:ascii="Courier New" w:hAnsi="Courier New"/>
+                <w:b w:val="0"/>
+                <w:i w:val="0"/>
+                <w:sz w:val="20"/>
+              </w:rPr>
+              <w:t>control_memory</w:t>
+            </w:r>
+          </w:p>
+        </w:tc>
+        <w:tc>
+          <w:tcPr>
+            <w:tcW w:type="dxa" w:w="2280"/>
+          </w:tcPr>
+          <w:p>
+            <w:r>
+              <w:rPr>
+                <w:rFonts w:ascii="Courier New" w:hAnsi="Courier New"/>
+                <w:b w:val="0"/>
+                <w:i w:val="0"/>
+                <w:sz w:val="20"/>
+              </w:rPr>
+              <w:t>control_memory.vhd</w:t>
+            </w:r>
+          </w:p>
+        </w:tc>
+        <w:tc>
+          <w:tcPr>
+            <w:tcW w:type="dxa" w:w="2280"/>
+          </w:tcPr>
+          <w:p>
+            <w:r>
+              <w:rPr>
+                <w:rFonts w:ascii="Courier New" w:hAnsi="Courier New"/>
+                <w:b w:val="0"/>
+                <w:i w:val="0"/>
+                <w:sz w:val="20"/>
+              </w:rPr>
+              <w:t>Kontrol Birimi</w:t>
+            </w:r>
+          </w:p>
+        </w:tc>
+        <w:tc>
+          <w:tcPr>
+            <w:tcW w:type="dxa" w:w="2280"/>
+          </w:tcPr>
+          <w:p>
+            <w:r>
+              <w:rPr>
+                <w:rFonts w:ascii="Courier New" w:hAnsi="Courier New"/>
+                <w:b w:val="0"/>
+                <w:i w:val="0"/>
+                <w:sz w:val="20"/>
+              </w:rPr>
+              <w:t>128x20 bit kontrol bellegi</w:t>
+            </w:r>
+          </w:p>
+        </w:tc>
+      </w:tr>
+      <w:tr>
+        <w:tc>
+          <w:tcPr>
+            <w:tcW w:type="dxa" w:w="2280"/>
+          </w:tcPr>
+          <w:p>
+            <w:r>
+              <w:rPr>
+                <w:rFonts w:ascii="Courier New" w:hAnsi="Courier New"/>
+                <w:b w:val="0"/>
+                <w:i w:val="0"/>
+                <w:sz w:val="20"/>
+              </w:rPr>
+              <w:t>micro_decoder</w:t>
+            </w:r>
+          </w:p>
+        </w:tc>
+        <w:tc>
+          <w:tcPr>
+            <w:tcW w:type="dxa" w:w="2280"/>
+          </w:tcPr>
+          <w:p>
+            <w:r>
+              <w:rPr>
+                <w:rFonts w:ascii="Courier New" w:hAnsi="Courier New"/>
+                <w:b w:val="0"/>
+                <w:i w:val="0"/>
+                <w:sz w:val="20"/>
+              </w:rPr>
+              <w:t>microinstruction_decoder.vhd</w:t>
+            </w:r>
+          </w:p>
+        </w:tc>
+        <w:tc>
+          <w:tcPr>
+            <w:tcW w:type="dxa" w:w="2280"/>
+          </w:tcPr>
+          <w:p>
+            <w:r>
+              <w:rPr>
+                <w:rFonts w:ascii="Courier New" w:hAnsi="Courier New"/>
+                <w:b w:val="0"/>
+                <w:i w:val="0"/>
+                <w:sz w:val="20"/>
+              </w:rPr>
+              <w:t>Kontrol Birimi</w:t>
+            </w:r>
+          </w:p>
+        </w:tc>
+        <w:tc>
+          <w:tcPr>
+            <w:tcW w:type="dxa" w:w="2280"/>
+          </w:tcPr>
+          <w:p>
+            <w:r>
+              <w:rPr>
+                <w:rFonts w:ascii="Courier New" w:hAnsi="Courier New"/>
+                <w:b w:val="0"/>
+                <w:i w:val="0"/>
+                <w:sz w:val="20"/>
+              </w:rPr>
+              <w:t>Mikrokomut cozucu</w:t>
+            </w:r>
+          </w:p>
+        </w:tc>
+      </w:tr>
+      <w:tr>
+        <w:tc>
+          <w:tcPr>
+            <w:tcW w:type="dxa" w:w="2280"/>
+          </w:tcPr>
+          <w:p>
+            <w:r>
+              <w:rPr>
+                <w:rFonts w:ascii="Courier New" w:hAnsi="Courier New"/>
+                <w:b w:val="0"/>
+                <w:i w:val="0"/>
+                <w:sz w:val="20"/>
+              </w:rPr>
+              <w:t>control_unit</w:t>
+            </w:r>
+          </w:p>
+        </w:tc>
+        <w:tc>
+          <w:tcPr>
+            <w:tcW w:type="dxa" w:w="2280"/>
+          </w:tcPr>
+          <w:p>
+            <w:r>
+              <w:rPr>
+                <w:rFonts w:ascii="Courier New" w:hAnsi="Courier New"/>
+                <w:b w:val="0"/>
+                <w:i w:val="0"/>
+                <w:sz w:val="20"/>
+              </w:rPr>
+              <w:t>control_unit.vhd</w:t>
+            </w:r>
+          </w:p>
+        </w:tc>
+        <w:tc>
+          <w:tcPr>
+            <w:tcW w:type="dxa" w:w="2280"/>
+          </w:tcPr>
+          <w:p>
+            <w:r>
+              <w:rPr>
+                <w:rFonts w:ascii="Courier New" w:hAnsi="Courier New"/>
+                <w:b w:val="0"/>
+                <w:i w:val="0"/>
+                <w:sz w:val="20"/>
+              </w:rPr>
+              <w:t>Kontrol Birimi</w:t>
+            </w:r>
+          </w:p>
+        </w:tc>
+        <w:tc>
+          <w:tcPr>
+            <w:tcW w:type="dxa" w:w="2280"/>
+          </w:tcPr>
+          <w:p>
+            <w:r>
+              <w:rPr>
+                <w:rFonts w:ascii="Courier New" w:hAnsi="Courier New"/>
+                <w:b w:val="0"/>
+                <w:i w:val="0"/>
+                <w:sz w:val="20"/>
+              </w:rPr>
+              <w:t>Kontrol birimi ust modulu</w:t>
+            </w:r>
+          </w:p>
+        </w:tc>
+      </w:tr>
+      <w:tr>
+        <w:tc>
+          <w:tcPr>
+            <w:tcW w:type="dxa" w:w="2280"/>
+          </w:tcPr>
+          <w:p>
+            <w:r>
+              <w:rPr>
+                <w:rFonts w:ascii="Courier New" w:hAnsi="Courier New"/>
+                <w:b w:val="0"/>
+                <w:i w:val="0"/>
+                <w:sz w:val="20"/>
+              </w:rPr>
+              <w:t>mano_computer</w:t>
+            </w:r>
+          </w:p>
+        </w:tc>
+        <w:tc>
+          <w:tcPr>
+            <w:tcW w:type="dxa" w:w="2280"/>
+          </w:tcPr>
+          <w:p>
+            <w:r>
+              <w:rPr>
+                <w:rFonts w:ascii="Courier New" w:hAnsi="Courier New"/>
+                <w:b w:val="0"/>
+                <w:i w:val="0"/>
+                <w:sz w:val="20"/>
+              </w:rPr>
+              <w:t>mano_computer.vhd</w:t>
+            </w:r>
+          </w:p>
+        </w:tc>
+        <w:tc>
+          <w:tcPr>
+            <w:tcW w:type="dxa" w:w="2280"/>
+          </w:tcPr>
+          <w:p>
+            <w:r>
+              <w:rPr>
+                <w:rFonts w:ascii="Courier New" w:hAnsi="Courier New"/>
+                <w:b w:val="0"/>
+                <w:i w:val="0"/>
+                <w:sz w:val="20"/>
+              </w:rPr>
+              <w:t>Ust Modul</w:t>
+            </w:r>
+          </w:p>
+        </w:tc>
+        <w:tc>
+          <w:tcPr>
+            <w:tcW w:type="dxa" w:w="2280"/>
+          </w:tcPr>
+          <w:p>
+            <w:r>
+              <w:rPr>
+                <w:rFonts w:ascii="Courier New" w:hAnsi="Courier New"/>
+                <w:b w:val="0"/>
+                <w:i w:val="0"/>
+                <w:sz w:val="20"/>
+              </w:rPr>
+              <w:t>Sistem ust modulu</w:t>
+            </w:r>
+          </w:p>
+        </w:tc>
+      </w:tr>
+    </w:tbl>
+    <w:p>
+      <w:pPr>
+        <w:spacing w:before="40" w:after="200"/>
+        <w:jc w:val="center"/>
+      </w:pPr>
+      <w:r>
+        <w:rPr>
+          <w:rFonts w:ascii="Courier New" w:hAnsi="Courier New"/>
+          <w:b w:val="0"/>
+          <w:i/>
+          <w:sz w:val="18"/>
+        </w:rPr>
+        <w:t>Tablo 5.1. VHDL Modul Hiyerarsisi</w:t>
+      </w:r>
+    </w:p>
+    <w:p>
+      <w:pPr>
+        <w:spacing w:before="160" w:after="80"/>
+        <w:jc w:val="left"/>
+      </w:pPr>
+      <w:r>
+        <w:rPr>
+          <w:rFonts w:ascii="Courier New" w:hAnsi="Courier New"/>
+          <w:b/>
+          <w:i w:val="0"/>
+          <w:sz w:val="20"/>
+        </w:rPr>
+        <w:t>5.1.2. Kritik Tasarim Detaylari</w:t>
+      </w:r>
+    </w:p>
+    <w:p>
+      <w:pPr>
+        <w:spacing w:before="0" w:after="120"/>
+        <w:jc w:val="both"/>
+      </w:pPr>
+      <w:r>
+        <w:rPr>
+          <w:rFonts w:ascii="Courier New" w:hAnsi="Courier New"/>
+          <w:b w:val="0"/>
+          <w:i w:val="0"/>
+          <w:sz w:val="20"/>
+        </w:rPr>
+        <w:t>Ust modul (mano_computer.vhd) icerisinde kontrol sinyallerinin veri yolu bilesenlerine baglanmasi su ilkelerle gerceklestirilmistir: AR yazmaci, PCTAR (AR&lt;-PC) veya IRTAR (AR&lt;-IR[11:0]) sinyalleriyle yuklenirken bus secimi otomatik olarak ilgili kaynaga yonlendirilir. AC yazmaci, herhangi bir F1 islem sinyali (ADD, CLRAC, INCAC, DRTAC, ANDAC, COMAC) veya F2 sinyali (SUB, OR, SHL, SHR) aktif oldugunda ALU sonucunu yuklemektedir. E (tasima) biti, F1 alanindaki CLRE sinyaliyle sifirlanir, F2'deki COME sinyaliyle tumlenenir veya aritmetik/kaydirma islemlerinde ALU carry_out degerini alir. Bu yaklasim, kontrol birimi ile veri yolu arasinda net bir arayuz tanimlayarak paralel gelistirme surecini mumkun kilmistir. (PC5)</w:t>
+      </w:r>
+    </w:p>
+    <w:p>
+      <w:pPr>
+        <w:spacing w:before="0" w:after="120"/>
+        <w:jc w:val="both"/>
+      </w:pPr>
+      <w:r>
+        <w:rPr>
+          <w:rFonts w:ascii="Courier New" w:hAnsi="Courier New"/>
+          <w:b w:val="0"/>
+          <w:i w:val="0"/>
+          <w:sz w:val="20"/>
+        </w:rPr>
+        <w:t>ALU islem kodu secimi, kontrol biriminin F1 ve F2 alanlarina gore oncelikli kosul ifadeleriyle belirlenmistir. Ornegin f1_add sinyali aktif ise ALU op kodu "001" (ADD), f1_andac aktif ise "010" (AND), f2_shr aktif ise "100" (SHR) olmaktadir. Hicbir kontrol sinyali aktif degilse ALU varsayilan olarak PASSA ("000") islemini gerceklestirerek AC degerini degistirmeden gecirmektedir. Bu esleme ust modul icerisinde kosullu sinyal atamasi (conditional signal assignment) ile saglanmistir. (PC5)</w:t>
       </w:r>
     </w:p>
     <w:p>

</xml_diff>